<commit_message>
Atualização de regras de calculo, inclusão de projeto qgis e finalização do tópico de metodologia.
</commit_message>
<xml_diff>
--- a/Análise Geoestatística do Passivo de Reserva Legal em Imóveis de Médio e Grande Porte no Estado do Pará.docx
+++ b/Análise Geoestatística do Passivo de Reserva Legal em Imóveis de Médio e Grande Porte no Estado do Pará.docx
@@ -4,7 +4,7 @@
   <w:body>
     <w:p>
       <w:pPr>
-        <w:spacing w:before="240"/>
+        <w:spacing w:before="240" w:line="360" w:lineRule="auto"/>
         <w:jc w:val="both"/>
         <w:rPr>
           <w:rFonts w:ascii="Times New Roman" w:hAnsi="Times New Roman" w:cs="Times New Roman"/>
@@ -23,7 +23,7 @@
     </w:p>
     <w:p>
       <w:pPr>
-        <w:spacing w:before="240"/>
+        <w:spacing w:before="240" w:line="360" w:lineRule="auto"/>
         <w:jc w:val="both"/>
         <w:rPr>
           <w:rFonts w:ascii="Times New Roman" w:hAnsi="Times New Roman" w:cs="Times New Roman"/>
@@ -40,7 +40,7 @@
     </w:p>
     <w:p>
       <w:pPr>
-        <w:spacing w:before="240"/>
+        <w:spacing w:before="240" w:line="360" w:lineRule="auto"/>
         <w:jc w:val="both"/>
         <w:rPr>
           <w:rFonts w:ascii="Times New Roman" w:hAnsi="Times New Roman" w:cs="Times New Roman"/>
@@ -55,7 +55,7 @@
     </w:p>
     <w:p>
       <w:pPr>
-        <w:spacing w:after="0"/>
+        <w:spacing w:after="0" w:line="360" w:lineRule="auto"/>
         <w:ind w:firstLine="709"/>
         <w:jc w:val="both"/>
         <w:rPr>
@@ -99,7 +99,7 @@
     </w:p>
     <w:p>
       <w:pPr>
-        <w:spacing w:after="0"/>
+        <w:spacing w:after="0" w:line="360" w:lineRule="auto"/>
         <w:ind w:firstLine="709"/>
         <w:jc w:val="both"/>
         <w:rPr>
@@ -143,7 +143,7 @@
     </w:p>
     <w:p>
       <w:pPr>
-        <w:spacing w:after="0"/>
+        <w:spacing w:after="0" w:line="360" w:lineRule="auto"/>
         <w:ind w:firstLine="709"/>
         <w:jc w:val="both"/>
         <w:rPr>
@@ -154,12 +154,19 @@
         <w:rPr>
           <w:rFonts w:ascii="Times New Roman" w:hAnsi="Times New Roman" w:cs="Times New Roman"/>
         </w:rPr>
-        <w:t>Para equacionar esse problema, o Artigo 12 (§ 4º e 5º) da Lei nº 12.651/2012 prevê a possibilidade de redução da Reserva Legal de 80% para até 50% (BRASIL, 2012). Essa flexibilização, voltada para fins de regularização e recomposição do passivo, depende de critérios como a existência de Zoneamento Ecológico-Econômico (ZEE) aprovado e de altos índices de áreas protegidas (unidades de conservação e terras indígenas) no território do estado ou do município (BRASIL, 2012). Embora o Pará já possua normativas fundamentais que indicam esse redimensionamento para áreas rurais consolidadas, como a Lei Estadual nº 7.398/2010 (Zona Leste e Calha Norte) e a Lei Estadual nº 7.243/2009 (Zona Oeste) (PARÁ, 2009; PARÁ, 2010), ainda há uma lacuna de estudos geoestatísticos que quantifiquem o impacto real dessa redução na transição de imóveis da ilegalidade para a conformidade ambiental.</w:t>
-      </w:r>
-    </w:p>
-    <w:p>
-      <w:pPr>
-        <w:spacing w:before="240"/>
+        <w:t xml:space="preserve">Para equacionar esse problema, o Artigo 12 (§ 4º e 5º) da Lei nº 12.651/2012 prevê a possibilidade de redução da Reserva Legal de 80% para até 50% (BRASIL, 2012). Essa flexibilização, voltada para fins de regularização e recomposição do passivo, depende de critérios como a existência de Zoneamento Ecológico-Econômico (ZEE) aprovado e de altos índices de áreas protegidas (unidades de conservação e terras indígenas) no território do estado ou do município (BRASIL, 2012). Embora o Pará já possua normativas fundamentais que indicam esse redimensionamento para áreas rurais consolidadas, como a Lei Estadual nº 7.398/2010 (Zona Leste e Calha Norte) e a Lei Estadual nº 7.243/2009 (Zona Oeste) (PARÁ, </w:t>
+      </w:r>
+      <w:r>
+        <w:rPr>
+          <w:rFonts w:ascii="Times New Roman" w:hAnsi="Times New Roman" w:cs="Times New Roman"/>
+        </w:rPr>
+        <w:lastRenderedPageBreak/>
+        <w:t>2009; PARÁ, 2010), ainda há uma lacuna de estudos geoestatísticos que quantifiquem o impacto real dessa redução na transição de imóveis da ilegalidade para a conformidade ambiental.</w:t>
+      </w:r>
+    </w:p>
+    <w:p>
+      <w:pPr>
+        <w:spacing w:before="240" w:line="360" w:lineRule="auto"/>
         <w:jc w:val="both"/>
         <w:rPr>
           <w:rFonts w:ascii="Times New Roman" w:hAnsi="Times New Roman" w:cs="Times New Roman"/>
@@ -174,7 +181,7 @@
     </w:p>
     <w:p>
       <w:pPr>
-        <w:spacing w:before="240"/>
+        <w:spacing w:before="240" w:line="360" w:lineRule="auto"/>
         <w:jc w:val="both"/>
         <w:rPr>
           <w:rFonts w:ascii="Times New Roman" w:hAnsi="Times New Roman" w:cs="Times New Roman"/>
@@ -191,7 +198,7 @@
     </w:p>
     <w:p>
       <w:pPr>
-        <w:spacing w:after="0"/>
+        <w:spacing w:after="0" w:line="360" w:lineRule="auto"/>
         <w:ind w:firstLine="709"/>
         <w:jc w:val="both"/>
         <w:rPr>
@@ -202,19 +209,12 @@
         <w:rPr>
           <w:rFonts w:ascii="Times New Roman" w:hAnsi="Times New Roman" w:cs="Times New Roman"/>
         </w:rPr>
-        <w:t xml:space="preserve">Quantificar, por meio de modelagem geoestatística e processamento de dados em nuvem, o impacto da redução da Reserva Legal (RL) de 80% para 50% na regularização de </w:t>
-      </w:r>
-      <w:r>
-        <w:rPr>
-          <w:rFonts w:ascii="Times New Roman" w:hAnsi="Times New Roman" w:cs="Times New Roman"/>
-        </w:rPr>
-        <w:lastRenderedPageBreak/>
-        <w:t>imóveis rurais superiores a 4 módulos fiscais (MF) no Estado do Pará, visando medir o potencial de transição do passivo consolidado para a conformidade ambiental.</w:t>
-      </w:r>
-    </w:p>
-    <w:p>
-      <w:pPr>
-        <w:spacing w:before="240"/>
+        <w:t>Quantificar, por meio de modelagem geoestatística e processamento de dados em nuvem, o impacto da redução da Reserva Legal (RL) de 80% para 50% na regularização de imóveis rurais superiores a 4 módulos fiscais (MF) no Estado do Pará, visando medir o potencial de transição do passivo consolidado para a conformidade ambiental.</w:t>
+      </w:r>
+    </w:p>
+    <w:p>
+      <w:pPr>
+        <w:spacing w:before="240" w:line="360" w:lineRule="auto"/>
         <w:jc w:val="both"/>
         <w:rPr>
           <w:rFonts w:ascii="Times New Roman" w:hAnsi="Times New Roman" w:cs="Times New Roman"/>
@@ -231,7 +231,7 @@
     </w:p>
     <w:p>
       <w:pPr>
-        <w:spacing w:before="240"/>
+        <w:spacing w:before="240" w:line="360" w:lineRule="auto"/>
         <w:ind w:firstLine="709"/>
         <w:jc w:val="both"/>
         <w:rPr>
@@ -247,7 +247,7 @@
     </w:p>
     <w:p>
       <w:pPr>
-        <w:spacing w:after="0"/>
+        <w:spacing w:after="0" w:line="360" w:lineRule="auto"/>
         <w:ind w:left="993" w:hanging="284"/>
         <w:jc w:val="both"/>
         <w:rPr>
@@ -277,7 +277,7 @@
     </w:p>
     <w:p>
       <w:pPr>
-        <w:spacing w:after="0"/>
+        <w:spacing w:after="0" w:line="360" w:lineRule="auto"/>
         <w:ind w:left="993" w:hanging="284"/>
         <w:jc w:val="both"/>
         <w:rPr>
@@ -307,7 +307,7 @@
     </w:p>
     <w:p>
       <w:pPr>
-        <w:spacing w:after="0"/>
+        <w:spacing w:after="0" w:line="360" w:lineRule="auto"/>
         <w:ind w:left="993" w:hanging="284"/>
         <w:jc w:val="both"/>
         <w:rPr>
@@ -337,7 +337,7 @@
     </w:p>
     <w:p>
       <w:pPr>
-        <w:spacing w:after="0"/>
+        <w:spacing w:after="0" w:line="360" w:lineRule="auto"/>
         <w:ind w:left="993" w:hanging="284"/>
         <w:jc w:val="both"/>
         <w:rPr>
@@ -353,7 +353,7 @@
     </w:p>
     <w:p>
       <w:pPr>
-        <w:spacing w:after="0"/>
+        <w:spacing w:after="0" w:line="360" w:lineRule="auto"/>
         <w:ind w:left="993" w:hanging="284"/>
         <w:jc w:val="both"/>
         <w:rPr>
@@ -369,7 +369,7 @@
     </w:p>
     <w:p>
       <w:pPr>
-        <w:spacing w:before="240"/>
+        <w:spacing w:before="240" w:line="360" w:lineRule="auto"/>
         <w:jc w:val="both"/>
         <w:rPr>
           <w:rFonts w:ascii="Times New Roman" w:hAnsi="Times New Roman" w:cs="Times New Roman"/>
@@ -384,7 +384,7 @@
     </w:p>
     <w:p>
       <w:pPr>
-        <w:spacing w:after="0"/>
+        <w:spacing w:after="0" w:line="360" w:lineRule="auto"/>
         <w:ind w:firstLine="709"/>
         <w:jc w:val="both"/>
         <w:rPr>
@@ -395,12 +395,13 @@
         <w:rPr>
           <w:rFonts w:ascii="Times New Roman" w:hAnsi="Times New Roman" w:cs="Times New Roman"/>
         </w:rPr>
+        <w:lastRenderedPageBreak/>
         <w:t>A presente análise fundamenta-se na necessidade de convergência entre a conformidade legal e a viabilidade prática da regularização ambiental no Estado do Pará, estruturando-se sobre quatro pilares fundamentais:</w:t>
       </w:r>
     </w:p>
     <w:p>
       <w:pPr>
-        <w:spacing w:before="240"/>
+        <w:spacing w:before="240" w:line="360" w:lineRule="auto"/>
         <w:jc w:val="both"/>
         <w:rPr>
           <w:rFonts w:ascii="Times New Roman" w:hAnsi="Times New Roman" w:cs="Times New Roman"/>
@@ -417,7 +418,7 @@
     </w:p>
     <w:p>
       <w:pPr>
-        <w:spacing w:after="0"/>
+        <w:spacing w:after="0" w:line="360" w:lineRule="auto"/>
         <w:ind w:firstLine="709"/>
         <w:jc w:val="both"/>
         <w:rPr>
@@ -433,7 +434,7 @@
     </w:p>
     <w:p>
       <w:pPr>
-        <w:spacing w:after="0"/>
+        <w:spacing w:after="0" w:line="360" w:lineRule="auto"/>
         <w:ind w:firstLine="709"/>
         <w:jc w:val="both"/>
         <w:rPr>
@@ -449,7 +450,7 @@
     </w:p>
     <w:p>
       <w:pPr>
-        <w:spacing w:before="240"/>
+        <w:spacing w:before="240" w:line="360" w:lineRule="auto"/>
         <w:jc w:val="both"/>
         <w:rPr>
           <w:rFonts w:ascii="Times New Roman" w:hAnsi="Times New Roman" w:cs="Times New Roman"/>
@@ -461,13 +462,12 @@
           <w:b/>
           <w:bCs/>
         </w:rPr>
-        <w:lastRenderedPageBreak/>
         <w:t>1.3.2 Viabilidade econômica e social da redução para 50%</w:t>
       </w:r>
     </w:p>
     <w:p>
       <w:pPr>
-        <w:spacing w:after="0"/>
+        <w:spacing w:after="0" w:line="360" w:lineRule="auto"/>
         <w:ind w:firstLine="709"/>
         <w:jc w:val="both"/>
         <w:rPr>
@@ -483,7 +483,7 @@
     </w:p>
     <w:p>
       <w:pPr>
-        <w:spacing w:after="0"/>
+        <w:spacing w:after="0" w:line="360" w:lineRule="auto"/>
         <w:ind w:firstLine="709"/>
         <w:jc w:val="both"/>
         <w:rPr>
@@ -499,7 +499,7 @@
     </w:p>
     <w:p>
       <w:pPr>
-        <w:spacing w:before="240"/>
+        <w:spacing w:before="240" w:line="360" w:lineRule="auto"/>
         <w:jc w:val="both"/>
         <w:rPr>
           <w:rFonts w:ascii="Times New Roman" w:hAnsi="Times New Roman" w:cs="Times New Roman"/>
@@ -516,7 +516,7 @@
     </w:p>
     <w:p>
       <w:pPr>
-        <w:spacing w:after="0"/>
+        <w:spacing w:after="0" w:line="360" w:lineRule="auto"/>
         <w:ind w:firstLine="709"/>
         <w:jc w:val="both"/>
         <w:rPr>
@@ -527,12 +527,13 @@
         <w:rPr>
           <w:rFonts w:ascii="Times New Roman" w:hAnsi="Times New Roman" w:cs="Times New Roman"/>
         </w:rPr>
+        <w:lastRenderedPageBreak/>
         <w:t>A adoção da redução da Reserva Legal não se configura como uma flexibilização arbitrária ou uma concessão política, tratando-se, na verdade, da aplicação estrita e técnica do arcabouço normativo vigente. A medida encontra amparo principal na Lei nº 12.651/2012 (Novo Código Florestal), que previu a possibilidade de adequação dos percentuais conforme as características regionais e o zoneamento estadual (BRASIL, 2012).</w:t>
       </w:r>
     </w:p>
     <w:p>
       <w:pPr>
-        <w:spacing w:after="0"/>
+        <w:spacing w:after="0" w:line="360" w:lineRule="auto"/>
         <w:ind w:firstLine="709"/>
         <w:jc w:val="both"/>
         <w:rPr>
@@ -548,7 +549,7 @@
     </w:p>
     <w:p>
       <w:pPr>
-        <w:spacing w:before="240"/>
+        <w:spacing w:before="240" w:line="360" w:lineRule="auto"/>
         <w:jc w:val="both"/>
         <w:rPr>
           <w:rFonts w:ascii="Times New Roman" w:hAnsi="Times New Roman" w:cs="Times New Roman"/>
@@ -565,7 +566,7 @@
     </w:p>
     <w:p>
       <w:pPr>
-        <w:spacing w:after="0"/>
+        <w:spacing w:after="0" w:line="360" w:lineRule="auto"/>
         <w:ind w:firstLine="709"/>
         <w:jc w:val="both"/>
         <w:rPr>
@@ -581,7 +582,7 @@
     </w:p>
     <w:p>
       <w:pPr>
-        <w:spacing w:after="0"/>
+        <w:spacing w:after="0" w:line="360" w:lineRule="auto"/>
         <w:ind w:firstLine="709"/>
         <w:jc w:val="both"/>
         <w:rPr>
@@ -597,7 +598,7 @@
     </w:p>
     <w:p>
       <w:pPr>
-        <w:spacing w:before="240"/>
+        <w:spacing w:before="240" w:line="360" w:lineRule="auto"/>
         <w:jc w:val="both"/>
         <w:rPr>
           <w:rFonts w:ascii="Times New Roman" w:hAnsi="Times New Roman" w:cs="Times New Roman"/>
@@ -616,7 +617,7 @@
     </w:p>
     <w:p>
       <w:pPr>
-        <w:spacing w:before="240"/>
+        <w:spacing w:before="240" w:line="360" w:lineRule="auto"/>
         <w:jc w:val="both"/>
         <w:rPr>
           <w:rFonts w:ascii="Times New Roman" w:hAnsi="Times New Roman" w:cs="Times New Roman"/>
@@ -631,7 +632,7 @@
     </w:p>
     <w:p>
       <w:pPr>
-        <w:spacing w:after="0"/>
+        <w:spacing w:after="0" w:line="360" w:lineRule="auto"/>
         <w:ind w:firstLine="709"/>
         <w:jc w:val="both"/>
         <w:rPr>
@@ -642,13 +643,12 @@
         <w:rPr>
           <w:rFonts w:ascii="Times New Roman" w:hAnsi="Times New Roman" w:cs="Times New Roman"/>
         </w:rPr>
-        <w:lastRenderedPageBreak/>
         <w:t>A Reserva Legal é um instrumento fundamental do Código Florestal brasileiro para garantir que a exploração econômica das propriedades rurais, especialmente em áreas sensíveis como a Amazônia, ocorra em harmonia com a proteção ambiental. O texto legal define claramente a sua função socioambiental:</w:t>
       </w:r>
     </w:p>
     <w:p>
       <w:pPr>
-        <w:spacing w:before="240"/>
+        <w:spacing w:before="240" w:line="360" w:lineRule="auto"/>
         <w:ind w:left="2268"/>
         <w:jc w:val="both"/>
         <w:rPr>
@@ -663,115 +663,124 @@
           <w:sz w:val="20"/>
           <w:szCs w:val="20"/>
         </w:rPr>
-        <w:t>Reserva Legal: área localizada no interior de uma propriedade ou posse rural, delimitada nos termos do art. 12, com a função de assegurar o uso econômico de modo sustentável dos recursos naturais do imóvel rural, auxiliar a conservação e a reabilitação dos processos ecológicos e promover a conservação da biodiversidade, bem como o abrigo e a proteção de fauna silvestre e da flora nativa; (BRASIL, 2012, art. 3º, inciso III).</w:t>
-      </w:r>
-    </w:p>
-    <w:p>
-      <w:pPr>
-        <w:spacing w:after="0"/>
-        <w:ind w:firstLine="709"/>
-        <w:jc w:val="both"/>
-        <w:rPr>
-          <w:rFonts w:ascii="Times New Roman" w:hAnsi="Times New Roman" w:cs="Times New Roman"/>
-        </w:rPr>
-      </w:pPr>
-      <w:r>
-        <w:rPr>
-          <w:rFonts w:ascii="Times New Roman" w:hAnsi="Times New Roman" w:cs="Times New Roman"/>
-        </w:rPr>
-        <w:t>A manutenção dessa cobertura de vegetação nativa é obrigatória para todo imóvel rural e, na Amazônia Legal, chega a exigir a conservação de até 80% da propriedade quando situada em área de florestas (BRASIL, 2012, art. 12).</w:t>
-      </w:r>
-    </w:p>
-    <w:p>
-      <w:pPr>
-        <w:spacing w:before="240"/>
-        <w:jc w:val="both"/>
-        <w:rPr>
-          <w:rFonts w:ascii="Times New Roman" w:hAnsi="Times New Roman" w:cs="Times New Roman"/>
-        </w:rPr>
-      </w:pPr>
-      <w:r>
-        <w:rPr>
-          <w:rFonts w:ascii="Times New Roman" w:hAnsi="Times New Roman" w:cs="Times New Roman"/>
-        </w:rPr>
-        <w:t>2.2 O CAR COMO PRINCIPAL FERRAMENTA DE MONITORAMENTO</w:t>
-      </w:r>
-    </w:p>
-    <w:p>
-      <w:pPr>
-        <w:spacing w:after="0"/>
-        <w:ind w:firstLine="709"/>
-        <w:jc w:val="both"/>
-        <w:rPr>
-          <w:rFonts w:ascii="Times New Roman" w:hAnsi="Times New Roman" w:cs="Times New Roman"/>
-        </w:rPr>
-      </w:pPr>
-      <w:r>
-        <w:rPr>
-          <w:rFonts w:ascii="Times New Roman" w:hAnsi="Times New Roman" w:cs="Times New Roman"/>
-        </w:rPr>
-        <w:t>Para viabilizar a fiscalização e a regularização dessas áreas de preservação, a Lei 12.651/2012 instituiu o Cadastro Ambiental Rural (CAR). A legislação o consolida como o grande banco de dados nacional para monitorar e combater o desmatamento:</w:t>
-      </w:r>
-    </w:p>
-    <w:p>
-      <w:pPr>
-        <w:spacing w:before="240"/>
-        <w:ind w:left="2268"/>
-        <w:jc w:val="both"/>
+        <w:t xml:space="preserve">Reserva Legal: área localizada no interior de uma propriedade ou posse rural, delimitada nos termos do art. 12, com a função de assegurar o uso econômico de modo sustentável dos recursos naturais do imóvel rural, auxiliar a conservação e a </w:t>
+      </w:r>
+      <w:r>
         <w:rPr>
           <w:rFonts w:ascii="Times New Roman" w:hAnsi="Times New Roman" w:cs="Times New Roman"/>
           <w:sz w:val="20"/>
           <w:szCs w:val="20"/>
         </w:rPr>
-      </w:pPr>
-      <w:r>
+        <w:lastRenderedPageBreak/>
+        <w:t>reabilitação dos processos ecológicos e promover a conservação da biodiversidade, bem como o abrigo e a proteção de fauna silvestre e da flora nativa; (BRASIL, 2012, art. 3º, inciso III).</w:t>
+      </w:r>
+    </w:p>
+    <w:p>
+      <w:pPr>
+        <w:spacing w:after="0" w:line="360" w:lineRule="auto"/>
+        <w:ind w:firstLine="709"/>
+        <w:jc w:val="both"/>
+        <w:rPr>
+          <w:rFonts w:ascii="Times New Roman" w:hAnsi="Times New Roman" w:cs="Times New Roman"/>
+        </w:rPr>
+      </w:pPr>
+      <w:r>
+        <w:rPr>
+          <w:rFonts w:ascii="Times New Roman" w:hAnsi="Times New Roman" w:cs="Times New Roman"/>
+        </w:rPr>
+        <w:t>A manutenção dessa cobertura de vegetação nativa é obrigatória para todo imóvel rural e, na Amazônia Legal, chega a exigir a conservação de até 80% da propriedade quando situada em área de florestas (BRASIL, 2012, art. 12).</w:t>
+      </w:r>
+    </w:p>
+    <w:p>
+      <w:pPr>
+        <w:spacing w:before="240" w:line="360" w:lineRule="auto"/>
+        <w:jc w:val="both"/>
+        <w:rPr>
+          <w:rFonts w:ascii="Times New Roman" w:hAnsi="Times New Roman" w:cs="Times New Roman"/>
+        </w:rPr>
+      </w:pPr>
+      <w:r>
+        <w:rPr>
+          <w:rFonts w:ascii="Times New Roman" w:hAnsi="Times New Roman" w:cs="Times New Roman"/>
+        </w:rPr>
+        <w:t>2.2 O CAR COMO PRINCIPAL FERRAMENTA DE MONITORAMENTO</w:t>
+      </w:r>
+    </w:p>
+    <w:p>
+      <w:pPr>
+        <w:spacing w:after="0" w:line="360" w:lineRule="auto"/>
+        <w:ind w:firstLine="709"/>
+        <w:jc w:val="both"/>
+        <w:rPr>
+          <w:rFonts w:ascii="Times New Roman" w:hAnsi="Times New Roman" w:cs="Times New Roman"/>
+        </w:rPr>
+      </w:pPr>
+      <w:r>
+        <w:rPr>
+          <w:rFonts w:ascii="Times New Roman" w:hAnsi="Times New Roman" w:cs="Times New Roman"/>
+        </w:rPr>
+        <w:t>Para viabilizar a fiscalização e a regularização dessas áreas de preservação, a Lei 12.651/2012 instituiu o Cadastro Ambiental Rural (CAR). A legislação o consolida como o grande banco de dados nacional para monitorar e combater o desmatamento:</w:t>
+      </w:r>
+    </w:p>
+    <w:p>
+      <w:pPr>
+        <w:spacing w:before="240" w:line="360" w:lineRule="auto"/>
+        <w:ind w:left="2268"/>
+        <w:jc w:val="both"/>
         <w:rPr>
           <w:rFonts w:ascii="Times New Roman" w:hAnsi="Times New Roman" w:cs="Times New Roman"/>
           <w:sz w:val="20"/>
           <w:szCs w:val="20"/>
         </w:rPr>
-        <w:t>É criado o Cadastro Ambiental Rural - CAR, no âmbito do Sistema Nacional de Informação sobre Meio Ambiente - SINIMA, registro público eletrônico de âmbito nacional, obrigatório para todos os imóveis rurais, com a finalidade de integrar as informações ambientais das propriedades e posses rurais, compondo base de dados para controle, monitoramento, planejamento ambiental e econômico e combate ao desmatamento. (BRASIL, 2012, art. 29).</w:t>
-      </w:r>
-    </w:p>
-    <w:p>
-      <w:pPr>
-        <w:spacing w:after="0"/>
-        <w:ind w:firstLine="709"/>
-        <w:jc w:val="both"/>
-        <w:rPr>
-          <w:rFonts w:ascii="Times New Roman" w:hAnsi="Times New Roman" w:cs="Times New Roman"/>
-        </w:rPr>
-      </w:pPr>
-      <w:r>
-        <w:rPr>
-          <w:rFonts w:ascii="Times New Roman" w:hAnsi="Times New Roman" w:cs="Times New Roman"/>
-        </w:rPr>
-        <w:t>Para que esse monitoramento seja efetivo, a norma e os sistemas de controle exigem precisão tecnológica. Conforme aponta a literatura jurídica:</w:t>
-      </w:r>
-    </w:p>
-    <w:p>
-      <w:pPr>
-        <w:spacing w:before="240"/>
-        <w:ind w:left="2268"/>
-        <w:jc w:val="both"/>
+      </w:pPr>
+      <w:r>
         <w:rPr>
           <w:rFonts w:ascii="Times New Roman" w:hAnsi="Times New Roman" w:cs="Times New Roman"/>
           <w:sz w:val="20"/>
           <w:szCs w:val="20"/>
         </w:rPr>
-      </w:pPr>
-      <w:r>
+        <w:t>É criado o Cadastro Ambiental Rural - CAR, no âmbito do Sistema Nacional de Informação sobre Meio Ambiente - SINIMA, registro público eletrônico de âmbito nacional, obrigatório para todos os imóveis rurais, com a finalidade de integrar as informações ambientais das propriedades e posses rurais, compondo base de dados para controle, monitoramento, planejamento ambiental e econômico e combate ao desmatamento. (BRASIL, 2012, art. 29).</w:t>
+      </w:r>
+    </w:p>
+    <w:p>
+      <w:pPr>
+        <w:spacing w:after="0" w:line="360" w:lineRule="auto"/>
+        <w:ind w:firstLine="709"/>
+        <w:jc w:val="both"/>
+        <w:rPr>
+          <w:rFonts w:ascii="Times New Roman" w:hAnsi="Times New Roman" w:cs="Times New Roman"/>
+        </w:rPr>
+      </w:pPr>
+      <w:r>
+        <w:rPr>
+          <w:rFonts w:ascii="Times New Roman" w:hAnsi="Times New Roman" w:cs="Times New Roman"/>
+        </w:rPr>
+        <w:t>Para que esse monitoramento seja efetivo, a norma e os sistemas de controle exigem precisão tecnológica. Conforme aponta a literatura jurídica:</w:t>
+      </w:r>
+    </w:p>
+    <w:p>
+      <w:pPr>
+        <w:spacing w:before="240" w:line="360" w:lineRule="auto"/>
+        <w:ind w:left="2268"/>
+        <w:jc w:val="both"/>
         <w:rPr>
           <w:rFonts w:ascii="Times New Roman" w:hAnsi="Times New Roman" w:cs="Times New Roman"/>
           <w:sz w:val="20"/>
           <w:szCs w:val="20"/>
         </w:rPr>
+      </w:pPr>
+      <w:r>
+        <w:rPr>
+          <w:rFonts w:ascii="Times New Roman" w:hAnsi="Times New Roman" w:cs="Times New Roman"/>
+          <w:sz w:val="20"/>
+          <w:szCs w:val="20"/>
+        </w:rPr>
         <w:t>[O Novo Código Florestal] Exige que todos os proprietários ou posseiros de propriedades rurais registrem suas terras no órgão ambiental estadual, delineando a RL [Reserva Legal] e a APP [Área de Preservação Permanente] georreferenciadas em imagens de satélite [...] para servir de base para o monitoramento do cumprimento. (PORTO; SANTOS, 2017, p. 931).</w:t>
       </w:r>
     </w:p>
     <w:p>
       <w:pPr>
-        <w:spacing w:after="0"/>
+        <w:spacing w:after="0" w:line="360" w:lineRule="auto"/>
         <w:ind w:firstLine="709"/>
         <w:jc w:val="both"/>
         <w:rPr>
@@ -787,7 +796,7 @@
     </w:p>
     <w:p>
       <w:pPr>
-        <w:spacing w:before="240"/>
+        <w:spacing w:before="240" w:line="360" w:lineRule="auto"/>
         <w:jc w:val="both"/>
         <w:rPr>
           <w:rFonts w:ascii="Times New Roman" w:hAnsi="Times New Roman" w:cs="Times New Roman"/>
@@ -802,7 +811,7 @@
     </w:p>
     <w:p>
       <w:pPr>
-        <w:spacing w:after="0"/>
+        <w:spacing w:after="0" w:line="360" w:lineRule="auto"/>
         <w:ind w:firstLine="851"/>
         <w:jc w:val="both"/>
         <w:rPr>
@@ -813,19 +822,19 @@
         <w:rPr>
           <w:rFonts w:ascii="Times New Roman" w:hAnsi="Times New Roman" w:cs="Times New Roman"/>
         </w:rPr>
-        <w:t xml:space="preserve">O Novo Código Florestal (Lei nº 12.651/2012) exige a manutenção de 80% de Reserva Legal para imóveis situados em áreas de floresta na Amazônia Legal. A imposição desse alto percentual gerou um grave impasse para propriedades que já haviam suprimido a vegetação em proporções maiores, criando o chamado "passivo ambiental". Para solucionar esse impasse, a </w:t>
+        <w:t xml:space="preserve">O Novo Código Florestal (Lei nº 12.651/2012) exige a manutenção de 80% de Reserva Legal para imóveis situados em áreas de floresta na Amazônia Legal. A imposição desse alto percentual gerou um grave impasse para propriedades que já haviam suprimido a vegetação em </w:t>
       </w:r>
       <w:r>
         <w:rPr>
           <w:rFonts w:ascii="Times New Roman" w:hAnsi="Times New Roman" w:cs="Times New Roman"/>
         </w:rPr>
         <w:lastRenderedPageBreak/>
-        <w:t>legislação introduziu a figura das áreas consolidadas baseadas em um marco temporal específico.</w:t>
-      </w:r>
-    </w:p>
-    <w:p>
-      <w:pPr>
-        <w:spacing w:before="240"/>
+        <w:t>proporções maiores, criando o chamado "passivo ambiental". Para solucionar esse impasse, a legislação introduziu a figura das áreas consolidadas baseadas em um marco temporal específico.</w:t>
+      </w:r>
+    </w:p>
+    <w:p>
+      <w:pPr>
+        <w:spacing w:before="240" w:line="360" w:lineRule="auto"/>
         <w:jc w:val="both"/>
         <w:rPr>
           <w:rFonts w:ascii="Times New Roman" w:hAnsi="Times New Roman" w:cs="Times New Roman"/>
@@ -842,7 +851,7 @@
     </w:p>
     <w:p>
       <w:pPr>
-        <w:spacing w:after="0"/>
+        <w:spacing w:after="0" w:line="360" w:lineRule="auto"/>
         <w:ind w:firstLine="851"/>
         <w:jc w:val="both"/>
         <w:rPr>
@@ -870,7 +879,7 @@
     </w:p>
     <w:p>
       <w:pPr>
-        <w:spacing w:after="0"/>
+        <w:spacing w:after="0" w:line="360" w:lineRule="auto"/>
         <w:ind w:firstLine="851"/>
         <w:jc w:val="both"/>
         <w:rPr>
@@ -886,7 +895,7 @@
     </w:p>
     <w:p>
       <w:pPr>
-        <w:spacing w:before="240"/>
+        <w:spacing w:before="240" w:line="360" w:lineRule="auto"/>
         <w:jc w:val="both"/>
         <w:rPr>
           <w:rFonts w:ascii="Times New Roman" w:hAnsi="Times New Roman" w:cs="Times New Roman"/>
@@ -903,7 +912,7 @@
     </w:p>
     <w:p>
       <w:pPr>
-        <w:spacing w:after="0"/>
+        <w:spacing w:after="0" w:line="360" w:lineRule="auto"/>
         <w:ind w:firstLine="709"/>
         <w:jc w:val="both"/>
         <w:rPr>
@@ -919,7 +928,7 @@
     </w:p>
     <w:p>
       <w:pPr>
-        <w:spacing w:before="240"/>
+        <w:spacing w:before="240" w:line="360" w:lineRule="auto"/>
         <w:ind w:left="2268"/>
         <w:jc w:val="both"/>
         <w:rPr>
@@ -939,7 +948,7 @@
     </w:p>
     <w:p>
       <w:pPr>
-        <w:spacing w:after="0"/>
+        <w:spacing w:after="0" w:line="360" w:lineRule="auto"/>
         <w:ind w:firstLine="709"/>
         <w:jc w:val="both"/>
         <w:rPr>
@@ -955,7 +964,7 @@
     </w:p>
     <w:p>
       <w:pPr>
-        <w:spacing w:before="240"/>
+        <w:spacing w:before="240" w:line="360" w:lineRule="auto"/>
         <w:jc w:val="both"/>
         <w:rPr>
           <w:rFonts w:ascii="Times New Roman" w:hAnsi="Times New Roman" w:cs="Times New Roman"/>
@@ -972,7 +981,7 @@
     </w:p>
     <w:p>
       <w:pPr>
-        <w:spacing w:after="0"/>
+        <w:spacing w:after="0" w:line="360" w:lineRule="auto"/>
         <w:ind w:firstLine="709"/>
         <w:jc w:val="both"/>
         <w:rPr>
@@ -983,6 +992,7 @@
         <w:rPr>
           <w:rFonts w:ascii="Times New Roman" w:hAnsi="Times New Roman" w:cs="Times New Roman"/>
         </w:rPr>
+        <w:lastRenderedPageBreak/>
         <w:t>Do ponto de vista jurídico, o marco de 2008 gerou intensa controvérsia constitucional, pois flexibilizou as punições para quem desmatou a Reserva Legal além do limite permitido antes daquela data. A doutrina e a jurisprudência debateram se isso configuraria uma anistia inconstitucional aos infratores:</w:t>
       </w:r>
       <w:r>
@@ -1000,7 +1010,7 @@
     </w:p>
     <w:p>
       <w:pPr>
-        <w:spacing w:after="0"/>
+        <w:spacing w:after="0" w:line="360" w:lineRule="auto"/>
         <w:ind w:firstLine="709"/>
         <w:jc w:val="both"/>
         <w:rPr>
@@ -1011,19 +1021,12 @@
         <w:rPr>
           <w:rFonts w:ascii="Times New Roman" w:hAnsi="Times New Roman" w:cs="Times New Roman"/>
         </w:rPr>
-        <w:t xml:space="preserve">A legalidade dessa anistia foi questionada sob a alegação de que a "adoção do marco de 22 de julho de 2008 concede anistia aos infratores ambientais, pois permite que aqueles que </w:t>
-      </w:r>
-      <w:r>
-        <w:rPr>
-          <w:rFonts w:ascii="Times New Roman" w:hAnsi="Times New Roman" w:cs="Times New Roman"/>
-        </w:rPr>
-        <w:lastRenderedPageBreak/>
-        <w:t>praticaram ilícitos em momento anterior ao Decreto possam regularizar sua situação" (FELIPPE; TRENTINI, 2018, p. 82).</w:t>
-      </w:r>
-    </w:p>
-    <w:p>
-      <w:pPr>
-        <w:spacing w:after="0"/>
+        <w:t>A legalidade dessa anistia foi questionada sob a alegação de que a "adoção do marco de 22 de julho de 2008 concede anistia aos infratores ambientais, pois permite que aqueles que praticaram ilícitos em momento anterior ao Decreto possam regularizar sua situação" (FELIPPE; TRENTINI, 2018, p. 82).</w:t>
+      </w:r>
+    </w:p>
+    <w:p>
+      <w:pPr>
+        <w:spacing w:after="0" w:line="360" w:lineRule="auto"/>
         <w:ind w:firstLine="709"/>
         <w:jc w:val="both"/>
         <w:rPr>
@@ -1039,7 +1042,7 @@
     </w:p>
     <w:p>
       <w:pPr>
-        <w:spacing w:before="240"/>
+        <w:spacing w:before="240" w:line="360" w:lineRule="auto"/>
         <w:jc w:val="both"/>
         <w:rPr>
           <w:rFonts w:ascii="Times New Roman" w:hAnsi="Times New Roman" w:cs="Times New Roman"/>
@@ -1056,7 +1059,7 @@
     </w:p>
     <w:p>
       <w:pPr>
-        <w:spacing w:after="0"/>
+        <w:spacing w:after="0" w:line="360" w:lineRule="auto"/>
         <w:ind w:firstLine="709"/>
         <w:jc w:val="both"/>
         <w:rPr>
@@ -1072,7 +1075,7 @@
     </w:p>
     <w:p>
       <w:pPr>
-        <w:spacing w:after="0"/>
+        <w:spacing w:after="0" w:line="360" w:lineRule="auto"/>
         <w:ind w:firstLine="709"/>
         <w:jc w:val="both"/>
         <w:rPr>
@@ -1088,7 +1091,7 @@
     </w:p>
     <w:p>
       <w:pPr>
-        <w:spacing w:before="240"/>
+        <w:spacing w:before="240" w:line="360" w:lineRule="auto"/>
         <w:ind w:left="2268"/>
         <w:jc w:val="both"/>
         <w:rPr>
@@ -1103,12 +1106,21 @@
           <w:sz w:val="20"/>
           <w:szCs w:val="20"/>
         </w:rPr>
-        <w:t>Nos imóveis rurais que detinham, em 22 de julho de 2008, área de até 4 (quatro) módulos fiscais e que possuam remanescente de vegetação nativa em percentuais inferiores ao previsto no art. 12, a Reserva Legal será constituída com a área ocupada com a vegetação nativa existente em 22 de julho de 2008, vedadas novas conversões para uso alternativo do solo (BRASIL, 2012).</w:t>
-      </w:r>
-    </w:p>
-    <w:p>
-      <w:pPr>
-        <w:spacing w:after="0"/>
+        <w:t xml:space="preserve">Nos imóveis rurais que detinham, em 22 de julho de 2008, área de até 4 (quatro) módulos fiscais e que possuam remanescente de vegetação nativa em percentuais inferiores ao previsto no art. 12, a Reserva Legal será constituída com a área ocupada </w:t>
+      </w:r>
+      <w:r>
+        <w:rPr>
+          <w:rFonts w:ascii="Times New Roman" w:hAnsi="Times New Roman" w:cs="Times New Roman"/>
+          <w:sz w:val="20"/>
+          <w:szCs w:val="20"/>
+        </w:rPr>
+        <w:lastRenderedPageBreak/>
+        <w:t>com a vegetação nativa existente em 22 de julho de 2008, vedadas novas conversões para uso alternativo do solo (BRASIL, 2012).</w:t>
+      </w:r>
+    </w:p>
+    <w:p>
+      <w:pPr>
+        <w:spacing w:after="0" w:line="360" w:lineRule="auto"/>
         <w:ind w:firstLine="709"/>
         <w:jc w:val="both"/>
         <w:rPr>
@@ -1124,7 +1136,7 @@
     </w:p>
     <w:p>
       <w:pPr>
-        <w:spacing w:after="0"/>
+        <w:spacing w:after="0" w:line="360" w:lineRule="auto"/>
         <w:ind w:firstLine="709"/>
         <w:jc w:val="both"/>
         <w:rPr>
@@ -1140,7 +1152,7 @@
     </w:p>
     <w:p>
       <w:pPr>
-        <w:spacing w:after="0"/>
+        <w:spacing w:after="0" w:line="360" w:lineRule="auto"/>
         <w:ind w:firstLine="709"/>
         <w:jc w:val="both"/>
         <w:rPr>
@@ -1156,17 +1168,16 @@
     </w:p>
     <w:p>
       <w:pPr>
-        <w:spacing w:before="240"/>
-        <w:jc w:val="both"/>
-        <w:rPr>
-          <w:rFonts w:ascii="Times New Roman" w:hAnsi="Times New Roman" w:cs="Times New Roman"/>
-        </w:rPr>
-      </w:pPr>
-      <w:r>
-        <w:rPr>
-          <w:rFonts w:ascii="Times New Roman" w:hAnsi="Times New Roman" w:cs="Times New Roman"/>
-        </w:rPr>
-        <w:lastRenderedPageBreak/>
+        <w:spacing w:before="240" w:line="360" w:lineRule="auto"/>
+        <w:jc w:val="both"/>
+        <w:rPr>
+          <w:rFonts w:ascii="Times New Roman" w:hAnsi="Times New Roman" w:cs="Times New Roman"/>
+        </w:rPr>
+      </w:pPr>
+      <w:r>
+        <w:rPr>
+          <w:rFonts w:ascii="Times New Roman" w:hAnsi="Times New Roman" w:cs="Times New Roman"/>
+        </w:rPr>
         <w:t xml:space="preserve">2.4 </w:t>
       </w:r>
       <w:r>
@@ -1178,7 +1189,7 @@
     </w:p>
     <w:p>
       <w:pPr>
-        <w:spacing w:after="0"/>
+        <w:spacing w:after="0" w:line="360" w:lineRule="auto"/>
         <w:ind w:firstLine="709"/>
         <w:jc w:val="both"/>
         <w:rPr>
@@ -1194,7 +1205,7 @@
     </w:p>
     <w:p>
       <w:pPr>
-        <w:spacing w:before="240"/>
+        <w:spacing w:before="240" w:line="360" w:lineRule="auto"/>
         <w:jc w:val="both"/>
         <w:rPr>
           <w:rFonts w:ascii="Times New Roman" w:hAnsi="Times New Roman" w:cs="Times New Roman"/>
@@ -1211,7 +1222,7 @@
     </w:p>
     <w:p>
       <w:pPr>
-        <w:spacing w:after="0"/>
+        <w:spacing w:after="0" w:line="360" w:lineRule="auto"/>
         <w:ind w:firstLine="851"/>
         <w:jc w:val="both"/>
         <w:rPr>
@@ -1227,7 +1238,7 @@
     </w:p>
     <w:p>
       <w:pPr>
-        <w:spacing w:after="0"/>
+        <w:spacing w:after="0" w:line="360" w:lineRule="auto"/>
         <w:jc w:val="both"/>
         <w:rPr>
           <w:rFonts w:ascii="Times New Roman" w:hAnsi="Times New Roman" w:cs="Times New Roman"/>
@@ -1242,7 +1253,7 @@
     </w:p>
     <w:p>
       <w:pPr>
-        <w:spacing w:before="240"/>
+        <w:spacing w:before="240" w:line="360" w:lineRule="auto"/>
         <w:ind w:left="2268"/>
         <w:jc w:val="both"/>
         <w:rPr>
@@ -1257,47 +1268,56 @@
           <w:sz w:val="20"/>
           <w:szCs w:val="20"/>
         </w:rPr>
-        <w:t>o poder público poderá reduzir a Reserva Legal para até 50% (cinquenta por cento), para fins de recomposição, quando o Município tiver mais de 50% (cinquenta por cento) da área ocupada por unidades de conservação da natureza de domínio público e por terras indígenas homologadas (BRASIL, 2012, art. 12, § 4º);</w:t>
-      </w:r>
-    </w:p>
-    <w:p>
-      <w:pPr>
-        <w:spacing w:after="0"/>
-        <w:jc w:val="both"/>
-        <w:rPr>
-          <w:rFonts w:ascii="Times New Roman" w:hAnsi="Times New Roman" w:cs="Times New Roman"/>
-        </w:rPr>
-      </w:pPr>
-      <w:r>
-        <w:rPr>
-          <w:rFonts w:ascii="Times New Roman" w:hAnsi="Times New Roman" w:cs="Times New Roman"/>
-        </w:rPr>
-        <w:t>b) critério estadual (65% e ZEE):</w:t>
-      </w:r>
-    </w:p>
-    <w:p>
-      <w:pPr>
-        <w:spacing w:before="240"/>
-        <w:ind w:left="2268"/>
-        <w:jc w:val="both"/>
+        <w:t xml:space="preserve">o poder público poderá reduzir a Reserva Legal para até 50% (cinquenta por cento), para fins de recomposição, quando o Município tiver mais de 50% (cinquenta por </w:t>
+      </w:r>
+      <w:r>
         <w:rPr>
           <w:rFonts w:ascii="Times New Roman" w:hAnsi="Times New Roman" w:cs="Times New Roman"/>
           <w:sz w:val="20"/>
           <w:szCs w:val="20"/>
         </w:rPr>
-      </w:pPr>
-      <w:r>
+        <w:lastRenderedPageBreak/>
+        <w:t>cento) da área ocupada por unidades de conservação da natureza de domínio público e por terras indígenas homologadas (BRASIL, 2012, art. 12, § 4º);</w:t>
+      </w:r>
+    </w:p>
+    <w:p>
+      <w:pPr>
+        <w:spacing w:after="0" w:line="360" w:lineRule="auto"/>
+        <w:jc w:val="both"/>
+        <w:rPr>
+          <w:rFonts w:ascii="Times New Roman" w:hAnsi="Times New Roman" w:cs="Times New Roman"/>
+        </w:rPr>
+      </w:pPr>
+      <w:r>
+        <w:rPr>
+          <w:rFonts w:ascii="Times New Roman" w:hAnsi="Times New Roman" w:cs="Times New Roman"/>
+        </w:rPr>
+        <w:t>b) critério estadual (65% e ZEE):</w:t>
+      </w:r>
+    </w:p>
+    <w:p>
+      <w:pPr>
+        <w:spacing w:before="240" w:line="360" w:lineRule="auto"/>
+        <w:ind w:left="2268"/>
+        <w:jc w:val="both"/>
         <w:rPr>
           <w:rFonts w:ascii="Times New Roman" w:hAnsi="Times New Roman" w:cs="Times New Roman"/>
           <w:sz w:val="20"/>
           <w:szCs w:val="20"/>
         </w:rPr>
+      </w:pPr>
+      <w:r>
+        <w:rPr>
+          <w:rFonts w:ascii="Times New Roman" w:hAnsi="Times New Roman" w:cs="Times New Roman"/>
+          <w:sz w:val="20"/>
+          <w:szCs w:val="20"/>
+        </w:rPr>
         <w:t>o poder público estadual, ouvido o Conselho Estadual de Meio Ambiente, poderá reduzir a Reserva Legal para até 50% (cinquenta por cento), quando o Estado tiver Zoneamento Ecológico-Econômico aprovado e mais de 65% (sessenta e cinco por cento) do seu território ocupado por unidades de conservação da natureza de domínio público, devidamente regularizadas, e por terras indígenas homologadas (BRASIL, 2012, art. 12, § 5º).</w:t>
       </w:r>
     </w:p>
     <w:p>
       <w:pPr>
-        <w:spacing w:before="240"/>
+        <w:spacing w:before="240" w:line="360" w:lineRule="auto"/>
         <w:jc w:val="both"/>
         <w:rPr>
           <w:rFonts w:ascii="Times New Roman" w:hAnsi="Times New Roman" w:cs="Times New Roman"/>
@@ -1314,7 +1334,7 @@
     </w:p>
     <w:p>
       <w:pPr>
-        <w:spacing w:after="0"/>
+        <w:spacing w:after="0" w:line="360" w:lineRule="auto"/>
         <w:ind w:firstLine="709"/>
         <w:jc w:val="both"/>
         <w:rPr>
@@ -1330,7 +1350,7 @@
     </w:p>
     <w:p>
       <w:pPr>
-        <w:spacing w:before="240"/>
+        <w:spacing w:before="240" w:line="360" w:lineRule="auto"/>
         <w:ind w:left="2127"/>
         <w:jc w:val="both"/>
         <w:rPr>
@@ -1350,7 +1370,7 @@
     </w:p>
     <w:p>
       <w:pPr>
-        <w:spacing w:after="0"/>
+        <w:spacing w:after="0" w:line="360" w:lineRule="auto"/>
         <w:ind w:firstLine="709"/>
         <w:jc w:val="both"/>
         <w:rPr>
@@ -1366,7 +1386,7 @@
     </w:p>
     <w:p>
       <w:pPr>
-        <w:spacing w:before="240"/>
+        <w:spacing w:before="240" w:line="360" w:lineRule="auto"/>
         <w:ind w:left="2268"/>
         <w:jc w:val="both"/>
         <w:rPr>
@@ -1386,7 +1406,7 @@
     </w:p>
     <w:p>
       <w:pPr>
-        <w:spacing w:after="0"/>
+        <w:spacing w:after="0" w:line="360" w:lineRule="auto"/>
         <w:ind w:firstLine="709"/>
         <w:jc w:val="both"/>
         <w:rPr>
@@ -1397,19 +1417,50 @@
         <w:rPr>
           <w:rFonts w:ascii="Times New Roman" w:hAnsi="Times New Roman" w:cs="Times New Roman"/>
         </w:rPr>
-        <w:t xml:space="preserve">Para que o proprietário rural paraense possa usufruir dessa redução de 80% para 50%, a lei do ZEE (Lei nº 7.398/2010) exige, entre outros requisitos, a "apresentação de proposta de </w:t>
+        <w:t>Para que o proprietário rural paraense possa usufruir dessa redução de 80% para 50%, a lei do ZEE (Lei nº 7.398/2010) exige, entre outros requisitos, a "apresentação de proposta de regularização ambiental do imóvel junto ao órgão estadual de meio ambiente e o seu ingresso no Cadastro Ambiental Rural", além da "celebração de compromisso de recuperação ou regeneração integral das Áreas de Preservação Permanente" (PARÁ, 2010, art. 8º, incisos I e II).</w:t>
+      </w:r>
+    </w:p>
+    <w:p>
+      <w:pPr>
+        <w:spacing w:after="0" w:line="360" w:lineRule="auto"/>
+        <w:ind w:firstLine="709"/>
+        <w:jc w:val="both"/>
+        <w:rPr>
+          <w:rFonts w:ascii="Times New Roman" w:hAnsi="Times New Roman" w:cs="Times New Roman"/>
+        </w:rPr>
+      </w:pPr>
+      <w:r>
+        <w:rPr>
+          <w:rFonts w:ascii="Times New Roman" w:hAnsi="Times New Roman" w:cs="Times New Roman"/>
+        </w:rPr>
+        <w:t xml:space="preserve">Essa adequação estadual foi posteriormente respaldada pela União através de um Decreto Federal de 24 de abril de 2013, "que autoriza a redução da Reserva Legal de imóveis </w:t>
       </w:r>
       <w:r>
         <w:rPr>
           <w:rFonts w:ascii="Times New Roman" w:hAnsi="Times New Roman" w:cs="Times New Roman"/>
         </w:rPr>
         <w:lastRenderedPageBreak/>
-        <w:t>regularização ambiental do imóvel junto ao órgão estadual de meio ambiente e o seu ingresso no Cadastro Ambiental Rural", além da "celebração de compromisso de recuperação ou regeneração integral das Áreas de Preservação Permanente" (PARÁ, 2010, art. 8º, incisos I e II).</w:t>
-      </w:r>
-    </w:p>
-    <w:p>
-      <w:pPr>
-        <w:spacing w:after="0"/>
+        <w:t>rurais situados nas Zonas de Consolidação I, II e III, definidas na Lei Estadual Nº 7.398, de 16 de abril de 2010, do Estado do Pará [...] para fins de regularização" (PARÁ, 2015).</w:t>
+      </w:r>
+    </w:p>
+    <w:p>
+      <w:pPr>
+        <w:spacing w:before="240" w:line="360" w:lineRule="auto"/>
+        <w:jc w:val="both"/>
+        <w:rPr>
+          <w:rFonts w:ascii="Times New Roman" w:hAnsi="Times New Roman" w:cs="Times New Roman"/>
+        </w:rPr>
+      </w:pPr>
+      <w:r>
+        <w:rPr>
+          <w:rFonts w:ascii="Times New Roman" w:hAnsi="Times New Roman" w:cs="Times New Roman"/>
+        </w:rPr>
+        <w:t>2.5 JUSTIFICATIVA TÉCNICA E GEOTECNOLÓGICA DA ANÁLISE DE PASSIVOS AMBIENTAIS</w:t>
+      </w:r>
+    </w:p>
+    <w:p>
+      <w:pPr>
+        <w:spacing w:after="0" w:line="360" w:lineRule="auto"/>
         <w:ind w:firstLine="709"/>
         <w:jc w:val="both"/>
         <w:rPr>
@@ -1420,43 +1471,12 @@
         <w:rPr>
           <w:rFonts w:ascii="Times New Roman" w:hAnsi="Times New Roman" w:cs="Times New Roman"/>
         </w:rPr>
-        <w:t>Essa adequação estadual foi posteriormente respaldada pela União através de um Decreto Federal de 24 de abril de 2013, "que autoriza a redução da Reserva Legal de imóveis rurais situados nas Zonas de Consolidação I, II e III, definidas na Lei Estadual Nº 7.398, de 16 de abril de 2010, do Estado do Pará [...] para fins de regularização" (PARÁ, 2015).</w:t>
-      </w:r>
-    </w:p>
-    <w:p>
-      <w:pPr>
-        <w:spacing w:before="240"/>
-        <w:jc w:val="both"/>
-        <w:rPr>
-          <w:rFonts w:ascii="Times New Roman" w:hAnsi="Times New Roman" w:cs="Times New Roman"/>
-        </w:rPr>
-      </w:pPr>
-      <w:r>
-        <w:rPr>
-          <w:rFonts w:ascii="Times New Roman" w:hAnsi="Times New Roman" w:cs="Times New Roman"/>
-        </w:rPr>
-        <w:t>2.5 JUSTIFICATIVA TÉCNICA E GEOTECNOLÓGICA DA ANÁLISE DE PASSIVOS AMBIENTAIS</w:t>
-      </w:r>
-    </w:p>
-    <w:p>
-      <w:pPr>
-        <w:spacing w:after="0"/>
-        <w:ind w:firstLine="709"/>
-        <w:jc w:val="both"/>
-        <w:rPr>
-          <w:rFonts w:ascii="Times New Roman" w:hAnsi="Times New Roman" w:cs="Times New Roman"/>
-        </w:rPr>
-      </w:pPr>
-      <w:r>
-        <w:rPr>
-          <w:rFonts w:ascii="Times New Roman" w:hAnsi="Times New Roman" w:cs="Times New Roman"/>
-        </w:rPr>
         <w:t>A confiabilidade do sensoriamento remoto para a verificação de passivos ambientais e o monitoramento do Cadastro Ambiental Rural (CAR) repousa na alta precisão espacial, no rigor do georreferenciamento e na capacidade de reconstituir cenários históricos através de séries temporais de imagens. Os argumentos técnicos que validam seu uso dividem-se em quatro pilares principais:</w:t>
       </w:r>
     </w:p>
     <w:p>
       <w:pPr>
-        <w:spacing w:before="240"/>
+        <w:spacing w:before="240" w:line="360" w:lineRule="auto"/>
         <w:jc w:val="both"/>
         <w:rPr>
           <w:rFonts w:ascii="Times New Roman" w:hAnsi="Times New Roman" w:cs="Times New Roman"/>
@@ -1473,7 +1493,7 @@
     </w:p>
     <w:p>
       <w:pPr>
-        <w:spacing w:after="0"/>
+        <w:spacing w:after="0" w:line="360" w:lineRule="auto"/>
         <w:ind w:firstLine="709"/>
         <w:jc w:val="both"/>
         <w:rPr>
@@ -1489,7 +1509,7 @@
     </w:p>
     <w:p>
       <w:pPr>
-        <w:spacing w:before="240"/>
+        <w:spacing w:before="240" w:line="360" w:lineRule="auto"/>
         <w:ind w:left="2127"/>
         <w:jc w:val="both"/>
         <w:rPr>
@@ -1525,7 +1545,7 @@
     </w:p>
     <w:p>
       <w:pPr>
-        <w:spacing w:before="240"/>
+        <w:spacing w:before="240" w:line="360" w:lineRule="auto"/>
         <w:jc w:val="both"/>
         <w:rPr>
           <w:rFonts w:ascii="Times New Roman" w:hAnsi="Times New Roman" w:cs="Times New Roman"/>
@@ -1542,7 +1562,7 @@
     </w:p>
     <w:p>
       <w:pPr>
-        <w:spacing w:after="0"/>
+        <w:spacing w:after="0" w:line="360" w:lineRule="auto"/>
         <w:ind w:firstLine="709"/>
         <w:jc w:val="both"/>
         <w:rPr>
@@ -1594,7 +1614,7 @@
     </w:p>
     <w:p>
       <w:pPr>
-        <w:spacing w:after="0"/>
+        <w:spacing w:after="0" w:line="360" w:lineRule="auto"/>
         <w:ind w:firstLine="709"/>
         <w:jc w:val="both"/>
         <w:rPr>
@@ -1605,19 +1625,19 @@
         <w:rPr>
           <w:rFonts w:ascii="Times New Roman" w:hAnsi="Times New Roman" w:cs="Times New Roman"/>
         </w:rPr>
-        <w:t xml:space="preserve">No âmbito do Poder Judiciário, o Superior Tribunal de Justiça (STJ) sedimentou o entendimento de que o sensoriamento remoto possui alto valor de prova documental. Sob a égide do artigo 405 do Código de Processo Civil de 2015, a jurisprudência da Corte estabelece que imagens de satélite e mapas elaborados por órgãos do Estado enquadram-se no conceito de documento público, possuindo "presunção (relativa) de legalidade, legitimidade e veracidade" que inverte o ônus da prova contra o infrator (BRASIL, 2016). O próprio STJ destaca que, "em época de grandes avanços tecnológicos, configuraria despropósito ou formalismo supérfluo negar validade plena a imagens de satélite e mapas elaborados a partir delas" (BRASIL, 2017), </w:t>
+        <w:t xml:space="preserve">No âmbito do Poder Judiciário, o Superior Tribunal de Justiça (STJ) sedimentou o entendimento de que o sensoriamento remoto possui alto valor de prova documental. Sob a égide do artigo 405 do Código de Processo Civil de 2015, a jurisprudência da Corte estabelece que imagens de satélite e mapas elaborados por órgãos do Estado enquadram-se no conceito de documento público, possuindo "presunção (relativa) de legalidade, legitimidade e veracidade" que inverte o ônus da prova contra o infrator (BRASIL, 2016). O próprio STJ destaca que, "em </w:t>
       </w:r>
       <w:r>
         <w:rPr>
           <w:rFonts w:ascii="Times New Roman" w:hAnsi="Times New Roman" w:cs="Times New Roman"/>
         </w:rPr>
         <w:lastRenderedPageBreak/>
-        <w:t>tornando essa tecnologia prova hábil e suficiente para constatar a degradação ambiental histórica.</w:t>
-      </w:r>
-    </w:p>
-    <w:p>
-      <w:pPr>
-        <w:spacing w:after="0"/>
+        <w:t>época de grandes avanços tecnológicos, configuraria despropósito ou formalismo supérfluo negar validade plena a imagens de satélite e mapas elaborados a partir delas" (BRASIL, 2017), tornando essa tecnologia prova hábil e suficiente para constatar a degradação ambiental histórica.</w:t>
+      </w:r>
+    </w:p>
+    <w:p>
+      <w:pPr>
+        <w:spacing w:after="0" w:line="360" w:lineRule="auto"/>
         <w:ind w:firstLine="709"/>
         <w:jc w:val="both"/>
         <w:rPr>
@@ -1633,7 +1653,7 @@
     </w:p>
     <w:p>
       <w:pPr>
-        <w:spacing w:after="0"/>
+        <w:spacing w:after="0" w:line="360" w:lineRule="auto"/>
         <w:ind w:firstLine="709"/>
         <w:jc w:val="both"/>
         <w:rPr>
@@ -1649,7 +1669,7 @@
     </w:p>
     <w:p>
       <w:pPr>
-        <w:spacing w:before="240"/>
+        <w:spacing w:before="240" w:line="360" w:lineRule="auto"/>
         <w:jc w:val="both"/>
         <w:rPr>
           <w:rFonts w:ascii="Times New Roman" w:hAnsi="Times New Roman" w:cs="Times New Roman"/>
@@ -1666,7 +1686,7 @@
     </w:p>
     <w:p>
       <w:pPr>
-        <w:spacing w:after="0"/>
+        <w:spacing w:after="0" w:line="360" w:lineRule="auto"/>
         <w:ind w:firstLine="709"/>
         <w:jc w:val="both"/>
         <w:rPr>
@@ -1682,7 +1702,7 @@
     </w:p>
     <w:p>
       <w:pPr>
-        <w:spacing w:before="240"/>
+        <w:spacing w:before="240" w:line="360" w:lineRule="auto"/>
         <w:jc w:val="both"/>
         <w:rPr>
           <w:rFonts w:ascii="Times New Roman" w:hAnsi="Times New Roman" w:cs="Times New Roman"/>
@@ -1699,7 +1719,7 @@
     </w:p>
     <w:p>
       <w:pPr>
-        <w:spacing w:after="0"/>
+        <w:spacing w:after="0" w:line="360" w:lineRule="auto"/>
         <w:ind w:firstLine="709"/>
         <w:jc w:val="both"/>
         <w:rPr>
@@ -1710,12 +1730,19 @@
         <w:rPr>
           <w:rFonts w:ascii="Times New Roman" w:hAnsi="Times New Roman" w:cs="Times New Roman"/>
         </w:rPr>
-        <w:t>A iniciativa MapBiomas Alerta surgiu com o intuito de agregar valor aos sistemas já existentes de monitoramento do desmatamento no Brasil, visando verificar, validar e refinar cada alerta de desmatamento para determinar seu grau de regularidade legal (MAPBIOMAS, 2022). Para que essa precisão seja alcançada, os alertas passam por um processo de agregação e refinamento a partir da análise de imagens de satélite diárias da constelação PlanetScope, que possuem resolução espacial de 3 metros (MAPBIOMAS, 2022).</w:t>
-      </w:r>
-    </w:p>
-    <w:p>
-      <w:pPr>
-        <w:spacing w:after="0"/>
+        <w:t xml:space="preserve">A iniciativa MapBiomas Alerta surgiu com o intuito de agregar valor aos sistemas já existentes de monitoramento do desmatamento no Brasil, visando verificar, validar e refinar cada alerta de desmatamento para determinar seu grau de regularidade legal (MAPBIOMAS, 2022). Para que essa precisão seja alcançada, os alertas passam por um processo de agregação </w:t>
+      </w:r>
+      <w:r>
+        <w:rPr>
+          <w:rFonts w:ascii="Times New Roman" w:hAnsi="Times New Roman" w:cs="Times New Roman"/>
+        </w:rPr>
+        <w:lastRenderedPageBreak/>
+        <w:t>e refinamento a partir da análise de imagens de satélite diárias da constelação PlanetScope, que possuem resolução espacial de 3 metros (MAPBIOMAS, 2022).</w:t>
+      </w:r>
+    </w:p>
+    <w:p>
+      <w:pPr>
+        <w:spacing w:after="0" w:line="360" w:lineRule="auto"/>
         <w:ind w:firstLine="709"/>
         <w:jc w:val="both"/>
         <w:rPr>
@@ -1745,7 +1772,7 @@
     </w:p>
     <w:p>
       <w:pPr>
-        <w:spacing w:before="240"/>
+        <w:spacing w:before="240" w:line="360" w:lineRule="auto"/>
         <w:jc w:val="both"/>
         <w:rPr>
           <w:rFonts w:ascii="Times New Roman" w:hAnsi="Times New Roman" w:cs="Times New Roman"/>
@@ -1757,13 +1784,12 @@
           <w:b/>
           <w:bCs/>
         </w:rPr>
-        <w:lastRenderedPageBreak/>
         <w:t>3 METODOLOGIA</w:t>
       </w:r>
     </w:p>
     <w:p>
       <w:pPr>
-        <w:spacing w:after="0"/>
+        <w:spacing w:after="0" w:line="360" w:lineRule="auto"/>
         <w:ind w:firstLine="709"/>
         <w:jc w:val="both"/>
         <w:rPr>
@@ -1793,7 +1819,7 @@
     </w:p>
     <w:p>
       <w:pPr>
-        <w:spacing w:before="240"/>
+        <w:spacing w:before="240" w:line="360" w:lineRule="auto"/>
         <w:jc w:val="both"/>
         <w:rPr>
           <w:rFonts w:ascii="Times New Roman" w:hAnsi="Times New Roman" w:cs="Times New Roman"/>
@@ -1808,7 +1834,7 @@
     </w:p>
     <w:p>
       <w:pPr>
-        <w:spacing w:after="0"/>
+        <w:spacing w:after="0" w:line="360" w:lineRule="auto"/>
         <w:ind w:firstLine="709"/>
         <w:jc w:val="both"/>
         <w:rPr>
@@ -1824,7 +1850,7 @@
     </w:p>
     <w:p>
       <w:pPr>
-        <w:spacing w:after="0"/>
+        <w:spacing w:after="0" w:line="360" w:lineRule="auto"/>
         <w:ind w:firstLine="709"/>
         <w:jc w:val="both"/>
         <w:rPr>
@@ -1840,7 +1866,7 @@
     </w:p>
     <w:p>
       <w:pPr>
-        <w:spacing w:after="0"/>
+        <w:spacing w:after="0" w:line="360" w:lineRule="auto"/>
         <w:ind w:firstLine="709"/>
         <w:jc w:val="both"/>
         <w:rPr>
@@ -1856,7 +1882,7 @@
     </w:p>
     <w:p>
       <w:pPr>
-        <w:spacing w:after="0"/>
+        <w:spacing w:after="0" w:line="360" w:lineRule="auto"/>
         <w:ind w:firstLine="709"/>
         <w:jc w:val="both"/>
         <w:rPr>
@@ -1867,6 +1893,7 @@
         <w:rPr>
           <w:rFonts w:ascii="Times New Roman" w:hAnsi="Times New Roman" w:cs="Times New Roman"/>
         </w:rPr>
+        <w:lastRenderedPageBreak/>
         <w:t xml:space="preserve">Para a avaliação do uso e cobertura da terra, integraram-se dados das coleções 9 e 10 do projeto MapBiomas. A Coleção 9, baseada em sensores </w:t>
       </w:r>
       <w:r>
@@ -1900,7 +1927,7 @@
     </w:p>
     <w:p>
       <w:pPr>
-        <w:spacing w:before="240"/>
+        <w:spacing w:before="240" w:line="360" w:lineRule="auto"/>
         <w:jc w:val="both"/>
         <w:rPr>
           <w:rFonts w:ascii="Times New Roman" w:hAnsi="Times New Roman" w:cs="Times New Roman"/>
@@ -1915,7 +1942,7 @@
     </w:p>
     <w:p>
       <w:pPr>
-        <w:spacing w:after="0"/>
+        <w:spacing w:after="0" w:line="360" w:lineRule="auto"/>
         <w:ind w:firstLine="709"/>
         <w:jc w:val="both"/>
         <w:rPr>
@@ -2001,7 +2028,7 @@
     </w:p>
     <w:p>
       <w:pPr>
-        <w:spacing w:after="0"/>
+        <w:spacing w:after="0" w:line="360" w:lineRule="auto"/>
         <w:ind w:firstLine="709"/>
         <w:jc w:val="both"/>
         <w:rPr>
@@ -2045,7 +2072,7 @@
     </w:p>
     <w:p>
       <w:pPr>
-        <w:spacing w:after="0"/>
+        <w:spacing w:after="0" w:line="360" w:lineRule="auto"/>
         <w:ind w:firstLine="709"/>
         <w:jc w:val="both"/>
         <w:rPr>
@@ -2056,7 +2083,6 @@
         <w:rPr>
           <w:rFonts w:ascii="Times New Roman" w:hAnsi="Times New Roman" w:cs="Times New Roman"/>
         </w:rPr>
-        <w:lastRenderedPageBreak/>
         <w:t xml:space="preserve">A carga dos dados consistiu na exportação do </w:t>
       </w:r>
       <w:r>
@@ -2118,7 +2144,7 @@
     </w:p>
     <w:p>
       <w:pPr>
-        <w:spacing w:before="240"/>
+        <w:spacing w:before="240" w:line="360" w:lineRule="auto"/>
         <w:jc w:val="both"/>
         <w:rPr>
           <w:rFonts w:ascii="Times New Roman" w:hAnsi="Times New Roman" w:cs="Times New Roman"/>
@@ -2137,7 +2163,7 @@
     </w:p>
     <w:p>
       <w:pPr>
-        <w:spacing w:after="0"/>
+        <w:spacing w:after="0" w:line="360" w:lineRule="auto"/>
         <w:ind w:firstLine="709"/>
         <w:jc w:val="both"/>
         <w:rPr>
@@ -2195,7 +2221,7 @@
     </w:p>
     <w:p>
       <w:pPr>
-        <w:spacing w:after="0"/>
+        <w:spacing w:after="0" w:line="360" w:lineRule="auto"/>
         <w:ind w:firstLine="709"/>
         <w:jc w:val="both"/>
         <w:rPr>
@@ -2206,6 +2232,7 @@
         <w:rPr>
           <w:rFonts w:ascii="Times New Roman" w:hAnsi="Times New Roman" w:cs="Times New Roman"/>
         </w:rPr>
+        <w:lastRenderedPageBreak/>
         <w:t xml:space="preserve">A operação de cruzamento espacial foi executada por meio da função reduceRegions, utilizando uma escala de 30 metros para manter a compatibilidade com o marco temporal de 2008. Para cada polígono de imóvel rural, o algoritmo calculou a soma dos pixels de vegetação nativa, convertendo o resultado para hectares através do produto da contagem de pixels pela área unitária de cada pixel </w:t>
       </w:r>
       <m:oMath>
@@ -2282,7 +2309,7 @@
     </w:p>
     <w:p>
       <w:pPr>
-        <w:spacing w:after="0"/>
+        <w:spacing w:after="0" w:line="360" w:lineRule="auto"/>
         <w:ind w:firstLine="709"/>
         <w:jc w:val="both"/>
         <w:rPr>
@@ -2305,7 +2332,7 @@
         <w:tabs>
           <w:tab w:val="clear" w:pos="720"/>
         </w:tabs>
-        <w:spacing w:before="240"/>
+        <w:spacing w:before="240" w:line="360" w:lineRule="auto"/>
         <w:ind w:left="0" w:hanging="11"/>
         <w:jc w:val="both"/>
         <w:rPr>
@@ -2323,7 +2350,7 @@
     </w:p>
     <w:p>
       <w:pPr>
-        <w:spacing w:before="240"/>
+        <w:spacing w:before="240" w:line="360" w:lineRule="auto"/>
         <w:jc w:val="both"/>
         <w:rPr>
           <w:rFonts w:ascii="Times New Roman" w:hAnsi="Times New Roman" w:cs="Times New Roman"/>
@@ -2527,7 +2554,7 @@
         <w:tabs>
           <w:tab w:val="clear" w:pos="720"/>
         </w:tabs>
-        <w:spacing w:before="240"/>
+        <w:spacing w:before="240" w:line="360" w:lineRule="auto"/>
         <w:ind w:left="0" w:hanging="11"/>
         <w:jc w:val="both"/>
         <w:rPr>
@@ -2545,7 +2572,7 @@
     </w:p>
     <w:p>
       <w:pPr>
-        <w:spacing w:before="240"/>
+        <w:spacing w:before="240" w:line="360" w:lineRule="auto"/>
         <w:jc w:val="both"/>
         <w:rPr>
           <w:rFonts w:ascii="Times New Roman" w:hAnsi="Times New Roman" w:cs="Times New Roman"/>
@@ -2749,7 +2776,7 @@
         <w:tabs>
           <w:tab w:val="clear" w:pos="720"/>
         </w:tabs>
-        <w:spacing w:before="240"/>
+        <w:spacing w:before="240" w:line="360" w:lineRule="auto"/>
         <w:ind w:left="0" w:hanging="11"/>
         <w:jc w:val="both"/>
         <w:rPr>
@@ -2767,7 +2794,7 @@
     </w:p>
     <w:p>
       <w:pPr>
-        <w:spacing w:before="240"/>
+        <w:spacing w:before="240" w:line="360" w:lineRule="auto"/>
         <w:jc w:val="both"/>
         <w:rPr>
           <w:rFonts w:ascii="Times New Roman" w:hAnsi="Times New Roman" w:cs="Times New Roman"/>
@@ -2954,7 +2981,7 @@
         <w:tabs>
           <w:tab w:val="clear" w:pos="720"/>
         </w:tabs>
-        <w:spacing w:before="240"/>
+        <w:spacing w:before="240" w:line="360" w:lineRule="auto"/>
         <w:ind w:left="0" w:hanging="11"/>
         <w:jc w:val="both"/>
         <w:rPr>
@@ -2972,7 +2999,7 @@
     </w:p>
     <w:p>
       <w:pPr>
-        <w:spacing w:before="240"/>
+        <w:spacing w:before="240" w:line="360" w:lineRule="auto"/>
         <w:ind w:firstLine="709"/>
         <w:jc w:val="both"/>
         <w:rPr>
@@ -3069,7 +3096,7 @@
     </w:p>
     <w:p>
       <w:pPr>
-        <w:spacing w:after="0"/>
+        <w:spacing w:after="0" w:line="360" w:lineRule="auto"/>
         <w:ind w:firstLine="709"/>
         <w:jc w:val="both"/>
         <w:rPr>
@@ -3092,7 +3119,7 @@
         <w:tabs>
           <w:tab w:val="clear" w:pos="720"/>
         </w:tabs>
-        <w:spacing w:after="0"/>
+        <w:spacing w:after="0" w:line="360" w:lineRule="auto"/>
         <w:ind w:left="993" w:hanging="284"/>
         <w:jc w:val="both"/>
         <w:rPr>
@@ -3153,7 +3180,7 @@
         <w:tabs>
           <w:tab w:val="clear" w:pos="720"/>
         </w:tabs>
-        <w:spacing w:after="0"/>
+        <w:spacing w:after="0" w:line="360" w:lineRule="auto"/>
         <w:ind w:left="993" w:hanging="284"/>
         <w:jc w:val="both"/>
         <w:rPr>
@@ -3214,7 +3241,7 @@
         <w:tabs>
           <w:tab w:val="clear" w:pos="720"/>
         </w:tabs>
-        <w:spacing w:after="0"/>
+        <w:spacing w:after="0" w:line="360" w:lineRule="auto"/>
         <w:ind w:left="993" w:hanging="284"/>
         <w:jc w:val="both"/>
         <w:rPr>
@@ -3271,7 +3298,7 @@
         <w:tabs>
           <w:tab w:val="clear" w:pos="720"/>
         </w:tabs>
-        <w:spacing w:after="0"/>
+        <w:spacing w:after="0" w:line="360" w:lineRule="auto"/>
         <w:ind w:left="993" w:hanging="284"/>
         <w:jc w:val="both"/>
         <w:rPr>
@@ -3327,7 +3354,7 @@
         <w:tabs>
           <w:tab w:val="clear" w:pos="720"/>
         </w:tabs>
-        <w:spacing w:after="0"/>
+        <w:spacing w:after="0" w:line="360" w:lineRule="auto"/>
         <w:ind w:left="993" w:hanging="284"/>
         <w:jc w:val="both"/>
         <w:rPr>
@@ -3374,7 +3401,7 @@
     </w:p>
     <w:p>
       <w:pPr>
-        <w:spacing w:before="240" w:after="0"/>
+        <w:spacing w:before="240" w:after="0" w:line="360" w:lineRule="auto"/>
         <w:ind w:firstLine="709"/>
         <w:jc w:val="both"/>
         <w:rPr>
@@ -3385,6 +3412,7 @@
         <w:rPr>
           <w:rFonts w:ascii="Times New Roman" w:hAnsi="Times New Roman" w:cs="Times New Roman"/>
         </w:rPr>
+        <w:lastRenderedPageBreak/>
         <w:t xml:space="preserve">O valor resultante de </w:t>
       </w:r>
       <m:oMath>
@@ -3395,35 +3423,765 @@
           <w:rPr>
             <w:rFonts w:ascii="Cambria Math" w:hAnsi="Cambria Math" w:cs="Times New Roman"/>
           </w:rPr>
-          <m:t>Δ</m:t>
+          <m:t xml:space="preserve">Δ </m:t>
         </m:r>
+      </m:oMath>
+      <w:r>
+        <w:rPr>
+          <w:rFonts w:ascii="Times New Roman" w:hAnsi="Times New Roman" w:cs="Times New Roman"/>
+        </w:rPr>
+        <w:t xml:space="preserve">quantifica a extensão de terras que deixam de ser computadas como déficit ambiental oneroso no cenário de redução para 50%, permitindo a regularização do imóvel via Plano de Recuperação Ambiental (PRA) sem a necessidade de recomposição de áreas consolidadas além do novo limite legal. Os resultados finais foram consolidados em tabelas de dados exportadas em formato CSV para análise estatística, integrando todas as variáveis espaciais e normativas processadas. </w:t>
+      </w:r>
+      <w:r>
+        <w:rPr>
+          <w:rFonts w:ascii="Times New Roman" w:hAnsi="Times New Roman" w:cs="Times New Roman"/>
+        </w:rPr>
+        <w:t>Os scripts utilizados para este processamento, incluindo a rotina de filtragem em Python e o processamento em nuvem no GEE, estão disponíveis para replicação técnica em repositório de acesso público (SANTOS, 2026).</w:t>
+      </w:r>
+    </w:p>
+    <w:p>
+      <w:pPr>
+        <w:spacing w:before="240" w:line="360" w:lineRule="auto"/>
+        <w:jc w:val="both"/>
+        <w:rPr>
+          <w:rFonts w:ascii="Times New Roman" w:hAnsi="Times New Roman" w:cs="Times New Roman"/>
+        </w:rPr>
+      </w:pPr>
+      <w:r>
+        <w:rPr>
+          <w:rFonts w:ascii="Times New Roman" w:hAnsi="Times New Roman" w:cs="Times New Roman"/>
+        </w:rPr>
+        <w:t>3.4 PROCESSAMENTO E ANÁLISE ESTATÍSTICA DE DADOS</w:t>
+      </w:r>
+    </w:p>
+    <w:p>
+      <w:pPr>
+        <w:spacing w:after="0" w:line="360" w:lineRule="auto"/>
+        <w:ind w:firstLine="709"/>
+        <w:jc w:val="both"/>
+        <w:rPr>
+          <w:rFonts w:ascii="Times New Roman" w:hAnsi="Times New Roman" w:cs="Times New Roman"/>
+        </w:rPr>
+      </w:pPr>
+      <w:r>
+        <w:rPr>
+          <w:rFonts w:ascii="Times New Roman" w:hAnsi="Times New Roman" w:cs="Times New Roman"/>
+        </w:rPr>
+        <w:t xml:space="preserve">Para a quantificação do passivo ambiental e a simulação dos cenários de conformidade, os dados espaciais pré-processados foram submetidos a um fluxo de análise estatística utilizando a linguagem R, versão 4.x. O processamento estruturou-se no ecossistema de pacotes </w:t>
+      </w:r>
+      <w:r>
+        <w:rPr>
+          <w:rFonts w:ascii="Times New Roman" w:hAnsi="Times New Roman" w:cs="Times New Roman"/>
+          <w:i/>
+          <w:iCs/>
+        </w:rPr>
+        <w:t>tidyverse</w:t>
+      </w:r>
+      <w:r>
+        <w:rPr>
+          <w:rFonts w:ascii="Times New Roman" w:hAnsi="Times New Roman" w:cs="Times New Roman"/>
+        </w:rPr>
+        <w:t>, permitindo a manipulação eficiente de grandes volumes de dados tabulares provenientes das bases geográficas.</w:t>
+      </w:r>
+    </w:p>
+    <w:p>
+      <w:pPr>
+        <w:spacing w:before="240" w:line="360" w:lineRule="auto"/>
+        <w:jc w:val="both"/>
+        <w:rPr>
+          <w:rFonts w:ascii="Times New Roman" w:hAnsi="Times New Roman" w:cs="Times New Roman"/>
+        </w:rPr>
+      </w:pPr>
+      <w:r>
+        <w:rPr>
+          <w:rFonts w:ascii="Times New Roman" w:hAnsi="Times New Roman" w:cs="Times New Roman"/>
+          <w:b/>
+          <w:bCs/>
+        </w:rPr>
+        <w:t>3.4.1 Integração de bases e critérios de elegibilidade</w:t>
+      </w:r>
+    </w:p>
+    <w:p>
+      <w:pPr>
+        <w:spacing w:after="0" w:line="360" w:lineRule="auto"/>
+        <w:ind w:firstLine="709"/>
+        <w:jc w:val="both"/>
+        <w:rPr>
+          <w:rFonts w:ascii="Times New Roman" w:hAnsi="Times New Roman" w:cs="Times New Roman"/>
+        </w:rPr>
+      </w:pPr>
+      <w:r>
+        <w:rPr>
+          <w:rFonts w:ascii="Times New Roman" w:hAnsi="Times New Roman" w:cs="Times New Roman"/>
+        </w:rPr>
+        <w:t>A base principal de imóveis rurais com área superior a 4 Módulos Fiscais (MF) foi integrada à malha de áreas protegidas, compreendendo Unidades de Conservação de domínio público e Terras Indígenas homologadas. O critério de elegibilidade para a redução da Reserva Legal (RL) de 80% para 50% foi aplicado seguindo a diretriz de que o Estado deve possuir Zoneamento Ecológico-Econômico (ZEE) aprovado e mais de 65% de seu território ocupado por áreas protegidas. Esta regra fundamenta-se no Art. 12, § 5º, da Lei nº 12.651/2012, que rege a proteção da vegetação nativa no território nacional.</w:t>
+      </w:r>
+    </w:p>
+    <w:p>
+      <w:pPr>
+        <w:spacing w:before="240" w:line="360" w:lineRule="auto"/>
+        <w:jc w:val="both"/>
+        <w:rPr>
+          <w:rFonts w:ascii="Times New Roman" w:hAnsi="Times New Roman" w:cs="Times New Roman"/>
+        </w:rPr>
+      </w:pPr>
+      <w:r>
+        <w:rPr>
+          <w:rFonts w:ascii="Times New Roman" w:hAnsi="Times New Roman" w:cs="Times New Roman"/>
+          <w:b/>
+          <w:bCs/>
+        </w:rPr>
+        <w:t>3.4.2 Cálculo de passivos e impacto regulatório</w:t>
+      </w:r>
+    </w:p>
+    <w:p>
+      <w:pPr>
+        <w:spacing w:after="0" w:line="360" w:lineRule="auto"/>
+        <w:ind w:firstLine="709"/>
+        <w:jc w:val="both"/>
+        <w:rPr>
+          <w:rFonts w:ascii="Times New Roman" w:hAnsi="Times New Roman" w:cs="Times New Roman"/>
+        </w:rPr>
+      </w:pPr>
+      <w:r>
+        <w:rPr>
+          <w:rFonts w:ascii="Times New Roman" w:hAnsi="Times New Roman" w:cs="Times New Roman"/>
+        </w:rPr>
+        <w:t>Foram modelados dois cenários de déficit para cada imóvel elegível, permitindo a comparação direta do impacto normativo. A lógica de cálculo seguiu as seguintes definições:</w:t>
+      </w:r>
+    </w:p>
+    <w:p>
+      <w:pPr>
+        <w:spacing w:after="0" w:line="360" w:lineRule="auto"/>
+        <w:ind w:left="993" w:hanging="284"/>
+        <w:jc w:val="both"/>
+        <w:rPr>
+          <w:rFonts w:ascii="Times New Roman" w:hAnsi="Times New Roman" w:cs="Times New Roman"/>
+        </w:rPr>
+      </w:pPr>
+      <w:r>
+        <w:rPr>
+          <w:rFonts w:ascii="Times New Roman" w:hAnsi="Times New Roman" w:cs="Times New Roman"/>
+        </w:rPr>
+        <w:t>a) cenário base (80%): representa a exigência padrão para áreas de floresta na Amazônia Legal;</w:t>
+      </w:r>
+    </w:p>
+    <w:p>
+      <w:pPr>
+        <w:spacing w:after="0" w:line="360" w:lineRule="auto"/>
+        <w:ind w:left="993" w:hanging="284"/>
+        <w:jc w:val="both"/>
+        <w:rPr>
+          <w:rFonts w:ascii="Times New Roman" w:hAnsi="Times New Roman" w:cs="Times New Roman"/>
+        </w:rPr>
+      </w:pPr>
+      <w:r>
+        <w:rPr>
+          <w:rFonts w:ascii="Times New Roman" w:hAnsi="Times New Roman" w:cs="Times New Roman"/>
+        </w:rPr>
+        <w:t>b) cenário simulado (50%): aplicação da redução para imóveis situados em zonas de consolidação amparadas pelo ZEE estadual e pelo Decreto Federal de 2013;</w:t>
+      </w:r>
+    </w:p>
+    <w:p>
+      <w:pPr>
+        <w:spacing w:after="0" w:line="360" w:lineRule="auto"/>
+        <w:ind w:left="993" w:hanging="284"/>
+        <w:jc w:val="both"/>
+        <w:rPr>
+          <w:rFonts w:ascii="Times New Roman" w:hAnsi="Times New Roman" w:cs="Times New Roman"/>
+        </w:rPr>
+      </w:pPr>
+      <w:r>
+        <w:rPr>
+          <w:rFonts w:ascii="Times New Roman" w:hAnsi="Times New Roman" w:cs="Times New Roman"/>
+        </w:rPr>
+        <w:t>c) delta de regularização</w:t>
+      </w:r>
+      <w:r>
+        <w:rPr>
+          <w:rFonts w:ascii="Times New Roman" w:hAnsi="Times New Roman" w:cs="Times New Roman"/>
+        </w:rPr>
+        <w:t xml:space="preserve"> </w:t>
+      </w:r>
+      <m:oMath>
+        <m:sSub>
+          <m:sSubPr>
+            <m:ctrlPr>
+              <w:rPr>
+                <w:rFonts w:ascii="Cambria Math" w:hAnsi="Cambria Math" w:cs="Times New Roman"/>
+                <w:i/>
+              </w:rPr>
+            </m:ctrlPr>
+          </m:sSubPr>
+          <m:e>
+            <m:r>
+              <m:rPr>
+                <m:sty m:val="p"/>
+              </m:rPr>
+              <w:rPr>
+                <w:rFonts w:ascii="Cambria Math" w:hAnsi="Cambria Math" w:cs="Times New Roman"/>
+              </w:rPr>
+              <m:t>Δ</m:t>
+            </m:r>
+            <m:ctrlPr>
+              <w:rPr>
+                <w:rFonts w:ascii="Cambria Math" w:hAnsi="Cambria Math" w:cs="Times New Roman"/>
+              </w:rPr>
+            </m:ctrlPr>
+          </m:e>
+          <m:sub>
+            <m:r>
+              <w:rPr>
+                <w:rFonts w:ascii="Cambria Math" w:hAnsi="Cambria Math" w:cs="Times New Roman"/>
+              </w:rPr>
+              <m:t>reg</m:t>
+            </m:r>
+          </m:sub>
+        </m:sSub>
+      </m:oMath>
+      <w:r>
+        <w:rPr>
+          <w:rFonts w:ascii="Times New Roman" w:eastAsiaTheme="minorEastAsia" w:hAnsi="Times New Roman" w:cs="Times New Roman"/>
+        </w:rPr>
+        <w:t xml:space="preserve"> </w:t>
+      </w:r>
+      <w:r>
+        <w:rPr>
+          <w:rFonts w:ascii="Times New Roman" w:hAnsi="Times New Roman" w:cs="Times New Roman"/>
+        </w:rPr>
+        <w:t>: representa a extensão de área (em hectares) de passivo consolidado que deixa de ser exigida para recomposição ou compensação.</w:t>
+      </w:r>
+    </w:p>
+    <w:p>
+      <w:pPr>
+        <w:spacing w:after="0" w:line="360" w:lineRule="auto"/>
+        <w:ind w:firstLine="709"/>
+        <w:jc w:val="both"/>
+        <w:rPr>
+          <w:rFonts w:ascii="Times New Roman" w:hAnsi="Times New Roman" w:cs="Times New Roman"/>
+        </w:rPr>
+      </w:pPr>
+      <w:r>
+        <w:rPr>
+          <w:rFonts w:ascii="Times New Roman" w:hAnsi="Times New Roman" w:cs="Times New Roman"/>
+        </w:rPr>
+        <w:lastRenderedPageBreak/>
+        <w:t>O cálculo do delta de regularização é definido pela equação:</w:t>
+      </w:r>
+    </w:p>
+    <w:p>
+      <w:pPr>
+        <w:spacing w:before="240" w:line="360" w:lineRule="auto"/>
+        <w:jc w:val="both"/>
+        <w:rPr>
+          <w:rFonts w:ascii="Times New Roman" w:hAnsi="Times New Roman" w:cs="Times New Roman"/>
+        </w:rPr>
+      </w:pPr>
+      <m:oMathPara>
+        <m:oMath>
+          <m:sSub>
+            <m:sSubPr>
+              <m:ctrlPr>
+                <w:rPr>
+                  <w:rFonts w:ascii="Cambria Math" w:hAnsi="Cambria Math" w:cs="Times New Roman"/>
+                  <w:i/>
+                </w:rPr>
+              </m:ctrlPr>
+            </m:sSubPr>
+            <m:e>
+              <m:r>
+                <m:rPr>
+                  <m:sty m:val="p"/>
+                </m:rPr>
+                <w:rPr>
+                  <w:rFonts w:ascii="Cambria Math" w:hAnsi="Cambria Math" w:cs="Times New Roman"/>
+                </w:rPr>
+                <m:t>Δ</m:t>
+              </m:r>
+              <m:ctrlPr>
+                <w:rPr>
+                  <w:rFonts w:ascii="Cambria Math" w:hAnsi="Cambria Math" w:cs="Times New Roman"/>
+                </w:rPr>
+              </m:ctrlPr>
+            </m:e>
+            <m:sub>
+              <m:r>
+                <w:rPr>
+                  <w:rFonts w:ascii="Cambria Math" w:hAnsi="Cambria Math" w:cs="Times New Roman"/>
+                </w:rPr>
+                <m:t>reg</m:t>
+              </m:r>
+            </m:sub>
+          </m:sSub>
+          <m:r>
+            <w:rPr>
+              <w:rFonts w:ascii="Cambria Math" w:hAnsi="Cambria Math" w:cs="Times New Roman"/>
+            </w:rPr>
+            <m:t>=De</m:t>
+          </m:r>
+          <m:sSub>
+            <m:sSubPr>
+              <m:ctrlPr>
+                <w:rPr>
+                  <w:rFonts w:ascii="Cambria Math" w:hAnsi="Cambria Math" w:cs="Times New Roman"/>
+                  <w:i/>
+                </w:rPr>
+              </m:ctrlPr>
+            </m:sSubPr>
+            <m:e>
+              <m:r>
+                <w:rPr>
+                  <w:rFonts w:ascii="Cambria Math" w:hAnsi="Cambria Math" w:cs="Times New Roman"/>
+                </w:rPr>
+                <m:t>f</m:t>
+              </m:r>
+            </m:e>
+            <m:sub>
+              <m:r>
+                <w:rPr>
+                  <w:rFonts w:ascii="Cambria Math" w:hAnsi="Cambria Math" w:cs="Times New Roman"/>
+                </w:rPr>
+                <m:t>80</m:t>
+              </m:r>
+            </m:sub>
+          </m:sSub>
+          <m:r>
+            <w:rPr>
+              <w:rFonts w:ascii="Cambria Math" w:hAnsi="Cambria Math" w:cs="Times New Roman"/>
+            </w:rPr>
+            <m:t>-De</m:t>
+          </m:r>
+          <m:sSub>
+            <m:sSubPr>
+              <m:ctrlPr>
+                <w:rPr>
+                  <w:rFonts w:ascii="Cambria Math" w:hAnsi="Cambria Math" w:cs="Times New Roman"/>
+                  <w:i/>
+                </w:rPr>
+              </m:ctrlPr>
+            </m:sSubPr>
+            <m:e>
+              <m:r>
+                <w:rPr>
+                  <w:rFonts w:ascii="Cambria Math" w:hAnsi="Cambria Math" w:cs="Times New Roman"/>
+                </w:rPr>
+                <m:t>f</m:t>
+              </m:r>
+            </m:e>
+            <m:sub>
+              <m:r>
+                <w:rPr>
+                  <w:rFonts w:ascii="Cambria Math" w:hAnsi="Cambria Math" w:cs="Times New Roman"/>
+                </w:rPr>
+                <m:t>50</m:t>
+              </m:r>
+            </m:sub>
+          </m:sSub>
+        </m:oMath>
+      </m:oMathPara>
+    </w:p>
+    <w:p>
+      <w:pPr>
+        <w:spacing w:after="0" w:line="360" w:lineRule="auto"/>
+        <w:ind w:firstLine="709"/>
+        <w:jc w:val="both"/>
+        <w:rPr>
+          <w:rFonts w:ascii="Times New Roman" w:hAnsi="Times New Roman" w:cs="Times New Roman"/>
+        </w:rPr>
+      </w:pPr>
+      <w:r>
+        <w:rPr>
+          <w:rFonts w:ascii="Times New Roman" w:hAnsi="Times New Roman" w:cs="Times New Roman"/>
+        </w:rPr>
+        <w:t xml:space="preserve">Onde </w:t>
+      </w:r>
+      <m:oMath>
         <m:r>
-          <m:rPr>
-            <m:sty m:val="p"/>
-          </m:rPr>
           <w:rPr>
             <w:rFonts w:ascii="Cambria Math" w:hAnsi="Cambria Math" w:cs="Times New Roman"/>
           </w:rPr>
-          <m:t xml:space="preserve"> </m:t>
+          <m:t>De</m:t>
+        </m:r>
+        <m:sSub>
+          <m:sSubPr>
+            <m:ctrlPr>
+              <w:rPr>
+                <w:rFonts w:ascii="Cambria Math" w:hAnsi="Cambria Math" w:cs="Times New Roman"/>
+                <w:i/>
+              </w:rPr>
+            </m:ctrlPr>
+          </m:sSubPr>
+          <m:e>
+            <m:r>
+              <w:rPr>
+                <w:rFonts w:ascii="Cambria Math" w:hAnsi="Cambria Math" w:cs="Times New Roman"/>
+              </w:rPr>
+              <m:t>f</m:t>
+            </m:r>
+          </m:e>
+          <m:sub>
+            <m:r>
+              <w:rPr>
+                <w:rFonts w:ascii="Cambria Math" w:hAnsi="Cambria Math" w:cs="Times New Roman"/>
+              </w:rPr>
+              <m:t>80</m:t>
+            </m:r>
+          </m:sub>
+        </m:sSub>
+      </m:oMath>
+      <w:r>
+        <w:rPr>
+          <w:rFonts w:ascii="Times New Roman" w:hAnsi="Times New Roman" w:cs="Times New Roman"/>
+        </w:rPr>
+        <w:t xml:space="preserve"> consiste no déficit calculado sobre a exigência de 80% e </w:t>
+      </w:r>
+      <m:oMath>
+        <m:r>
+          <w:rPr>
+            <w:rFonts w:ascii="Cambria Math" w:hAnsi="Cambria Math" w:cs="Times New Roman"/>
+          </w:rPr>
+          <m:t>De</m:t>
+        </m:r>
+        <m:sSub>
+          <m:sSubPr>
+            <m:ctrlPr>
+              <w:rPr>
+                <w:rFonts w:ascii="Cambria Math" w:hAnsi="Cambria Math" w:cs="Times New Roman"/>
+                <w:i/>
+              </w:rPr>
+            </m:ctrlPr>
+          </m:sSubPr>
+          <m:e>
+            <m:r>
+              <w:rPr>
+                <w:rFonts w:ascii="Cambria Math" w:hAnsi="Cambria Math" w:cs="Times New Roman"/>
+              </w:rPr>
+              <m:t>f</m:t>
+            </m:r>
+          </m:e>
+          <m:sub>
+            <m:r>
+              <w:rPr>
+                <w:rFonts w:ascii="Cambria Math" w:hAnsi="Cambria Math" w:cs="Times New Roman"/>
+              </w:rPr>
+              <m:t>50</m:t>
+            </m:r>
+          </m:sub>
+        </m:sSub>
+      </m:oMath>
+      <w:r>
+        <w:rPr>
+          <w:rFonts w:ascii="Times New Roman" w:hAnsi="Times New Roman" w:cs="Times New Roman"/>
+        </w:rPr>
+        <w:t xml:space="preserve"> </w:t>
+      </w:r>
+      <w:r>
+        <w:rPr>
+          <w:rFonts w:ascii="Times New Roman" w:hAnsi="Times New Roman" w:cs="Times New Roman"/>
+        </w:rPr>
+        <w:t>o déficit sob a exigência reduzida. Adicionalmente, isolou-se o Passivo Não Consolidado, referente a supressões de vegetação nativa ocorridas após 22 de julho de 2008, as quais não são passíveis de redução ou regularização simplificada conforme a legislação vigente.</w:t>
+      </w:r>
+    </w:p>
+    <w:p>
+      <w:pPr>
+        <w:spacing w:before="240" w:line="360" w:lineRule="auto"/>
+        <w:jc w:val="both"/>
+        <w:rPr>
+          <w:rFonts w:ascii="Times New Roman" w:hAnsi="Times New Roman" w:cs="Times New Roman"/>
+        </w:rPr>
+      </w:pPr>
+      <w:r>
+        <w:rPr>
+          <w:rFonts w:ascii="Times New Roman" w:hAnsi="Times New Roman" w:cs="Times New Roman"/>
+          <w:b/>
+          <w:bCs/>
+        </w:rPr>
+        <w:t>3.4.3 Sumarização e visualização de dados</w:t>
+      </w:r>
+    </w:p>
+    <w:p>
+      <w:pPr>
+        <w:spacing w:after="0" w:line="360" w:lineRule="auto"/>
+        <w:ind w:firstLine="709"/>
+        <w:jc w:val="both"/>
+        <w:rPr>
+          <w:rFonts w:ascii="Times New Roman" w:hAnsi="Times New Roman" w:cs="Times New Roman"/>
+        </w:rPr>
+      </w:pPr>
+      <w:r>
+        <w:rPr>
+          <w:rFonts w:ascii="Times New Roman" w:hAnsi="Times New Roman" w:cs="Times New Roman"/>
+        </w:rPr>
+        <w:t xml:space="preserve">Os dados resultantes foram agregados em nível estadual e municipal para identificar o </w:t>
+      </w:r>
+      <w:r>
+        <w:rPr>
+          <w:rFonts w:ascii="Times New Roman" w:hAnsi="Times New Roman" w:cs="Times New Roman"/>
+          <w:i/>
+          <w:iCs/>
+        </w:rPr>
+        <w:t>ranking</w:t>
+      </w:r>
+      <w:r>
+        <w:rPr>
+          <w:rFonts w:ascii="Times New Roman" w:hAnsi="Times New Roman" w:cs="Times New Roman"/>
+        </w:rPr>
+        <w:t xml:space="preserve"> de municípios mais impactados pela medida. Para a apresentação dos resultados, geraram-se gráficos de colunas e barras utilizando a biblioteca </w:t>
+      </w:r>
+      <w:r>
+        <w:rPr>
+          <w:rFonts w:ascii="Times New Roman" w:hAnsi="Times New Roman" w:cs="Times New Roman"/>
+          <w:i/>
+          <w:iCs/>
+        </w:rPr>
+        <w:t>ggplot2</w:t>
+      </w:r>
+      <w:r>
+        <w:rPr>
+          <w:rFonts w:ascii="Times New Roman" w:hAnsi="Times New Roman" w:cs="Times New Roman"/>
+        </w:rPr>
+        <w:t>, permitindo a comparação visual entre o déficit atual e o potencial de redução. Esta etapa possibilita identificar comportamentos distintos em municípios com vasta extensão de áreas protegidas, como Altamira e São Félix do Xingu, conforme os dados processados.</w:t>
+      </w:r>
+    </w:p>
+    <w:p>
+      <w:pPr>
+        <w:spacing w:before="240" w:line="360" w:lineRule="auto"/>
+        <w:jc w:val="both"/>
+        <w:rPr>
+          <w:rFonts w:ascii="Times New Roman" w:hAnsi="Times New Roman" w:cs="Times New Roman"/>
+        </w:rPr>
+      </w:pPr>
+      <w:r>
+        <w:rPr>
+          <w:rFonts w:ascii="Times New Roman" w:hAnsi="Times New Roman" w:cs="Times New Roman"/>
+        </w:rPr>
+        <w:t>3.5 INTEGRAÇÃO GEOESPACIAL E REPRESENTAÇÃO CARTOGRÁFICA</w:t>
+      </w:r>
+    </w:p>
+    <w:p>
+      <w:pPr>
+        <w:spacing w:after="0" w:line="360" w:lineRule="auto"/>
+        <w:ind w:firstLine="709"/>
+        <w:jc w:val="both"/>
+        <w:rPr>
+          <w:rFonts w:ascii="Times New Roman" w:hAnsi="Times New Roman" w:cs="Times New Roman"/>
+        </w:rPr>
+      </w:pPr>
+      <w:r>
+        <w:rPr>
+          <w:rFonts w:ascii="Times New Roman" w:hAnsi="Times New Roman" w:cs="Times New Roman"/>
+        </w:rPr>
+        <w:t xml:space="preserve">Para a espacialização dos resultados e análise do impacto territorial, os dados consolidados no ambiente R foram exportados e integrados ao </w:t>
+      </w:r>
+      <w:r>
+        <w:rPr>
+          <w:rFonts w:ascii="Times New Roman" w:hAnsi="Times New Roman" w:cs="Times New Roman"/>
+          <w:i/>
+          <w:iCs/>
+        </w:rPr>
+        <w:t>software</w:t>
+      </w:r>
+      <w:r>
+        <w:rPr>
+          <w:rFonts w:ascii="Times New Roman" w:hAnsi="Times New Roman" w:cs="Times New Roman"/>
+        </w:rPr>
+        <w:t xml:space="preserve"> QGIS, versão 4.0 </w:t>
+      </w:r>
+      <w:r>
+        <w:rPr>
+          <w:rFonts w:ascii="Times New Roman" w:hAnsi="Times New Roman" w:cs="Times New Roman"/>
+          <w:i/>
+          <w:iCs/>
+        </w:rPr>
+        <w:t>Norrköping</w:t>
+      </w:r>
+      <w:r>
+        <w:rPr>
+          <w:rFonts w:ascii="Times New Roman" w:hAnsi="Times New Roman" w:cs="Times New Roman"/>
+        </w:rPr>
+        <w:t>. O fluxo cartográfico utilizou a malha municipal digital do Estado do Pará, na escala 1:250.000, como base para operações de união (</w:t>
+      </w:r>
+      <w:r>
+        <w:rPr>
+          <w:rFonts w:ascii="Times New Roman" w:hAnsi="Times New Roman" w:cs="Times New Roman"/>
+          <w:i/>
+          <w:iCs/>
+        </w:rPr>
+        <w:t>join</w:t>
+      </w:r>
+      <w:r>
+        <w:rPr>
+          <w:rFonts w:ascii="Times New Roman" w:hAnsi="Times New Roman" w:cs="Times New Roman"/>
+        </w:rPr>
+        <w:t>) vetorial, utilizando o geocódigo dos municípios como chave primária. A representação espacial foi estruturada em dois eixos fundamentais:</w:t>
+      </w:r>
+    </w:p>
+    <w:p>
+      <w:pPr>
+        <w:spacing w:after="0" w:line="360" w:lineRule="auto"/>
+        <w:ind w:firstLine="709"/>
+        <w:jc w:val="both"/>
+        <w:rPr>
+          <w:rFonts w:ascii="Times New Roman" w:hAnsi="Times New Roman" w:cs="Times New Roman"/>
+        </w:rPr>
+      </w:pPr>
+      <w:r>
+        <w:rPr>
+          <w:rFonts w:ascii="Times New Roman" w:hAnsi="Times New Roman" w:cs="Times New Roman"/>
+        </w:rPr>
+        <w:t>a) mapeamento de elegibilidade (Art. 12): identificação geoespacial dos municípios aptos à redução da Reserva Legal, baseada no cruzamento entre a área total municipal e a extensão de áreas protegidas, compreendendo Unidades de Conservação de domínio público e Terras Indígenas homologadas;</w:t>
+      </w:r>
+    </w:p>
+    <w:p>
+      <w:pPr>
+        <w:spacing w:after="0" w:line="360" w:lineRule="auto"/>
+        <w:ind w:firstLine="709"/>
+        <w:jc w:val="both"/>
+        <w:rPr>
+          <w:rFonts w:ascii="Times New Roman" w:hAnsi="Times New Roman" w:cs="Times New Roman"/>
+        </w:rPr>
+      </w:pPr>
+      <w:r>
+        <w:rPr>
+          <w:rFonts w:ascii="Times New Roman" w:hAnsi="Times New Roman" w:cs="Times New Roman"/>
+        </w:rPr>
+        <w:t>b) mapeamento do impacto da regularização</w:t>
+      </w:r>
+      <w:r>
+        <w:rPr>
+          <w:rFonts w:ascii="Times New Roman" w:hAnsi="Times New Roman" w:cs="Times New Roman"/>
+        </w:rPr>
+        <w:t xml:space="preserve"> (</w:t>
+      </w:r>
+      <m:oMath>
+        <m:sSub>
+          <m:sSubPr>
+            <m:ctrlPr>
+              <w:rPr>
+                <w:rFonts w:ascii="Cambria Math" w:hAnsi="Cambria Math" w:cs="Times New Roman"/>
+                <w:i/>
+              </w:rPr>
+            </m:ctrlPr>
+          </m:sSubPr>
+          <m:e>
+            <m:r>
+              <m:rPr>
+                <m:sty m:val="p"/>
+              </m:rPr>
+              <w:rPr>
+                <w:rFonts w:ascii="Cambria Math" w:hAnsi="Cambria Math" w:cs="Times New Roman"/>
+              </w:rPr>
+              <m:t>Δ</m:t>
+            </m:r>
+            <m:ctrlPr>
+              <w:rPr>
+                <w:rFonts w:ascii="Cambria Math" w:hAnsi="Cambria Math" w:cs="Times New Roman"/>
+              </w:rPr>
+            </m:ctrlPr>
+          </m:e>
+          <m:sub>
+            <m:r>
+              <w:rPr>
+                <w:rFonts w:ascii="Cambria Math" w:hAnsi="Cambria Math" w:cs="Times New Roman"/>
+              </w:rPr>
+              <m:t>reg</m:t>
+            </m:r>
+          </m:sub>
+        </m:sSub>
+        <m:r>
+          <w:rPr>
+            <w:rFonts w:ascii="Cambria Math" w:hAnsi="Cambria Math" w:cs="Times New Roman"/>
+          </w:rPr>
+          <m:t>)</m:t>
         </m:r>
       </m:oMath>
       <w:r>
         <w:rPr>
           <w:rFonts w:ascii="Times New Roman" w:hAnsi="Times New Roman" w:cs="Times New Roman"/>
         </w:rPr>
-        <w:t>quantifica a extensão de terras que deixam de ser computadas como déficit ambiental oneroso no cenário de redução para 50%, permitindo a regularização do imóvel via Plano de Recuperação Ambiental (PRA) sem a necessidade de recomposição de áreas consolidadas além do novo limite legal. Os resultados finais foram consolidados em tabelas de dados exportadas em formato CSV para análise estatística, integrando todas as variáveis espaciais e normativas processadas. Os scripts utilizados para este processamento estão disponíveis para replicação técnica no repositório do projeto:</w:t>
-      </w:r>
-      <w:r>
-        <w:rPr>
-          <w:rFonts w:ascii="Times New Roman" w:hAnsi="Times New Roman" w:cs="Times New Roman"/>
-          <w:color w:val="EE0000"/>
-        </w:rPr>
-        <w:t xml:space="preserve"> [LINK DO REPOSITÓRIO].</w:t>
-      </w:r>
-    </w:p>
-    <w:p>
-      <w:pPr>
-        <w:spacing w:before="240"/>
+        <w:t>: elaboração de mapas coropléticos para demonstrar a concentração espacial do passivo ambiental que deixa de ser exigido sob o cenário simulado de 50%.</w:t>
+      </w:r>
+    </w:p>
+    <w:p>
+      <w:pPr>
+        <w:spacing w:after="0" w:line="360" w:lineRule="auto"/>
+        <w:ind w:firstLine="709"/>
+        <w:jc w:val="both"/>
+        <w:rPr>
+          <w:rFonts w:ascii="Times New Roman" w:hAnsi="Times New Roman" w:cs="Times New Roman"/>
+        </w:rPr>
+      </w:pPr>
+      <w:r>
+        <w:rPr>
+          <w:rFonts w:ascii="Times New Roman" w:hAnsi="Times New Roman" w:cs="Times New Roman"/>
+        </w:rPr>
+        <w:t xml:space="preserve">Para garantir o rigor científico quanto ao marco temporal da legislação, todos os cruzamentos espaciais foram validados utilizando a série histórica de cobertura e uso da terra do MapBiomas, Coleção 9. Este procedimento assegurou que o cálculo do delta de </w:t>
+      </w:r>
+      <w:r>
+        <w:rPr>
+          <w:rFonts w:ascii="Times New Roman" w:hAnsi="Times New Roman" w:cs="Times New Roman"/>
+        </w:rPr>
+        <w:lastRenderedPageBreak/>
+        <w:t xml:space="preserve">regularização </w:t>
+      </w:r>
+      <w:r>
+        <w:rPr>
+          <w:rFonts w:ascii="Times New Roman" w:hAnsi="Times New Roman" w:cs="Times New Roman"/>
+        </w:rPr>
+        <w:t>(</w:t>
+      </w:r>
+      <m:oMath>
+        <m:sSub>
+          <m:sSubPr>
+            <m:ctrlPr>
+              <w:rPr>
+                <w:rFonts w:ascii="Cambria Math" w:hAnsi="Cambria Math" w:cs="Times New Roman"/>
+                <w:i/>
+              </w:rPr>
+            </m:ctrlPr>
+          </m:sSubPr>
+          <m:e>
+            <m:r>
+              <m:rPr>
+                <m:sty m:val="p"/>
+              </m:rPr>
+              <w:rPr>
+                <w:rFonts w:ascii="Cambria Math" w:hAnsi="Cambria Math" w:cs="Times New Roman"/>
+              </w:rPr>
+              <m:t>Δ</m:t>
+            </m:r>
+            <m:ctrlPr>
+              <w:rPr>
+                <w:rFonts w:ascii="Cambria Math" w:hAnsi="Cambria Math" w:cs="Times New Roman"/>
+              </w:rPr>
+            </m:ctrlPr>
+          </m:e>
+          <m:sub>
+            <m:r>
+              <w:rPr>
+                <w:rFonts w:ascii="Cambria Math" w:hAnsi="Cambria Math" w:cs="Times New Roman"/>
+              </w:rPr>
+              <m:t>reg</m:t>
+            </m:r>
+          </m:sub>
+        </m:sSub>
+        <m:r>
+          <w:rPr>
+            <w:rFonts w:ascii="Cambria Math" w:hAnsi="Cambria Math" w:cs="Times New Roman"/>
+          </w:rPr>
+          <m:t>)</m:t>
+        </m:r>
+      </m:oMath>
+      <w:r>
+        <w:rPr>
+          <w:rFonts w:ascii="Times New Roman" w:hAnsi="Times New Roman" w:cs="Times New Roman"/>
+        </w:rPr>
+        <w:t xml:space="preserve"> e do passivo não consolidado refletisse com precisão a dinâmica de supressão de vegetação nativa pré e pós-22 de julho de 2008, segregando anistias legais de novos passivos ambientais.</w:t>
+      </w:r>
+    </w:p>
+    <w:p>
+      <w:pPr>
+        <w:spacing w:before="240" w:line="360" w:lineRule="auto"/>
         <w:jc w:val="both"/>
         <w:rPr>
           <w:rFonts w:ascii="Times New Roman" w:hAnsi="Times New Roman" w:cs="Times New Roman"/>
@@ -3440,7 +4198,7 @@
     </w:p>
     <w:p>
       <w:pPr>
-        <w:spacing w:before="240"/>
+        <w:spacing w:before="240" w:line="360" w:lineRule="auto"/>
         <w:jc w:val="both"/>
         <w:rPr>
           <w:rFonts w:ascii="Times New Roman" w:hAnsi="Times New Roman" w:cs="Times New Roman"/>
@@ -3455,7 +4213,7 @@
     </w:p>
     <w:p>
       <w:pPr>
-        <w:spacing w:before="240"/>
+        <w:spacing w:before="240" w:line="360" w:lineRule="auto"/>
         <w:jc w:val="both"/>
         <w:rPr>
           <w:rFonts w:ascii="Times New Roman" w:hAnsi="Times New Roman" w:cs="Times New Roman"/>
@@ -3470,7 +4228,7 @@
     </w:p>
     <w:p>
       <w:pPr>
-        <w:spacing w:before="240"/>
+        <w:spacing w:before="240" w:line="360" w:lineRule="auto"/>
         <w:jc w:val="both"/>
         <w:rPr>
           <w:rFonts w:ascii="Times New Roman" w:hAnsi="Times New Roman" w:cs="Times New Roman"/>
@@ -3485,7 +4243,7 @@
     </w:p>
     <w:p>
       <w:pPr>
-        <w:spacing w:before="240"/>
+        <w:spacing w:before="240" w:line="360" w:lineRule="auto"/>
         <w:jc w:val="both"/>
         <w:rPr>
           <w:rFonts w:ascii="Times New Roman" w:hAnsi="Times New Roman" w:cs="Times New Roman"/>
@@ -3500,7 +4258,7 @@
     </w:p>
     <w:p>
       <w:pPr>
-        <w:spacing w:before="240"/>
+        <w:spacing w:before="240" w:line="360" w:lineRule="auto"/>
         <w:jc w:val="both"/>
         <w:rPr>
           <w:rFonts w:ascii="Times New Roman" w:hAnsi="Times New Roman" w:cs="Times New Roman"/>
@@ -3517,7 +4275,7 @@
     </w:p>
     <w:p>
       <w:pPr>
-        <w:spacing w:before="240"/>
+        <w:spacing w:before="240" w:line="360" w:lineRule="auto"/>
         <w:jc w:val="both"/>
         <w:rPr>
           <w:rFonts w:ascii="Times New Roman" w:hAnsi="Times New Roman" w:cs="Times New Roman"/>
@@ -3534,16 +4292,17 @@
     </w:p>
     <w:p>
       <w:pPr>
-        <w:jc w:val="both"/>
-        <w:rPr>
-          <w:rFonts w:ascii="Times New Roman" w:hAnsi="Times New Roman" w:cs="Times New Roman"/>
-        </w:rPr>
-      </w:pPr>
-      <w:r>
-        <w:rPr>
-          <w:rFonts w:ascii="Times New Roman" w:hAnsi="Times New Roman" w:cs="Times New Roman"/>
-        </w:rPr>
-        <w:t xml:space="preserve">ALMEIDA, Claudio Aparecido de et al. </w:t>
+        <w:spacing w:line="360" w:lineRule="auto"/>
+        <w:jc w:val="both"/>
+        <w:rPr>
+          <w:rFonts w:ascii="Times New Roman" w:hAnsi="Times New Roman" w:cs="Times New Roman"/>
+        </w:rPr>
+      </w:pPr>
+      <w:r>
+        <w:rPr>
+          <w:rFonts w:ascii="Times New Roman" w:hAnsi="Times New Roman" w:cs="Times New Roman"/>
+        </w:rPr>
+        <w:t xml:space="preserve">ALMEIDA, C. A. de et al. </w:t>
       </w:r>
       <w:r>
         <w:rPr>
@@ -3562,6 +4321,7 @@
     </w:p>
     <w:p>
       <w:pPr>
+        <w:spacing w:line="360" w:lineRule="auto"/>
         <w:jc w:val="both"/>
         <w:rPr>
           <w:rFonts w:ascii="Times New Roman" w:hAnsi="Times New Roman" w:cs="Times New Roman"/>
@@ -3590,6 +4350,7 @@
     </w:p>
     <w:p>
       <w:pPr>
+        <w:spacing w:line="360" w:lineRule="auto"/>
         <w:jc w:val="both"/>
         <w:rPr>
           <w:rFonts w:ascii="Times New Roman" w:hAnsi="Times New Roman" w:cs="Times New Roman"/>
@@ -3618,6 +4379,7 @@
     </w:p>
     <w:p>
       <w:pPr>
+        <w:spacing w:line="360" w:lineRule="auto"/>
         <w:jc w:val="both"/>
         <w:rPr>
           <w:rFonts w:ascii="Times New Roman" w:hAnsi="Times New Roman" w:cs="Times New Roman"/>
@@ -3646,6 +4408,7 @@
     </w:p>
     <w:p>
       <w:pPr>
+        <w:spacing w:line="360" w:lineRule="auto"/>
         <w:jc w:val="both"/>
         <w:rPr>
           <w:rFonts w:ascii="Times New Roman" w:hAnsi="Times New Roman" w:cs="Times New Roman"/>
@@ -3674,6 +4437,7 @@
     </w:p>
     <w:p>
       <w:pPr>
+        <w:spacing w:line="360" w:lineRule="auto"/>
         <w:jc w:val="both"/>
         <w:rPr>
           <w:rFonts w:ascii="Times New Roman" w:hAnsi="Times New Roman" w:cs="Times New Roman"/>
@@ -3700,7 +4464,7 @@
         </w:rPr>
         <w:t xml:space="preserve">. Dispõe sobre a regulamentação dos dispositivos constitucionais relativos à reforma agrária, previstos no Capítulo III, Título VII, da Constituição Federal. Brasília, DF: Presidência da República, [1993]. Disponível em: </w:t>
       </w:r>
-      <w:hyperlink r:id="rId5" w:tgtFrame="_blank" w:history="1">
+      <w:hyperlink r:id="rId6" w:tgtFrame="_blank" w:history="1">
         <w:r>
           <w:rPr>
             <w:rStyle w:val="Hyperlink"/>
@@ -3718,6 +4482,7 @@
     </w:p>
     <w:p>
       <w:pPr>
+        <w:spacing w:line="360" w:lineRule="auto"/>
         <w:jc w:val="both"/>
         <w:rPr>
           <w:rFonts w:ascii="Times New Roman" w:hAnsi="Times New Roman" w:cs="Times New Roman"/>
@@ -3746,16 +4511,17 @@
     </w:p>
     <w:p>
       <w:pPr>
-        <w:jc w:val="both"/>
-        <w:rPr>
-          <w:rFonts w:ascii="Times New Roman" w:hAnsi="Times New Roman" w:cs="Times New Roman"/>
-        </w:rPr>
-      </w:pPr>
-      <w:r>
-        <w:rPr>
-          <w:rFonts w:ascii="Times New Roman" w:hAnsi="Times New Roman" w:cs="Times New Roman"/>
-        </w:rPr>
-        <w:t xml:space="preserve">FELIPPE, Daíse de; TRENTINI, Flávia. </w:t>
+        <w:spacing w:line="360" w:lineRule="auto"/>
+        <w:jc w:val="both"/>
+        <w:rPr>
+          <w:rFonts w:ascii="Times New Roman" w:hAnsi="Times New Roman" w:cs="Times New Roman"/>
+        </w:rPr>
+      </w:pPr>
+      <w:r>
+        <w:rPr>
+          <w:rFonts w:ascii="Times New Roman" w:hAnsi="Times New Roman" w:cs="Times New Roman"/>
+        </w:rPr>
+        <w:t xml:space="preserve">FELIPPE, D. de; TRENTINI, F. O conceito de área rural consolidada no Código Florestal de 2012: principais controvérsias. </w:t>
       </w:r>
       <w:r>
         <w:rPr>
@@ -3763,18 +4529,6 @@
           <w:b/>
           <w:bCs/>
         </w:rPr>
-        <w:t>O conceito de área rural consolidada no Código Florestal de 2012:</w:t>
-      </w:r>
-      <w:r>
-        <w:rPr>
-          <w:rFonts w:ascii="Times New Roman" w:hAnsi="Times New Roman" w:cs="Times New Roman"/>
-        </w:rPr>
-        <w:t xml:space="preserve"> principais controvérsias. </w:t>
-      </w:r>
-      <w:r>
-        <w:rPr>
-          <w:rFonts w:ascii="Times New Roman" w:hAnsi="Times New Roman" w:cs="Times New Roman"/>
-        </w:rPr>
         <w:t>Revista de Direito Agrário e Agroambiental</w:t>
       </w:r>
       <w:r>
@@ -3786,6 +4540,7 @@
     </w:p>
     <w:p>
       <w:pPr>
+        <w:spacing w:line="360" w:lineRule="auto"/>
         <w:jc w:val="both"/>
         <w:rPr>
           <w:rFonts w:ascii="Times New Roman" w:hAnsi="Times New Roman" w:cs="Times New Roman"/>
@@ -3814,6 +4569,7 @@
     </w:p>
     <w:p>
       <w:pPr>
+        <w:spacing w:line="360" w:lineRule="auto"/>
         <w:jc w:val="both"/>
         <w:rPr>
           <w:rFonts w:ascii="Times New Roman" w:hAnsi="Times New Roman" w:cs="Times New Roman"/>
@@ -3842,6 +4598,7 @@
     </w:p>
     <w:p>
       <w:pPr>
+        <w:spacing w:line="360" w:lineRule="auto"/>
         <w:jc w:val="both"/>
         <w:rPr>
           <w:rFonts w:ascii="Times New Roman" w:hAnsi="Times New Roman" w:cs="Times New Roman"/>
@@ -3870,6 +4627,7 @@
     </w:p>
     <w:p>
       <w:pPr>
+        <w:spacing w:line="360" w:lineRule="auto"/>
         <w:jc w:val="both"/>
         <w:rPr>
           <w:rFonts w:ascii="Times New Roman" w:hAnsi="Times New Roman" w:cs="Times New Roman"/>
@@ -3898,6 +4656,7 @@
     </w:p>
     <w:p>
       <w:pPr>
+        <w:spacing w:line="360" w:lineRule="auto"/>
         <w:jc w:val="both"/>
         <w:rPr>
           <w:rFonts w:ascii="Times New Roman" w:hAnsi="Times New Roman" w:cs="Times New Roman"/>
@@ -3926,6 +4685,7 @@
     </w:p>
     <w:p>
       <w:pPr>
+        <w:spacing w:line="360" w:lineRule="auto"/>
         <w:jc w:val="both"/>
         <w:rPr>
           <w:rFonts w:ascii="Times New Roman" w:hAnsi="Times New Roman" w:cs="Times New Roman"/>
@@ -3954,15 +4714,17 @@
     </w:p>
     <w:p>
       <w:pPr>
-        <w:jc w:val="both"/>
-        <w:rPr>
-          <w:rFonts w:ascii="Times New Roman" w:hAnsi="Times New Roman" w:cs="Times New Roman"/>
-        </w:rPr>
-      </w:pPr>
-      <w:r>
-        <w:rPr>
-          <w:rFonts w:ascii="Times New Roman" w:hAnsi="Times New Roman" w:cs="Times New Roman"/>
-        </w:rPr>
+        <w:spacing w:line="360" w:lineRule="auto"/>
+        <w:jc w:val="both"/>
+        <w:rPr>
+          <w:rFonts w:ascii="Times New Roman" w:hAnsi="Times New Roman" w:cs="Times New Roman"/>
+        </w:rPr>
+      </w:pPr>
+      <w:r>
+        <w:rPr>
+          <w:rFonts w:ascii="Times New Roman" w:hAnsi="Times New Roman" w:cs="Times New Roman"/>
+        </w:rPr>
+        <w:lastRenderedPageBreak/>
         <w:t xml:space="preserve">PARÁ. Secretaria de Estado de Meio Ambiente e Sustentabilidade. </w:t>
       </w:r>
       <w:r>
@@ -3982,16 +4744,17 @@
     </w:p>
     <w:p>
       <w:pPr>
-        <w:jc w:val="both"/>
-        <w:rPr>
-          <w:rFonts w:ascii="Times New Roman" w:hAnsi="Times New Roman" w:cs="Times New Roman"/>
-        </w:rPr>
-      </w:pPr>
-      <w:r>
-        <w:rPr>
-          <w:rFonts w:ascii="Times New Roman" w:hAnsi="Times New Roman" w:cs="Times New Roman"/>
-        </w:rPr>
-        <w:t xml:space="preserve">PORTO, Antônio José Maristrello; SANTOS, Laura Meneghel dos. Cotas de reserva ambiental: uma interpretação da análise econômica do direito. </w:t>
+        <w:spacing w:line="360" w:lineRule="auto"/>
+        <w:jc w:val="both"/>
+        <w:rPr>
+          <w:rFonts w:ascii="Times New Roman" w:hAnsi="Times New Roman" w:cs="Times New Roman"/>
+        </w:rPr>
+      </w:pPr>
+      <w:r>
+        <w:rPr>
+          <w:rFonts w:ascii="Times New Roman" w:hAnsi="Times New Roman" w:cs="Times New Roman"/>
+        </w:rPr>
+        <w:t xml:space="preserve">PORTO, A. J. M.; SANTOS, L. M. dos. Cotas de reserva ambiental: uma interpretação da análise econômica do direito. </w:t>
       </w:r>
       <w:r>
         <w:rPr>
@@ -4010,16 +4773,16 @@
     </w:p>
     <w:p>
       <w:pPr>
-        <w:jc w:val="both"/>
-        <w:rPr>
-          <w:rFonts w:ascii="Times New Roman" w:hAnsi="Times New Roman" w:cs="Times New Roman"/>
-        </w:rPr>
-      </w:pPr>
-      <w:r>
-        <w:rPr>
-          <w:rFonts w:ascii="Times New Roman" w:hAnsi="Times New Roman" w:cs="Times New Roman"/>
-        </w:rPr>
-        <w:lastRenderedPageBreak/>
+        <w:spacing w:line="360" w:lineRule="auto"/>
+        <w:jc w:val="both"/>
+        <w:rPr>
+          <w:rFonts w:ascii="Times New Roman" w:hAnsi="Times New Roman" w:cs="Times New Roman"/>
+        </w:rPr>
+      </w:pPr>
+      <w:r>
+        <w:rPr>
+          <w:rFonts w:ascii="Times New Roman" w:hAnsi="Times New Roman" w:cs="Times New Roman"/>
+        </w:rPr>
         <w:t xml:space="preserve">RAJÃO, R.; GIUDICE, R. D.; VAN DER HOFF, R.; CARVALHO, E. B. </w:t>
       </w:r>
       <w:r>
@@ -4039,16 +4802,17 @@
     </w:p>
     <w:p>
       <w:pPr>
-        <w:jc w:val="both"/>
-        <w:rPr>
-          <w:rFonts w:ascii="Times New Roman" w:hAnsi="Times New Roman" w:cs="Times New Roman"/>
-        </w:rPr>
-      </w:pPr>
-      <w:r>
-        <w:rPr>
-          <w:rFonts w:ascii="Times New Roman" w:hAnsi="Times New Roman" w:cs="Times New Roman"/>
-        </w:rPr>
-        <w:t xml:space="preserve">SERAPHIM, Marcella Cavalcanti; FREIRIA, Rafael Costa. Regularização ambiental de propriedades rurais na Amazônia Legal e reinserção de produtores na cadeia da pecuária no contexto da transformação ecológica. In: RIBEIRO, Flávio de Miranda; REI, Fernando (orgs.). </w:t>
+        <w:spacing w:line="360" w:lineRule="auto"/>
+        <w:jc w:val="both"/>
+        <w:rPr>
+          <w:rFonts w:ascii="Times New Roman" w:hAnsi="Times New Roman" w:cs="Times New Roman"/>
+        </w:rPr>
+      </w:pPr>
+      <w:r>
+        <w:rPr>
+          <w:rFonts w:ascii="Times New Roman" w:hAnsi="Times New Roman" w:cs="Times New Roman"/>
+        </w:rPr>
+        <w:t xml:space="preserve">SANTOS, S. da C. dos. </w:t>
       </w:r>
       <w:r>
         <w:rPr>
@@ -4056,27 +4820,43 @@
           <w:b/>
           <w:bCs/>
         </w:rPr>
-        <w:t>Energia e Meio Ambiente</w:t>
-      </w:r>
-      <w:r>
-        <w:rPr>
-          <w:rFonts w:ascii="Times New Roman" w:hAnsi="Times New Roman" w:cs="Times New Roman"/>
-        </w:rPr>
-        <w:t>. Santos: Editora Universitária Leopoldianum, 2025. p. 75-92.</w:t>
-      </w:r>
-    </w:p>
-    <w:p>
-      <w:pPr>
-        <w:jc w:val="both"/>
-        <w:rPr>
-          <w:rFonts w:ascii="Times New Roman" w:hAnsi="Times New Roman" w:cs="Times New Roman"/>
-        </w:rPr>
-      </w:pPr>
-      <w:r>
-        <w:rPr>
-          <w:rFonts w:ascii="Times New Roman" w:hAnsi="Times New Roman" w:cs="Times New Roman"/>
-        </w:rPr>
-        <w:t xml:space="preserve">SPAROVEK, G.; BARRETTO, A.; KLUG, I.; PAPP, L.; LINO, J. A revisão do Código Florestal brasileiro. </w:t>
+        <w:t>Análise de Reserva Legal Pará</w:t>
+      </w:r>
+      <w:r>
+        <w:rPr>
+          <w:rFonts w:ascii="Times New Roman" w:hAnsi="Times New Roman" w:cs="Times New Roman"/>
+        </w:rPr>
+        <w:t xml:space="preserve">: scripts para processamento de dados do CAR e integração com Google Earth Engine. Versão 1.0. Belém: NGEO-IDEFLOR-Bio, 2026. Disponível em: </w:t>
+      </w:r>
+      <w:hyperlink r:id="rId7" w:tgtFrame="_blank" w:history="1">
+        <w:r>
+          <w:rPr>
+            <w:rStyle w:val="Hyperlink"/>
+            <w:rFonts w:ascii="Times New Roman" w:hAnsi="Times New Roman" w:cs="Times New Roman"/>
+          </w:rPr>
+          <w:t>https://github.com/NGEO-IDEFLOR-Bio/analise-reserva-legal-para</w:t>
+        </w:r>
+      </w:hyperlink>
+      <w:r>
+        <w:rPr>
+          <w:rFonts w:ascii="Times New Roman" w:hAnsi="Times New Roman" w:cs="Times New Roman"/>
+        </w:rPr>
+        <w:t>. Acesso em: 11 mar. 2026.</w:t>
+      </w:r>
+    </w:p>
+    <w:p>
+      <w:pPr>
+        <w:spacing w:line="360" w:lineRule="auto"/>
+        <w:jc w:val="both"/>
+        <w:rPr>
+          <w:rFonts w:ascii="Times New Roman" w:hAnsi="Times New Roman" w:cs="Times New Roman"/>
+        </w:rPr>
+      </w:pPr>
+      <w:r>
+        <w:rPr>
+          <w:rFonts w:ascii="Times New Roman" w:hAnsi="Times New Roman" w:cs="Times New Roman"/>
+        </w:rPr>
+        <w:t xml:space="preserve">SERAPHIM, M. C.; FREIRIA, R. C. Regularização ambiental de propriedades rurais na Amazônia Legal e reinserção de produtores na cadeia da pecuária no contexto da transformação ecológica. In: RIBEIRO, F. de M.; REI, F. (orgs.). </w:t>
       </w:r>
       <w:r>
         <w:rPr>
@@ -4084,6 +4864,35 @@
           <w:b/>
           <w:bCs/>
         </w:rPr>
+        <w:t>Energia e Meio Ambiente</w:t>
+      </w:r>
+      <w:r>
+        <w:rPr>
+          <w:rFonts w:ascii="Times New Roman" w:hAnsi="Times New Roman" w:cs="Times New Roman"/>
+        </w:rPr>
+        <w:t>. Santos: Editora Universitária Leopoldianum, 2025. p. 75-92.</w:t>
+      </w:r>
+    </w:p>
+    <w:p>
+      <w:pPr>
+        <w:spacing w:line="360" w:lineRule="auto"/>
+        <w:jc w:val="both"/>
+        <w:rPr>
+          <w:rFonts w:ascii="Times New Roman" w:hAnsi="Times New Roman" w:cs="Times New Roman"/>
+        </w:rPr>
+      </w:pPr>
+      <w:r>
+        <w:rPr>
+          <w:rFonts w:ascii="Times New Roman" w:hAnsi="Times New Roman" w:cs="Times New Roman"/>
+        </w:rPr>
+        <w:t xml:space="preserve">SPAROVEK, G.; BARRETTO, A.; KLUG, I.; PAPP, L.; LINO, J. A revisão do Código Florestal brasileiro. </w:t>
+      </w:r>
+      <w:r>
+        <w:rPr>
+          <w:rFonts w:ascii="Times New Roman" w:hAnsi="Times New Roman" w:cs="Times New Roman"/>
+          <w:b/>
+          <w:bCs/>
+        </w:rPr>
         <w:t>Novos Estudos - CEBRAP</w:t>
       </w:r>
       <w:r>
@@ -4091,6 +4900,79 @@
           <w:rFonts w:ascii="Times New Roman" w:hAnsi="Times New Roman" w:cs="Times New Roman"/>
         </w:rPr>
         <w:t>, São Paulo, n. 89, p. 111-135, mar. 2011.</w:t>
+      </w:r>
+    </w:p>
+    <w:p>
+      <w:pPr>
+        <w:spacing w:line="360" w:lineRule="auto"/>
+        <w:jc w:val="both"/>
+        <w:rPr>
+          <w:rFonts w:ascii="Times New Roman" w:hAnsi="Times New Roman" w:cs="Times New Roman"/>
+        </w:rPr>
+      </w:pPr>
+      <w:r>
+        <w:rPr>
+          <w:rFonts w:ascii="Times New Roman" w:hAnsi="Times New Roman" w:cs="Times New Roman"/>
+        </w:rPr>
+        <w:t xml:space="preserve">R CORE TEAM. </w:t>
+      </w:r>
+      <w:r>
+        <w:rPr>
+          <w:rFonts w:ascii="Times New Roman" w:hAnsi="Times New Roman" w:cs="Times New Roman"/>
+          <w:b/>
+          <w:bCs/>
+        </w:rPr>
+        <w:t>R</w:t>
+      </w:r>
+      <w:r>
+        <w:rPr>
+          <w:rFonts w:ascii="Times New Roman" w:hAnsi="Times New Roman" w:cs="Times New Roman"/>
+        </w:rPr>
+        <w:t xml:space="preserve">: a language and environment for statistical computing. Vienna: R Foundation for Statistical Computing, 2024. Disponível em: </w:t>
+      </w:r>
+      <w:hyperlink r:id="rId8" w:tgtFrame="_blank" w:history="1">
+        <w:r>
+          <w:rPr>
+            <w:rStyle w:val="Hyperlink"/>
+            <w:rFonts w:ascii="Times New Roman" w:hAnsi="Times New Roman" w:cs="Times New Roman"/>
+          </w:rPr>
+          <w:t>https://www.R-project.org/</w:t>
+        </w:r>
+      </w:hyperlink>
+      <w:r>
+        <w:rPr>
+          <w:rFonts w:ascii="Times New Roman" w:hAnsi="Times New Roman" w:cs="Times New Roman"/>
+        </w:rPr>
+        <w:t>. Acesso em: 11 mar. 2026.</w:t>
+      </w:r>
+    </w:p>
+    <w:p>
+      <w:pPr>
+        <w:spacing w:line="360" w:lineRule="auto"/>
+        <w:jc w:val="both"/>
+        <w:rPr>
+          <w:rFonts w:ascii="Times New Roman" w:hAnsi="Times New Roman" w:cs="Times New Roman"/>
+        </w:rPr>
+      </w:pPr>
+      <w:r>
+        <w:rPr>
+          <w:rFonts w:ascii="Times New Roman" w:hAnsi="Times New Roman" w:cs="Times New Roman"/>
+        </w:rPr>
+        <w:t xml:space="preserve">WICKHAM, H. et al. Welcome to the </w:t>
+      </w:r>
+      <w:r>
+        <w:rPr>
+          <w:rFonts w:ascii="Times New Roman" w:hAnsi="Times New Roman" w:cs="Times New Roman"/>
+          <w:b/>
+          <w:bCs/>
+        </w:rPr>
+        <w:t>tidyverse</w:t>
+      </w:r>
+      <w:r>
+        <w:rPr>
+          <w:rFonts w:ascii="Times New Roman" w:hAnsi="Times New Roman" w:cs="Times New Roman"/>
+        </w:rPr>
+        <w:t>. Journal of Open Source Software, v. 4, n. 43, p. 1686, 2019.</w:t>
       </w:r>
     </w:p>
     <w:sectPr>
@@ -6005,4 +6887,16 @@
     </a:ext>
   </a:extLst>
 </a:theme>
+</file>
+
+<file path=customXml/item1.xml><?xml version="1.0" encoding="utf-8"?>
+<b:Sources xmlns:b="http://schemas.openxmlformats.org/officeDocument/2006/bibliography" xmlns="http://schemas.openxmlformats.org/officeDocument/2006/bibliography" SelectedStyle="\APASixthEditionOfficeOnline.xsl" StyleName="APA" Version="6"/>
+</file>
+
+<file path=customXml/itemProps1.xml><?xml version="1.0" encoding="utf-8"?>
+<ds:datastoreItem xmlns:ds="http://schemas.openxmlformats.org/officeDocument/2006/customXml" ds:itemID="{D4BDE862-F36B-4CB4-94B4-68D562DAFA4F}">
+  <ds:schemaRefs>
+    <ds:schemaRef ds:uri="http://schemas.openxmlformats.org/officeDocument/2006/bibliography"/>
+  </ds:schemaRefs>
+</ds:datastoreItem>
 </file>
</xml_diff>

<commit_message>
feat: Adiciona analise de passivo consolidado vs nao consolidado
- Novo script R (analise_passivo.R) com classificacao de imoveis
- Documentacao em docs/analise_passivo.md
- Atualizacao do README com estrutura e produtos
- Melhorias nos graficos de ranking (rotulos dinamicos)
- Adicao de grafico de passivo consolidado
</commit_message>
<xml_diff>
--- a/Análise Geoestatística do Passivo de Reserva Legal em Imóveis de Médio e Grande Porte no Estado do Pará.docx
+++ b/Análise Geoestatística do Passivo de Reserva Legal em Imóveis de Médio e Grande Porte no Estado do Pará.docx
@@ -3961,7 +3961,6 @@
     <w:p>
       <w:pPr>
         <w:spacing w:after="0" w:line="360" w:lineRule="auto"/>
-        <w:ind w:firstLine="709"/>
         <w:jc w:val="both"/>
         <w:rPr>
           <w:rFonts w:ascii="Times New Roman" w:hAnsi="Times New Roman" w:cs="Times New Roman"/>
@@ -4019,7 +4018,6 @@
     <w:p>
       <w:pPr>
         <w:spacing w:after="0" w:line="360" w:lineRule="auto"/>
-        <w:ind w:firstLine="709"/>
         <w:jc w:val="both"/>
         <w:rPr>
           <w:rFonts w:ascii="Times New Roman" w:hAnsi="Times New Roman" w:cs="Times New Roman"/>
@@ -4035,7 +4033,6 @@
     <w:p>
       <w:pPr>
         <w:spacing w:after="0" w:line="360" w:lineRule="auto"/>
-        <w:ind w:firstLine="709"/>
         <w:jc w:val="both"/>
         <w:rPr>
           <w:rFonts w:ascii="Times New Roman" w:hAnsi="Times New Roman" w:cs="Times New Roman"/>
@@ -4115,14 +4112,7 @@
         <w:rPr>
           <w:rFonts w:ascii="Times New Roman" w:hAnsi="Times New Roman" w:cs="Times New Roman"/>
         </w:rPr>
-        <w:t xml:space="preserve">Para garantir o rigor científico quanto ao marco temporal da legislação, todos os cruzamentos espaciais foram validados utilizando a série histórica de cobertura e uso da terra do MapBiomas, Coleção 9. Este procedimento assegurou que o cálculo do delta de </w:t>
-      </w:r>
-      <w:r>
-        <w:rPr>
-          <w:rFonts w:ascii="Times New Roman" w:hAnsi="Times New Roman" w:cs="Times New Roman"/>
-        </w:rPr>
-        <w:lastRenderedPageBreak/>
-        <w:t xml:space="preserve">regularização </w:t>
+        <w:t xml:space="preserve">Para garantir o rigor científico quanto ao marco temporal da legislação, todos os cruzamentos espaciais foram validados utilizando a série histórica de cobertura e uso da terra do MapBiomas, Coleção 9. Este procedimento assegurou que o cálculo do delta de regularização </w:t>
       </w:r>
       <w:r>
         <w:rPr>
@@ -4176,7 +4166,59 @@
         <w:rPr>
           <w:rFonts w:ascii="Times New Roman" w:hAnsi="Times New Roman" w:cs="Times New Roman"/>
         </w:rPr>
-        <w:t xml:space="preserve"> e do passivo não consolidado refletisse com precisão a dinâmica de supressão de vegetação nativa pré e pós-22 de julho de 2008, segregando anistias legais de novos passivos ambientais.</w:t>
+        <w:t xml:space="preserve"> e do passivo não consolidado refletisse com precisão a dinâmica de </w:t>
+      </w:r>
+      <w:r>
+        <w:rPr>
+          <w:rFonts w:ascii="Times New Roman" w:hAnsi="Times New Roman" w:cs="Times New Roman"/>
+        </w:rPr>
+        <w:lastRenderedPageBreak/>
+        <w:t>supressão de vegetação nativa pré e pós-22 de julho de 2008, segregando anistias legais de novos passivos ambientais.</w:t>
+      </w:r>
+    </w:p>
+    <w:p>
+      <w:pPr>
+        <w:spacing w:before="240" w:line="360" w:lineRule="auto"/>
+        <w:jc w:val="both"/>
+        <w:rPr>
+          <w:rFonts w:ascii="Times New Roman" w:hAnsi="Times New Roman" w:cs="Times New Roman"/>
+        </w:rPr>
+      </w:pPr>
+      <w:r>
+        <w:rPr>
+          <w:rFonts w:ascii="Times New Roman" w:hAnsi="Times New Roman" w:cs="Times New Roman"/>
+        </w:rPr>
+        <w:t>3.6 TIPIFICAÇÃO E CATEGORIZAÇÃO DOS IMÓVEIS E PASSIVOS</w:t>
+      </w:r>
+    </w:p>
+    <w:p>
+      <w:pPr>
+        <w:spacing w:after="0" w:line="360" w:lineRule="auto"/>
+        <w:ind w:firstLine="709"/>
+        <w:jc w:val="both"/>
+        <w:rPr>
+          <w:rFonts w:ascii="Times New Roman" w:hAnsi="Times New Roman" w:cs="Times New Roman"/>
+        </w:rPr>
+      </w:pPr>
+      <w:r>
+        <w:rPr>
+          <w:rFonts w:ascii="Times New Roman" w:hAnsi="Times New Roman" w:cs="Times New Roman"/>
+        </w:rPr>
+        <w:t xml:space="preserve">A análise dos dados integrou um processo de tipificação estruturado em três níveis: filtragem de elegibilidade territorial, categorização do </w:t>
+      </w:r>
+      <w:r>
+        <w:rPr>
+          <w:rFonts w:ascii="Times New Roman" w:hAnsi="Times New Roman" w:cs="Times New Roman"/>
+          <w:i/>
+          <w:iCs/>
+        </w:rPr>
+        <w:t>status</w:t>
+      </w:r>
+      <w:r>
+        <w:rPr>
+          <w:rFonts w:ascii="Times New Roman" w:hAnsi="Times New Roman" w:cs="Times New Roman"/>
+        </w:rPr>
+        <w:t xml:space="preserve"> de conformidade e estratificação da magnitude do passivo ambiental recente.</w:t>
       </w:r>
     </w:p>
     <w:p>
@@ -4193,67 +4235,55 @@
           <w:b/>
           <w:bCs/>
         </w:rPr>
-        <w:t>4 RESULTADOS E DISCUSSÃO</w:t>
-      </w:r>
-    </w:p>
-    <w:p>
-      <w:pPr>
-        <w:spacing w:before="240" w:line="360" w:lineRule="auto"/>
-        <w:jc w:val="both"/>
-        <w:rPr>
-          <w:rFonts w:ascii="Times New Roman" w:hAnsi="Times New Roman" w:cs="Times New Roman"/>
-        </w:rPr>
-      </w:pPr>
-      <w:r>
-        <w:rPr>
-          <w:rFonts w:ascii="Times New Roman" w:hAnsi="Times New Roman" w:cs="Times New Roman"/>
-        </w:rPr>
-        <w:t>4.1 DIAGNÓSTICO DO PASSIVO AMBIENTAL EM IMÓVEIS &gt; 4 MF NO ESTADO DO PARÁ</w:t>
-      </w:r>
-    </w:p>
-    <w:p>
-      <w:pPr>
-        <w:spacing w:before="240" w:line="360" w:lineRule="auto"/>
-        <w:jc w:val="both"/>
-        <w:rPr>
-          <w:rFonts w:ascii="Times New Roman" w:hAnsi="Times New Roman" w:cs="Times New Roman"/>
-        </w:rPr>
-      </w:pPr>
-      <w:r>
-        <w:rPr>
-          <w:rFonts w:ascii="Times New Roman" w:hAnsi="Times New Roman" w:cs="Times New Roman"/>
-        </w:rPr>
-        <w:t>4.2 ANÁLISE DO IMPACTO DA REDUÇÃO DA RESERVA LEGAL NA REGULARIZAÇÃO DE PASSIVOS CONSOLIDADOS</w:t>
-      </w:r>
-    </w:p>
-    <w:p>
-      <w:pPr>
-        <w:spacing w:before="240" w:line="360" w:lineRule="auto"/>
-        <w:jc w:val="both"/>
-        <w:rPr>
-          <w:rFonts w:ascii="Times New Roman" w:hAnsi="Times New Roman" w:cs="Times New Roman"/>
-        </w:rPr>
-      </w:pPr>
-      <w:r>
-        <w:rPr>
-          <w:rFonts w:ascii="Times New Roman" w:hAnsi="Times New Roman" w:cs="Times New Roman"/>
-        </w:rPr>
-        <w:t>4.3 DISTRIBUIÇÃO REGIONAL DO DÉFICIT AMBIENTAL E POTENCIAL DE CONFORMIDADE</w:t>
-      </w:r>
-    </w:p>
-    <w:p>
-      <w:pPr>
-        <w:spacing w:before="240" w:line="360" w:lineRule="auto"/>
-        <w:jc w:val="both"/>
-        <w:rPr>
-          <w:rFonts w:ascii="Times New Roman" w:hAnsi="Times New Roman" w:cs="Times New Roman"/>
-        </w:rPr>
-      </w:pPr>
-      <w:r>
-        <w:rPr>
-          <w:rFonts w:ascii="Times New Roman" w:hAnsi="Times New Roman" w:cs="Times New Roman"/>
-        </w:rPr>
-        <w:t>4.4 DISCUSSÃO SOBRE SEGURANÇA JURÍDICA E EFICÁCIA DO PROGRAMA DE REGULARIZAÇÃO AMBIENTAL (PRA)</w:t>
+        <w:t>3.6.1 Critérios de elegibilidade territorial</w:t>
+      </w:r>
+    </w:p>
+    <w:p>
+      <w:pPr>
+        <w:spacing w:after="0" w:line="360" w:lineRule="auto"/>
+        <w:ind w:firstLine="709"/>
+        <w:jc w:val="both"/>
+        <w:rPr>
+          <w:rFonts w:ascii="Times New Roman" w:hAnsi="Times New Roman" w:cs="Times New Roman"/>
+        </w:rPr>
+      </w:pPr>
+      <w:r>
+        <w:rPr>
+          <w:rFonts w:ascii="Times New Roman" w:hAnsi="Times New Roman" w:cs="Times New Roman"/>
+        </w:rPr>
+        <w:t>A elegibilidade municipal para a aplicação da redução da Reserva Legal foi determinada pela intersecção de dois critérios geográficos, fundamentados nas diretrizes do Zoneamento Ecológico-Econômico do Estado do Pará (ZEE-PA):</w:t>
+      </w:r>
+    </w:p>
+    <w:p>
+      <w:pPr>
+        <w:spacing w:after="0" w:line="360" w:lineRule="auto"/>
+        <w:ind w:left="993" w:hanging="284"/>
+        <w:jc w:val="both"/>
+        <w:rPr>
+          <w:rFonts w:ascii="Times New Roman" w:hAnsi="Times New Roman" w:cs="Times New Roman"/>
+        </w:rPr>
+      </w:pPr>
+      <w:r>
+        <w:rPr>
+          <w:rFonts w:ascii="Times New Roman" w:hAnsi="Times New Roman" w:cs="Times New Roman"/>
+        </w:rPr>
+        <w:t>a) critério de áreas protegidas: identificação de municípios com mais de 50% do território ocupado por Unidades de Conservação (UC) de domínio público ou Terras Indígenas (TI) homologadas;</w:t>
+      </w:r>
+    </w:p>
+    <w:p>
+      <w:pPr>
+        <w:spacing w:after="0" w:line="360" w:lineRule="auto"/>
+        <w:ind w:left="993" w:hanging="284"/>
+        <w:jc w:val="both"/>
+        <w:rPr>
+          <w:rFonts w:ascii="Times New Roman" w:hAnsi="Times New Roman" w:cs="Times New Roman"/>
+        </w:rPr>
+      </w:pPr>
+      <w:r>
+        <w:rPr>
+          <w:rFonts w:ascii="Times New Roman" w:hAnsi="Times New Roman" w:cs="Times New Roman"/>
+        </w:rPr>
+        <w:t>b) critério de zoneamento (ZEE): inclusão de municípios localizados em zonas elegíveis para a redução da Reserva Legal, conforme a base vetorial institucional da SEMAS-PA.</w:t>
       </w:r>
     </w:p>
     <w:p>
@@ -4270,7 +4300,103 @@
           <w:b/>
           <w:bCs/>
         </w:rPr>
-        <w:t>5 CONCLUSÃO</w:t>
+        <w:t>3.6.2 Matriz de status de conformidade</w:t>
+      </w:r>
+    </w:p>
+    <w:p>
+      <w:pPr>
+        <w:spacing w:after="0" w:line="360" w:lineRule="auto"/>
+        <w:ind w:firstLine="709"/>
+        <w:jc w:val="both"/>
+        <w:rPr>
+          <w:rFonts w:ascii="Times New Roman" w:hAnsi="Times New Roman" w:cs="Times New Roman"/>
+        </w:rPr>
+      </w:pPr>
+      <w:r>
+        <w:rPr>
+          <w:rFonts w:ascii="Times New Roman" w:hAnsi="Times New Roman" w:cs="Times New Roman"/>
+        </w:rPr>
+        <w:t>Os imóveis situados em municípios elegíveis foram segmentados em cinco categorias, utilizando o marco temporal de 22 de julho de 2008 como divisor para a natureza da supressão:</w:t>
+      </w:r>
+    </w:p>
+    <w:p>
+      <w:pPr>
+        <w:spacing w:after="0" w:line="360" w:lineRule="auto"/>
+        <w:ind w:left="993" w:hanging="284"/>
+        <w:jc w:val="both"/>
+        <w:rPr>
+          <w:rFonts w:ascii="Times New Roman" w:hAnsi="Times New Roman" w:cs="Times New Roman"/>
+        </w:rPr>
+      </w:pPr>
+      <w:r>
+        <w:rPr>
+          <w:rFonts w:ascii="Times New Roman" w:hAnsi="Times New Roman" w:cs="Times New Roman"/>
+        </w:rPr>
+        <w:t>a) elegível - sem passivo: imóveis com cobertura vegetal nativa em conformidade com os limites legais em ambos os cenários simulados;</w:t>
+      </w:r>
+    </w:p>
+    <w:p>
+      <w:pPr>
+        <w:spacing w:after="0" w:line="360" w:lineRule="auto"/>
+        <w:ind w:left="993" w:hanging="284"/>
+        <w:jc w:val="both"/>
+        <w:rPr>
+          <w:rFonts w:ascii="Times New Roman" w:hAnsi="Times New Roman" w:cs="Times New Roman"/>
+        </w:rPr>
+      </w:pPr>
+      <w:r>
+        <w:rPr>
+          <w:rFonts w:ascii="Times New Roman" w:hAnsi="Times New Roman" w:cs="Times New Roman"/>
+        </w:rPr>
+        <w:t>b) elegível - apenas passivo consolidado: imóveis cujo déficit é composto integralmente por supressões ocorridas antes de 22 de julho de 2008;</w:t>
+      </w:r>
+    </w:p>
+    <w:p>
+      <w:pPr>
+        <w:spacing w:after="0" w:line="360" w:lineRule="auto"/>
+        <w:ind w:left="993" w:hanging="284"/>
+        <w:jc w:val="both"/>
+        <w:rPr>
+          <w:rFonts w:ascii="Times New Roman" w:hAnsi="Times New Roman" w:cs="Times New Roman"/>
+        </w:rPr>
+      </w:pPr>
+      <w:r>
+        <w:rPr>
+          <w:rFonts w:ascii="Times New Roman" w:hAnsi="Times New Roman" w:cs="Times New Roman"/>
+        </w:rPr>
+        <w:t>c) elegível - apenas passivo não consolidado: imóveis que apresentam exclusivamente déficits gerados após o marco legal de 2008;</w:t>
+      </w:r>
+    </w:p>
+    <w:p>
+      <w:pPr>
+        <w:spacing w:after="0" w:line="360" w:lineRule="auto"/>
+        <w:ind w:left="993" w:hanging="284"/>
+        <w:jc w:val="both"/>
+        <w:rPr>
+          <w:rFonts w:ascii="Times New Roman" w:hAnsi="Times New Roman" w:cs="Times New Roman"/>
+        </w:rPr>
+      </w:pPr>
+      <w:r>
+        <w:rPr>
+          <w:rFonts w:ascii="Times New Roman" w:hAnsi="Times New Roman" w:cs="Times New Roman"/>
+        </w:rPr>
+        <w:t>d) elegível - ambos passivos: imóveis com ocorrência simultânea de déficits consolidados e não consolidados;</w:t>
+      </w:r>
+    </w:p>
+    <w:p>
+      <w:pPr>
+        <w:spacing w:after="0" w:line="360" w:lineRule="auto"/>
+        <w:ind w:left="993" w:hanging="284"/>
+        <w:jc w:val="both"/>
+        <w:rPr>
+          <w:rFonts w:ascii="Times New Roman" w:hAnsi="Times New Roman" w:cs="Times New Roman"/>
+        </w:rPr>
+      </w:pPr>
+      <w:r>
+        <w:rPr>
+          <w:rFonts w:ascii="Times New Roman" w:hAnsi="Times New Roman" w:cs="Times New Roman"/>
+        </w:rPr>
+        <w:t>e) não elegível: imóveis localizados em municípios que não atendem aos critérios geográficos definidos no item 3.6.1.</w:t>
       </w:r>
     </w:p>
     <w:p>
@@ -4287,175 +4413,2492 @@
           <w:b/>
           <w:bCs/>
         </w:rPr>
-        <w:t>6 REFERÊNCIAS</w:t>
-      </w:r>
-    </w:p>
-    <w:p>
-      <w:pPr>
-        <w:spacing w:line="360" w:lineRule="auto"/>
-        <w:jc w:val="both"/>
-        <w:rPr>
-          <w:rFonts w:ascii="Times New Roman" w:hAnsi="Times New Roman" w:cs="Times New Roman"/>
-        </w:rPr>
-      </w:pPr>
-      <w:r>
-        <w:rPr>
-          <w:rFonts w:ascii="Times New Roman" w:hAnsi="Times New Roman" w:cs="Times New Roman"/>
-        </w:rPr>
-        <w:t xml:space="preserve">ALMEIDA, C. A. de et al. </w:t>
-      </w:r>
+        <w:t>3.6.3 Estratificação da magnitude do passivo não consolidado</w:t>
+      </w:r>
+    </w:p>
+    <w:p>
+      <w:pPr>
+        <w:spacing w:after="0" w:line="360" w:lineRule="auto"/>
+        <w:ind w:firstLine="709"/>
+        <w:jc w:val="both"/>
+        <w:rPr>
+          <w:rFonts w:ascii="Times New Roman" w:hAnsi="Times New Roman" w:cs="Times New Roman"/>
+        </w:rPr>
+      </w:pPr>
+      <w:r>
+        <w:rPr>
+          <w:rFonts w:ascii="Times New Roman" w:hAnsi="Times New Roman" w:cs="Times New Roman"/>
+        </w:rPr>
+        <w:lastRenderedPageBreak/>
+        <w:t>Para os imóveis com passivo identificado após 2008, aplicou-se uma classificação baseada na área absoluta da supressão, permitindo a distinção técnica do passivo remanescente à regra de transição:</w:t>
+      </w:r>
+    </w:p>
+    <w:p>
+      <w:pPr>
+        <w:numPr>
+          <w:ilvl w:val="0"/>
+          <w:numId w:val="7"/>
+        </w:numPr>
+        <w:tabs>
+          <w:tab w:val="clear" w:pos="720"/>
+        </w:tabs>
+        <w:spacing w:after="0" w:line="360" w:lineRule="auto"/>
+        <w:ind w:left="993" w:hanging="284"/>
+        <w:jc w:val="both"/>
+        <w:rPr>
+          <w:rFonts w:ascii="Times New Roman" w:hAnsi="Times New Roman" w:cs="Times New Roman"/>
+        </w:rPr>
+      </w:pPr>
+      <w:r>
+        <w:rPr>
+          <w:rFonts w:ascii="Times New Roman" w:hAnsi="Times New Roman" w:cs="Times New Roman"/>
+        </w:rPr>
+        <w:t xml:space="preserve">Pequeno: </w:t>
+      </w:r>
+      <w:r>
+        <w:rPr>
+          <w:rFonts w:ascii="Times New Roman" w:hAnsi="Times New Roman" w:cs="Times New Roman"/>
+        </w:rPr>
+        <w:t xml:space="preserve">≤ </w:t>
+      </w:r>
+      <w:r>
+        <w:rPr>
+          <w:rFonts w:ascii="Times New Roman" w:hAnsi="Times New Roman" w:cs="Times New Roman"/>
+        </w:rPr>
+        <w:t>50 ha;</w:t>
+      </w:r>
+    </w:p>
+    <w:p>
+      <w:pPr>
+        <w:numPr>
+          <w:ilvl w:val="0"/>
+          <w:numId w:val="7"/>
+        </w:numPr>
+        <w:tabs>
+          <w:tab w:val="clear" w:pos="720"/>
+        </w:tabs>
+        <w:spacing w:after="0" w:line="360" w:lineRule="auto"/>
+        <w:ind w:left="993" w:hanging="284"/>
+        <w:jc w:val="both"/>
+        <w:rPr>
+          <w:rFonts w:ascii="Times New Roman" w:hAnsi="Times New Roman" w:cs="Times New Roman"/>
+        </w:rPr>
+      </w:pPr>
+      <w:r>
+        <w:rPr>
+          <w:rFonts w:ascii="Times New Roman" w:hAnsi="Times New Roman" w:cs="Times New Roman"/>
+        </w:rPr>
+        <w:t>Médio: 51 a 200 ha;</w:t>
+      </w:r>
+    </w:p>
+    <w:p>
+      <w:pPr>
+        <w:numPr>
+          <w:ilvl w:val="0"/>
+          <w:numId w:val="7"/>
+        </w:numPr>
+        <w:tabs>
+          <w:tab w:val="clear" w:pos="720"/>
+        </w:tabs>
+        <w:spacing w:after="0" w:line="360" w:lineRule="auto"/>
+        <w:ind w:left="993" w:hanging="284"/>
+        <w:jc w:val="both"/>
+        <w:rPr>
+          <w:rFonts w:ascii="Times New Roman" w:hAnsi="Times New Roman" w:cs="Times New Roman"/>
+        </w:rPr>
+      </w:pPr>
+      <w:r>
+        <w:rPr>
+          <w:rFonts w:ascii="Times New Roman" w:hAnsi="Times New Roman" w:cs="Times New Roman"/>
+        </w:rPr>
+        <w:t>Grande: 201 a 500 ha;</w:t>
+      </w:r>
+    </w:p>
+    <w:p>
+      <w:pPr>
+        <w:numPr>
+          <w:ilvl w:val="0"/>
+          <w:numId w:val="7"/>
+        </w:numPr>
+        <w:tabs>
+          <w:tab w:val="clear" w:pos="720"/>
+        </w:tabs>
+        <w:spacing w:after="0" w:line="360" w:lineRule="auto"/>
+        <w:ind w:left="993" w:hanging="284"/>
+        <w:jc w:val="both"/>
+        <w:rPr>
+          <w:rFonts w:ascii="Times New Roman" w:hAnsi="Times New Roman" w:cs="Times New Roman"/>
+        </w:rPr>
+      </w:pPr>
+      <w:r>
+        <w:rPr>
+          <w:rFonts w:ascii="Times New Roman" w:hAnsi="Times New Roman" w:cs="Times New Roman"/>
+        </w:rPr>
+        <w:t xml:space="preserve">Muito Grande: </w:t>
+      </w:r>
+      <w:r>
+        <w:rPr>
+          <w:rFonts w:ascii="Times New Roman" w:hAnsi="Times New Roman" w:cs="Times New Roman"/>
+        </w:rPr>
+        <w:t>&gt;</w:t>
+      </w:r>
+      <w:r>
+        <w:rPr>
+          <w:rFonts w:ascii="Times New Roman" w:hAnsi="Times New Roman" w:cs="Times New Roman"/>
+        </w:rPr>
+        <w:t xml:space="preserve"> 500 ha.</w:t>
+      </w:r>
+    </w:p>
+    <w:p>
+      <w:pPr>
+        <w:spacing w:after="0" w:line="360" w:lineRule="auto"/>
+        <w:ind w:firstLine="709"/>
+        <w:jc w:val="both"/>
+        <w:rPr>
+          <w:rFonts w:ascii="Times New Roman" w:hAnsi="Times New Roman" w:cs="Times New Roman"/>
+        </w:rPr>
+      </w:pPr>
+      <w:r>
+        <w:rPr>
+          <w:rFonts w:ascii="Times New Roman" w:hAnsi="Times New Roman" w:cs="Times New Roman"/>
+        </w:rPr>
+        <w:t>Este detalhamento isola o grupo de propriedades que atingem a conformidade imediata via aplicação do Art. 12 daquelas que permanecem com obrigações de recomposição decorrentes de supressões recentes.</w:t>
+      </w:r>
+    </w:p>
+    <w:p>
+      <w:pPr>
+        <w:spacing w:before="240" w:line="360" w:lineRule="auto"/>
+        <w:jc w:val="both"/>
+        <w:rPr>
+          <w:rFonts w:ascii="Times New Roman" w:hAnsi="Times New Roman" w:cs="Times New Roman"/>
+        </w:rPr>
+      </w:pPr>
+      <w:r>
+        <w:rPr>
+          <w:rFonts w:ascii="Times New Roman" w:hAnsi="Times New Roman" w:cs="Times New Roman"/>
+        </w:rPr>
+        <w:t>4 RESULTADOS E DISCUSSÃO</w:t>
+      </w:r>
+    </w:p>
+    <w:p>
+      <w:pPr>
+        <w:spacing w:after="0" w:line="360" w:lineRule="auto"/>
+        <w:ind w:firstLine="709"/>
+        <w:jc w:val="both"/>
+        <w:rPr>
+          <w:rFonts w:ascii="Times New Roman" w:hAnsi="Times New Roman" w:cs="Times New Roman"/>
+        </w:rPr>
+      </w:pPr>
+      <w:r>
+        <w:rPr>
+          <w:rFonts w:ascii="Times New Roman" w:hAnsi="Times New Roman" w:cs="Times New Roman"/>
+        </w:rPr>
+        <w:t>A aplicação da modelagem geoestatística sobre a base do SICAR-PA e o cruzamento com a malha de áreas protegidas permitiu quantificar o efeito da regra de transição do Artigo 12 da Lei n.º 12.651/2012 sobre as métricas de regularização ambiental no Estado do Pará.</w:t>
+      </w:r>
+    </w:p>
+    <w:p>
+      <w:pPr>
+        <w:spacing w:before="240" w:line="360" w:lineRule="auto"/>
+        <w:jc w:val="both"/>
+        <w:rPr>
+          <w:rFonts w:ascii="Times New Roman" w:hAnsi="Times New Roman" w:cs="Times New Roman"/>
+        </w:rPr>
+      </w:pPr>
+      <w:r>
+        <w:rPr>
+          <w:rFonts w:ascii="Times New Roman" w:hAnsi="Times New Roman" w:cs="Times New Roman"/>
+        </w:rPr>
+        <w:t>4.1 ELEGIBILIDADE TERRITORIAL E ABRANGÊNCIA DO ART. 12</w:t>
+      </w:r>
+    </w:p>
+    <w:p>
+      <w:pPr>
+        <w:spacing w:after="0" w:line="360" w:lineRule="auto"/>
+        <w:ind w:firstLine="709"/>
+        <w:jc w:val="both"/>
+        <w:rPr>
+          <w:rFonts w:ascii="Times New Roman" w:hAnsi="Times New Roman" w:cs="Times New Roman"/>
+        </w:rPr>
+      </w:pPr>
+      <w:r>
+        <w:rPr>
+          <w:rFonts w:ascii="Times New Roman" w:hAnsi="Times New Roman" w:cs="Times New Roman"/>
+        </w:rPr>
+        <w:t>O cruzamento vetorial identificou os municípios paraenses que possuem mais de 50% de seus territórios sobrepostos a Unidades de Conservação de domínio público e Terras Indígenas homologadas. Conforme ilustra a Figura 1, os municípios que atingem este limiar não se distribuem de forma homogênea no estado, agrupando-se espacialmente em dois grandes maciços contíguos: um ao Norte (Baixo Amazonas) e outro a Sudoeste (região do Xingu).</w:t>
+      </w:r>
+    </w:p>
+    <w:p>
+      <w:pPr>
+        <w:keepNext/>
+        <w:spacing w:after="0" w:line="360" w:lineRule="auto"/>
+        <w:jc w:val="both"/>
+      </w:pPr>
+      <w:r>
+        <w:rPr>
+          <w:rFonts w:ascii="Times New Roman" w:hAnsi="Times New Roman" w:cs="Times New Roman"/>
+          <w:noProof/>
+        </w:rPr>
+        <w:lastRenderedPageBreak/>
+        <w:drawing>
+          <wp:inline distT="0" distB="0" distL="0" distR="0" wp14:anchorId="2986823C" wp14:editId="0DAB2A53">
+            <wp:extent cx="5759450" cy="4072890"/>
+            <wp:effectExtent l="19050" t="19050" r="12700" b="22860"/>
+            <wp:docPr id="1102688091" name="Imagem 1"/>
+            <wp:cNvGraphicFramePr>
+              <a:graphicFrameLocks xmlns:a="http://schemas.openxmlformats.org/drawingml/2006/main" noChangeAspect="1"/>
+            </wp:cNvGraphicFramePr>
+            <a:graphic xmlns:a="http://schemas.openxmlformats.org/drawingml/2006/main">
+              <a:graphicData uri="http://schemas.openxmlformats.org/drawingml/2006/picture">
+                <pic:pic xmlns:pic="http://schemas.openxmlformats.org/drawingml/2006/picture">
+                  <pic:nvPicPr>
+                    <pic:cNvPr id="1102688091" name="Imagem 1102688091"/>
+                    <pic:cNvPicPr/>
+                  </pic:nvPicPr>
+                  <pic:blipFill>
+                    <a:blip r:embed="rId6" cstate="print">
+                      <a:extLst>
+                        <a:ext uri="{28A0092B-C50C-407E-A947-70E740481C1C}">
+                          <a14:useLocalDpi xmlns:a14="http://schemas.microsoft.com/office/drawing/2010/main" val="0"/>
+                        </a:ext>
+                      </a:extLst>
+                    </a:blip>
+                    <a:stretch>
+                      <a:fillRect/>
+                    </a:stretch>
+                  </pic:blipFill>
+                  <pic:spPr>
+                    <a:xfrm>
+                      <a:off x="0" y="0"/>
+                      <a:ext cx="5759450" cy="4072890"/>
+                    </a:xfrm>
+                    <a:prstGeom prst="rect">
+                      <a:avLst/>
+                    </a:prstGeom>
+                    <a:ln>
+                      <a:solidFill>
+                        <a:schemeClr val="tx1">
+                          <a:lumMod val="50000"/>
+                          <a:lumOff val="50000"/>
+                        </a:schemeClr>
+                      </a:solidFill>
+                    </a:ln>
+                  </pic:spPr>
+                </pic:pic>
+              </a:graphicData>
+            </a:graphic>
+          </wp:inline>
+        </w:drawing>
+      </w:r>
+    </w:p>
+    <w:p>
+      <w:pPr>
+        <w:pStyle w:val="Legenda"/>
+        <w:jc w:val="both"/>
+        <w:rPr>
+          <w:rFonts w:ascii="Times New Roman" w:hAnsi="Times New Roman" w:cs="Times New Roman"/>
+          <w:i w:val="0"/>
+          <w:iCs w:val="0"/>
+          <w:color w:val="auto"/>
+          <w:sz w:val="20"/>
+          <w:szCs w:val="20"/>
+        </w:rPr>
+      </w:pPr>
+      <w:r>
+        <w:rPr>
+          <w:rFonts w:ascii="Times New Roman" w:hAnsi="Times New Roman" w:cs="Times New Roman"/>
+          <w:i w:val="0"/>
+          <w:iCs w:val="0"/>
+          <w:color w:val="auto"/>
+          <w:sz w:val="20"/>
+          <w:szCs w:val="20"/>
+        </w:rPr>
+        <w:t xml:space="preserve">Figura </w:t>
+      </w:r>
+      <w:r>
+        <w:rPr>
+          <w:rFonts w:ascii="Times New Roman" w:hAnsi="Times New Roman" w:cs="Times New Roman"/>
+          <w:i w:val="0"/>
+          <w:iCs w:val="0"/>
+          <w:color w:val="auto"/>
+          <w:sz w:val="20"/>
+          <w:szCs w:val="20"/>
+        </w:rPr>
+        <w:fldChar w:fldCharType="begin"/>
+      </w:r>
+      <w:r>
+        <w:rPr>
+          <w:rFonts w:ascii="Times New Roman" w:hAnsi="Times New Roman" w:cs="Times New Roman"/>
+          <w:i w:val="0"/>
+          <w:iCs w:val="0"/>
+          <w:color w:val="auto"/>
+          <w:sz w:val="20"/>
+          <w:szCs w:val="20"/>
+        </w:rPr>
+        <w:instrText xml:space="preserve"> SEQ Figura \* ARABIC </w:instrText>
+      </w:r>
+      <w:r>
+        <w:rPr>
+          <w:rFonts w:ascii="Times New Roman" w:hAnsi="Times New Roman" w:cs="Times New Roman"/>
+          <w:i w:val="0"/>
+          <w:iCs w:val="0"/>
+          <w:color w:val="auto"/>
+          <w:sz w:val="20"/>
+          <w:szCs w:val="20"/>
+        </w:rPr>
+        <w:fldChar w:fldCharType="separate"/>
+      </w:r>
+      <w:r>
+        <w:rPr>
+          <w:rFonts w:ascii="Times New Roman" w:hAnsi="Times New Roman" w:cs="Times New Roman"/>
+          <w:i w:val="0"/>
+          <w:iCs w:val="0"/>
+          <w:noProof/>
+          <w:color w:val="auto"/>
+          <w:sz w:val="20"/>
+          <w:szCs w:val="20"/>
+        </w:rPr>
+        <w:t>1</w:t>
+      </w:r>
+      <w:r>
+        <w:rPr>
+          <w:rFonts w:ascii="Times New Roman" w:hAnsi="Times New Roman" w:cs="Times New Roman"/>
+          <w:i w:val="0"/>
+          <w:iCs w:val="0"/>
+          <w:color w:val="auto"/>
+          <w:sz w:val="20"/>
+          <w:szCs w:val="20"/>
+        </w:rPr>
+        <w:fldChar w:fldCharType="end"/>
+      </w:r>
+      <w:r>
+        <w:rPr>
+          <w:rFonts w:ascii="Times New Roman" w:hAnsi="Times New Roman" w:cs="Times New Roman"/>
+          <w:i w:val="0"/>
+          <w:iCs w:val="0"/>
+          <w:color w:val="auto"/>
+          <w:sz w:val="20"/>
+          <w:szCs w:val="20"/>
+        </w:rPr>
+        <w:t xml:space="preserve"> – Municípios do Pará com mais de 50% de sobreposição com Unidades de Conservação e Terras Indígenas. Fonte: Elaborado pelo autor (2026).</w:t>
+      </w:r>
+    </w:p>
+    <w:p>
+      <w:pPr>
+        <w:spacing w:before="240" w:line="360" w:lineRule="auto"/>
+        <w:ind w:firstLine="709"/>
+        <w:jc w:val="both"/>
+        <w:rPr>
+          <w:rFonts w:ascii="Times New Roman" w:hAnsi="Times New Roman" w:cs="Times New Roman"/>
+        </w:rPr>
+      </w:pPr>
+      <w:r>
+        <w:rPr>
+          <w:rFonts w:ascii="Times New Roman" w:hAnsi="Times New Roman" w:cs="Times New Roman"/>
+        </w:rPr>
+        <w:t>A análise espacial demonstra que os municípios com mais de 50% de sobreposição com áreas protegidas agrupam-se maioritariamente nas regiões sudoeste e norte do Pará. A distribuição territorial destes municípios está espacializada na Figura</w:t>
+      </w:r>
+      <w:r>
+        <w:rPr>
+          <w:rFonts w:ascii="Times New Roman" w:hAnsi="Times New Roman" w:cs="Times New Roman"/>
+        </w:rPr>
+        <w:t xml:space="preserve"> </w:t>
+      </w:r>
+      <w:r>
+        <w:rPr>
+          <w:rFonts w:ascii="Times New Roman" w:hAnsi="Times New Roman" w:cs="Times New Roman"/>
+        </w:rPr>
+        <w:t>2.</w:t>
+      </w:r>
+    </w:p>
+    <w:p>
+      <w:pPr>
+        <w:keepNext/>
+        <w:spacing w:before="240" w:line="360" w:lineRule="auto"/>
+        <w:jc w:val="both"/>
+      </w:pPr>
       <w:r>
         <w:rPr>
           <w:rFonts w:ascii="Times New Roman" w:hAnsi="Times New Roman" w:cs="Times New Roman"/>
           <w:b/>
           <w:bCs/>
-        </w:rPr>
-        <w:t>Metodologia utilizada nos sistemas PRODES e DETER</w:t>
-      </w:r>
-      <w:r>
-        <w:rPr>
-          <w:rFonts w:ascii="Times New Roman" w:hAnsi="Times New Roman" w:cs="Times New Roman"/>
-        </w:rPr>
-        <w:t>. 2. ed. São José dos Campos: INPE, 2022.</w:t>
-      </w:r>
-    </w:p>
-    <w:p>
-      <w:pPr>
-        <w:spacing w:line="360" w:lineRule="auto"/>
-        <w:jc w:val="both"/>
-        <w:rPr>
-          <w:rFonts w:ascii="Times New Roman" w:hAnsi="Times New Roman" w:cs="Times New Roman"/>
-        </w:rPr>
-      </w:pPr>
-      <w:r>
-        <w:rPr>
-          <w:rFonts w:ascii="Times New Roman" w:hAnsi="Times New Roman" w:cs="Times New Roman"/>
-        </w:rPr>
-        <w:t xml:space="preserve">BRASIL. </w:t>
-      </w:r>
+          <w:noProof/>
+        </w:rPr>
+        <w:lastRenderedPageBreak/>
+        <w:drawing>
+          <wp:inline distT="0" distB="0" distL="0" distR="0" wp14:anchorId="02F58C1A" wp14:editId="39F32FD2">
+            <wp:extent cx="5759450" cy="4072890"/>
+            <wp:effectExtent l="19050" t="19050" r="12700" b="22860"/>
+            <wp:docPr id="1871645588" name="Imagem 2"/>
+            <wp:cNvGraphicFramePr>
+              <a:graphicFrameLocks xmlns:a="http://schemas.openxmlformats.org/drawingml/2006/main" noChangeAspect="1"/>
+            </wp:cNvGraphicFramePr>
+            <a:graphic xmlns:a="http://schemas.openxmlformats.org/drawingml/2006/main">
+              <a:graphicData uri="http://schemas.openxmlformats.org/drawingml/2006/picture">
+                <pic:pic xmlns:pic="http://schemas.openxmlformats.org/drawingml/2006/picture">
+                  <pic:nvPicPr>
+                    <pic:cNvPr id="1871645588" name="Imagem 1871645588"/>
+                    <pic:cNvPicPr/>
+                  </pic:nvPicPr>
+                  <pic:blipFill>
+                    <a:blip r:embed="rId7" cstate="print">
+                      <a:extLst>
+                        <a:ext uri="{28A0092B-C50C-407E-A947-70E740481C1C}">
+                          <a14:useLocalDpi xmlns:a14="http://schemas.microsoft.com/office/drawing/2010/main" val="0"/>
+                        </a:ext>
+                      </a:extLst>
+                    </a:blip>
+                    <a:stretch>
+                      <a:fillRect/>
+                    </a:stretch>
+                  </pic:blipFill>
+                  <pic:spPr>
+                    <a:xfrm>
+                      <a:off x="0" y="0"/>
+                      <a:ext cx="5759450" cy="4072890"/>
+                    </a:xfrm>
+                    <a:prstGeom prst="rect">
+                      <a:avLst/>
+                    </a:prstGeom>
+                    <a:ln>
+                      <a:solidFill>
+                        <a:schemeClr val="tx1">
+                          <a:lumMod val="50000"/>
+                          <a:lumOff val="50000"/>
+                        </a:schemeClr>
+                      </a:solidFill>
+                    </a:ln>
+                  </pic:spPr>
+                </pic:pic>
+              </a:graphicData>
+            </a:graphic>
+          </wp:inline>
+        </w:drawing>
+      </w:r>
+    </w:p>
+    <w:p>
+      <w:pPr>
+        <w:pStyle w:val="Legenda"/>
+        <w:jc w:val="both"/>
+        <w:rPr>
+          <w:rFonts w:ascii="Times New Roman" w:hAnsi="Times New Roman" w:cs="Times New Roman"/>
+          <w:i w:val="0"/>
+          <w:iCs w:val="0"/>
+          <w:color w:val="auto"/>
+          <w:sz w:val="20"/>
+          <w:szCs w:val="20"/>
+        </w:rPr>
+      </w:pPr>
+      <w:r>
+        <w:rPr>
+          <w:rFonts w:ascii="Times New Roman" w:hAnsi="Times New Roman" w:cs="Times New Roman"/>
+          <w:i w:val="0"/>
+          <w:iCs w:val="0"/>
+          <w:color w:val="auto"/>
+          <w:sz w:val="20"/>
+          <w:szCs w:val="20"/>
+        </w:rPr>
+        <w:t xml:space="preserve">Figura </w:t>
+      </w:r>
+      <w:r>
+        <w:rPr>
+          <w:rFonts w:ascii="Times New Roman" w:hAnsi="Times New Roman" w:cs="Times New Roman"/>
+          <w:i w:val="0"/>
+          <w:iCs w:val="0"/>
+          <w:color w:val="auto"/>
+          <w:sz w:val="20"/>
+          <w:szCs w:val="20"/>
+        </w:rPr>
+        <w:fldChar w:fldCharType="begin"/>
+      </w:r>
+      <w:r>
+        <w:rPr>
+          <w:rFonts w:ascii="Times New Roman" w:hAnsi="Times New Roman" w:cs="Times New Roman"/>
+          <w:i w:val="0"/>
+          <w:iCs w:val="0"/>
+          <w:color w:val="auto"/>
+          <w:sz w:val="20"/>
+          <w:szCs w:val="20"/>
+        </w:rPr>
+        <w:instrText xml:space="preserve"> SEQ Figura \* ARABIC </w:instrText>
+      </w:r>
+      <w:r>
+        <w:rPr>
+          <w:rFonts w:ascii="Times New Roman" w:hAnsi="Times New Roman" w:cs="Times New Roman"/>
+          <w:i w:val="0"/>
+          <w:iCs w:val="0"/>
+          <w:color w:val="auto"/>
+          <w:sz w:val="20"/>
+          <w:szCs w:val="20"/>
+        </w:rPr>
+        <w:fldChar w:fldCharType="separate"/>
+      </w:r>
+      <w:r>
+        <w:rPr>
+          <w:rFonts w:ascii="Times New Roman" w:hAnsi="Times New Roman" w:cs="Times New Roman"/>
+          <w:i w:val="0"/>
+          <w:iCs w:val="0"/>
+          <w:noProof/>
+          <w:color w:val="auto"/>
+          <w:sz w:val="20"/>
+          <w:szCs w:val="20"/>
+        </w:rPr>
+        <w:t>2</w:t>
+      </w:r>
+      <w:r>
+        <w:rPr>
+          <w:rFonts w:ascii="Times New Roman" w:hAnsi="Times New Roman" w:cs="Times New Roman"/>
+          <w:i w:val="0"/>
+          <w:iCs w:val="0"/>
+          <w:color w:val="auto"/>
+          <w:sz w:val="20"/>
+          <w:szCs w:val="20"/>
+        </w:rPr>
+        <w:fldChar w:fldCharType="end"/>
+      </w:r>
+      <w:r>
+        <w:rPr>
+          <w:rFonts w:ascii="Times New Roman" w:hAnsi="Times New Roman" w:cs="Times New Roman"/>
+          <w:i w:val="0"/>
+          <w:iCs w:val="0"/>
+          <w:color w:val="auto"/>
+          <w:sz w:val="20"/>
+          <w:szCs w:val="20"/>
+        </w:rPr>
+        <w:t xml:space="preserve"> – Elegibilidade municipal para redução de reserva legal (Art. 12, Lei 12.651/2012). Fonte: Elaborado pelo autor (2026).</w:t>
+      </w:r>
+    </w:p>
+    <w:p>
+      <w:pPr>
+        <w:spacing w:before="240" w:line="360" w:lineRule="auto"/>
+        <w:jc w:val="both"/>
+        <w:rPr>
+          <w:rFonts w:ascii="Times New Roman" w:hAnsi="Times New Roman" w:cs="Times New Roman"/>
+        </w:rPr>
+      </w:pPr>
+      <w:r>
+        <w:rPr>
+          <w:rFonts w:ascii="Times New Roman" w:hAnsi="Times New Roman" w:cs="Times New Roman"/>
+        </w:rPr>
+        <w:t>4.2 QUANTIFICAÇÃO DA VARIAÇÃO REGULATÓRIA ($\DELTA_{REG}$)</w:t>
+      </w:r>
+    </w:p>
+    <w:p>
+      <w:pPr>
+        <w:spacing w:before="240" w:line="360" w:lineRule="auto"/>
+        <w:jc w:val="both"/>
+        <w:rPr>
+          <w:rFonts w:ascii="Times New Roman" w:hAnsi="Times New Roman" w:cs="Times New Roman"/>
+        </w:rPr>
+      </w:pPr>
+      <w:r>
+        <w:rPr>
+          <w:rFonts w:ascii="Times New Roman" w:hAnsi="Times New Roman" w:cs="Times New Roman"/>
+        </w:rPr>
+        <w:t xml:space="preserve">A simulação espacial quantificou a diferença absoluta do déficit de Reserva Legal entre o cenário de exigência padrão (80%) e o cenário de exigência reduzida (50%). Na amostra de imóveis analisada, o somatório do Delta de Regularização </w:t>
+      </w:r>
+      <w:r>
+        <w:rPr>
+          <w:rFonts w:ascii="Times New Roman" w:hAnsi="Times New Roman" w:cs="Times New Roman"/>
+        </w:rPr>
+        <w:t>(</w:t>
+      </w:r>
+      <m:oMath>
+        <m:sSub>
+          <m:sSubPr>
+            <m:ctrlPr>
+              <w:rPr>
+                <w:rFonts w:ascii="Cambria Math" w:hAnsi="Cambria Math" w:cs="Times New Roman"/>
+                <w:i/>
+              </w:rPr>
+            </m:ctrlPr>
+          </m:sSubPr>
+          <m:e>
+            <m:r>
+              <m:rPr>
+                <m:sty m:val="p"/>
+              </m:rPr>
+              <w:rPr>
+                <w:rFonts w:ascii="Cambria Math" w:hAnsi="Cambria Math" w:cs="Times New Roman"/>
+              </w:rPr>
+              <m:t>Δ</m:t>
+            </m:r>
+            <m:ctrlPr>
+              <w:rPr>
+                <w:rFonts w:ascii="Cambria Math" w:hAnsi="Cambria Math" w:cs="Times New Roman"/>
+              </w:rPr>
+            </m:ctrlPr>
+          </m:e>
+          <m:sub>
+            <m:r>
+              <w:rPr>
+                <w:rFonts w:ascii="Cambria Math" w:hAnsi="Cambria Math" w:cs="Times New Roman"/>
+              </w:rPr>
+              <m:t>reg</m:t>
+            </m:r>
+          </m:sub>
+        </m:sSub>
+      </m:oMath>
+      <w:r>
+        <w:rPr>
+          <w:rFonts w:ascii="Times New Roman" w:hAnsi="Times New Roman" w:cs="Times New Roman"/>
+        </w:rPr>
+        <w:t>) totalizou 5,8 milhões de hectares. Este valor corresponde à área exata de passivo florestal que deixa de ser contabilizada na transição entre os dois cenários, conforme demonstrado na Figura 3.</w:t>
+      </w:r>
+    </w:p>
+    <w:p>
+      <w:pPr>
+        <w:keepNext/>
+        <w:spacing w:before="240" w:line="360" w:lineRule="auto"/>
+        <w:jc w:val="both"/>
+      </w:pPr>
       <w:r>
         <w:rPr>
           <w:rFonts w:ascii="Times New Roman" w:hAnsi="Times New Roman" w:cs="Times New Roman"/>
           <w:b/>
           <w:bCs/>
-        </w:rPr>
-        <w:t>Decreto de 24 de abril de 2013</w:t>
-      </w:r>
-      <w:r>
-        <w:rPr>
-          <w:rFonts w:ascii="Times New Roman" w:hAnsi="Times New Roman" w:cs="Times New Roman"/>
-        </w:rPr>
-        <w:t>. Brasília, DF: Presidência da República, 2013.</w:t>
-      </w:r>
-    </w:p>
-    <w:p>
-      <w:pPr>
-        <w:spacing w:line="360" w:lineRule="auto"/>
-        <w:jc w:val="both"/>
-        <w:rPr>
-          <w:rFonts w:ascii="Times New Roman" w:hAnsi="Times New Roman" w:cs="Times New Roman"/>
-        </w:rPr>
-      </w:pPr>
-      <w:r>
-        <w:rPr>
-          <w:rFonts w:ascii="Times New Roman" w:hAnsi="Times New Roman" w:cs="Times New Roman"/>
-        </w:rPr>
-        <w:t xml:space="preserve">BRASIL. </w:t>
-      </w:r>
-      <w:r>
+          <w:noProof/>
+        </w:rPr>
+        <w:lastRenderedPageBreak/>
+        <w:drawing>
+          <wp:inline distT="0" distB="0" distL="0" distR="0" wp14:anchorId="6A718A77" wp14:editId="70CB150B">
+            <wp:extent cx="5759450" cy="3455670"/>
+            <wp:effectExtent l="19050" t="19050" r="12700" b="11430"/>
+            <wp:docPr id="1195693699" name="Imagem 3"/>
+            <wp:cNvGraphicFramePr>
+              <a:graphicFrameLocks xmlns:a="http://schemas.openxmlformats.org/drawingml/2006/main" noChangeAspect="1"/>
+            </wp:cNvGraphicFramePr>
+            <a:graphic xmlns:a="http://schemas.openxmlformats.org/drawingml/2006/main">
+              <a:graphicData uri="http://schemas.openxmlformats.org/drawingml/2006/picture">
+                <pic:pic xmlns:pic="http://schemas.openxmlformats.org/drawingml/2006/picture">
+                  <pic:nvPicPr>
+                    <pic:cNvPr id="1195693699" name="Imagem 1195693699"/>
+                    <pic:cNvPicPr/>
+                  </pic:nvPicPr>
+                  <pic:blipFill>
+                    <a:blip r:embed="rId8" cstate="print">
+                      <a:extLst>
+                        <a:ext uri="{28A0092B-C50C-407E-A947-70E740481C1C}">
+                          <a14:useLocalDpi xmlns:a14="http://schemas.microsoft.com/office/drawing/2010/main" val="0"/>
+                        </a:ext>
+                      </a:extLst>
+                    </a:blip>
+                    <a:stretch>
+                      <a:fillRect/>
+                    </a:stretch>
+                  </pic:blipFill>
+                  <pic:spPr>
+                    <a:xfrm>
+                      <a:off x="0" y="0"/>
+                      <a:ext cx="5759450" cy="3455670"/>
+                    </a:xfrm>
+                    <a:prstGeom prst="rect">
+                      <a:avLst/>
+                    </a:prstGeom>
+                    <a:ln>
+                      <a:solidFill>
+                        <a:schemeClr val="tx1">
+                          <a:lumMod val="50000"/>
+                          <a:lumOff val="50000"/>
+                        </a:schemeClr>
+                      </a:solidFill>
+                    </a:ln>
+                  </pic:spPr>
+                </pic:pic>
+              </a:graphicData>
+            </a:graphic>
+          </wp:inline>
+        </w:drawing>
+      </w:r>
+    </w:p>
+    <w:p>
+      <w:pPr>
+        <w:pStyle w:val="Legenda"/>
+        <w:jc w:val="both"/>
         <w:rPr>
           <w:rFonts w:ascii="Times New Roman" w:hAnsi="Times New Roman" w:cs="Times New Roman"/>
           <w:b/>
           <w:bCs/>
-        </w:rPr>
-        <w:t>Lei nº 12.651, de 25 de maio de 2012</w:t>
-      </w:r>
-      <w:r>
-        <w:rPr>
-          <w:rFonts w:ascii="Times New Roman" w:hAnsi="Times New Roman" w:cs="Times New Roman"/>
-        </w:rPr>
-        <w:t>. Dispõe sobre a proteção da vegetação nativa; altera as Leis nºs 6.938, de 31 de agosto de 1981, 9.393, de 19 de dezembro de 1996, e 11.428, de 22 de dezembro de 2006; revoga as Leis nºs 4.771, de 15 de setembro de 1965, e 7.754, de 14 de abril de 1989, e a Medida Provisória nº 2.166-67, de 24 de agosto de 2001; e dá outras providências. Diário Oficial da União, Brasília, DF, 28 maio 2012.</w:t>
-      </w:r>
-    </w:p>
-    <w:p>
-      <w:pPr>
-        <w:spacing w:line="360" w:lineRule="auto"/>
-        <w:jc w:val="both"/>
-        <w:rPr>
-          <w:rFonts w:ascii="Times New Roman" w:hAnsi="Times New Roman" w:cs="Times New Roman"/>
-        </w:rPr>
-      </w:pPr>
-      <w:r>
-        <w:rPr>
-          <w:rFonts w:ascii="Times New Roman" w:hAnsi="Times New Roman" w:cs="Times New Roman"/>
-        </w:rPr>
-        <w:t xml:space="preserve">BRASIL. Superior Tribunal de Justiça (2. Turma). </w:t>
-      </w:r>
+          <w:i w:val="0"/>
+          <w:iCs w:val="0"/>
+          <w:color w:val="auto"/>
+          <w:sz w:val="20"/>
+          <w:szCs w:val="20"/>
+        </w:rPr>
+      </w:pPr>
+      <w:r>
+        <w:rPr>
+          <w:rFonts w:ascii="Times New Roman" w:hAnsi="Times New Roman" w:cs="Times New Roman"/>
+          <w:i w:val="0"/>
+          <w:iCs w:val="0"/>
+          <w:color w:val="auto"/>
+          <w:sz w:val="20"/>
+          <w:szCs w:val="20"/>
+        </w:rPr>
+        <w:t xml:space="preserve">Figura </w:t>
+      </w:r>
+      <w:r>
+        <w:rPr>
+          <w:rFonts w:ascii="Times New Roman" w:hAnsi="Times New Roman" w:cs="Times New Roman"/>
+          <w:i w:val="0"/>
+          <w:iCs w:val="0"/>
+          <w:color w:val="auto"/>
+          <w:sz w:val="20"/>
+          <w:szCs w:val="20"/>
+        </w:rPr>
+        <w:fldChar w:fldCharType="begin"/>
+      </w:r>
+      <w:r>
+        <w:rPr>
+          <w:rFonts w:ascii="Times New Roman" w:hAnsi="Times New Roman" w:cs="Times New Roman"/>
+          <w:i w:val="0"/>
+          <w:iCs w:val="0"/>
+          <w:color w:val="auto"/>
+          <w:sz w:val="20"/>
+          <w:szCs w:val="20"/>
+        </w:rPr>
+        <w:instrText xml:space="preserve"> SEQ Figura \* ARABIC </w:instrText>
+      </w:r>
+      <w:r>
+        <w:rPr>
+          <w:rFonts w:ascii="Times New Roman" w:hAnsi="Times New Roman" w:cs="Times New Roman"/>
+          <w:i w:val="0"/>
+          <w:iCs w:val="0"/>
+          <w:color w:val="auto"/>
+          <w:sz w:val="20"/>
+          <w:szCs w:val="20"/>
+        </w:rPr>
+        <w:fldChar w:fldCharType="separate"/>
+      </w:r>
+      <w:r>
+        <w:rPr>
+          <w:rFonts w:ascii="Times New Roman" w:hAnsi="Times New Roman" w:cs="Times New Roman"/>
+          <w:i w:val="0"/>
+          <w:iCs w:val="0"/>
+          <w:noProof/>
+          <w:color w:val="auto"/>
+          <w:sz w:val="20"/>
+          <w:szCs w:val="20"/>
+        </w:rPr>
+        <w:t>3</w:t>
+      </w:r>
+      <w:r>
+        <w:rPr>
+          <w:rFonts w:ascii="Times New Roman" w:hAnsi="Times New Roman" w:cs="Times New Roman"/>
+          <w:i w:val="0"/>
+          <w:iCs w:val="0"/>
+          <w:color w:val="auto"/>
+          <w:sz w:val="20"/>
+          <w:szCs w:val="20"/>
+        </w:rPr>
+        <w:fldChar w:fldCharType="end"/>
+      </w:r>
+      <w:r>
+        <w:rPr>
+          <w:rFonts w:ascii="Times New Roman" w:hAnsi="Times New Roman" w:cs="Times New Roman"/>
+          <w:i w:val="0"/>
+          <w:iCs w:val="0"/>
+          <w:color w:val="auto"/>
+          <w:sz w:val="20"/>
+          <w:szCs w:val="20"/>
+        </w:rPr>
+        <w:t xml:space="preserve"> – Comparativo do déficit de Reserva Legal por cenário em imóveis acima de 4 MF no Estado do Pará. Fonte: Elaborado pelo autor (2026).</w:t>
+      </w:r>
+    </w:p>
+    <w:p>
+      <w:pPr>
+        <w:spacing w:before="240" w:line="360" w:lineRule="auto"/>
+        <w:jc w:val="both"/>
+        <w:rPr>
+          <w:rFonts w:ascii="Times New Roman" w:hAnsi="Times New Roman" w:cs="Times New Roman"/>
+        </w:rPr>
+      </w:pPr>
+      <w:r>
+        <w:rPr>
+          <w:rFonts w:ascii="Times New Roman" w:hAnsi="Times New Roman" w:cs="Times New Roman"/>
+        </w:rPr>
+        <w:t xml:space="preserve">O Delta de Regularização </w:t>
+      </w:r>
+      <w:r>
+        <w:rPr>
+          <w:rFonts w:ascii="Times New Roman" w:hAnsi="Times New Roman" w:cs="Times New Roman"/>
+        </w:rPr>
+        <w:t>(</w:t>
+      </w:r>
+      <m:oMath>
+        <m:sSub>
+          <m:sSubPr>
+            <m:ctrlPr>
+              <w:rPr>
+                <w:rFonts w:ascii="Cambria Math" w:hAnsi="Cambria Math" w:cs="Times New Roman"/>
+                <w:i/>
+              </w:rPr>
+            </m:ctrlPr>
+          </m:sSubPr>
+          <m:e>
+            <m:r>
+              <m:rPr>
+                <m:sty m:val="p"/>
+              </m:rPr>
+              <w:rPr>
+                <w:rFonts w:ascii="Cambria Math" w:hAnsi="Cambria Math" w:cs="Times New Roman"/>
+              </w:rPr>
+              <m:t>Δ</m:t>
+            </m:r>
+            <m:ctrlPr>
+              <w:rPr>
+                <w:rFonts w:ascii="Cambria Math" w:hAnsi="Cambria Math" w:cs="Times New Roman"/>
+              </w:rPr>
+            </m:ctrlPr>
+          </m:e>
+          <m:sub>
+            <m:r>
+              <w:rPr>
+                <w:rFonts w:ascii="Cambria Math" w:hAnsi="Cambria Math" w:cs="Times New Roman"/>
+              </w:rPr>
+              <m:t>reg</m:t>
+            </m:r>
+          </m:sub>
+        </m:sSub>
+      </m:oMath>
+      <w:r>
+        <w:rPr>
+          <w:rFonts w:ascii="Times New Roman" w:hAnsi="Times New Roman" w:cs="Times New Roman"/>
+        </w:rPr>
+        <w:t>), correspondente à área que deixa de ser legalmente exigida para recomposição ou compensação, atinge a escala dos milhões de hectares. Este volume traduz a alteração da conformidade documental de um conjunto de propriedades que, sob a métrica dos 80%, apresentavam passivos de elevada complexidade financeira e operacional para efeitos de restauração florestal.</w:t>
+      </w:r>
+    </w:p>
+    <w:p>
+      <w:pPr>
+        <w:spacing w:before="240" w:line="360" w:lineRule="auto"/>
+        <w:jc w:val="both"/>
+        <w:rPr>
+          <w:rFonts w:ascii="Times New Roman" w:hAnsi="Times New Roman" w:cs="Times New Roman"/>
+        </w:rPr>
+      </w:pPr>
+      <w:r>
+        <w:rPr>
+          <w:rFonts w:ascii="Times New Roman" w:hAnsi="Times New Roman" w:cs="Times New Roman"/>
+        </w:rPr>
+        <w:t>4.3 PERFIL DO PASSIVO: CONSOLIDADO VS. PÓS-2008</w:t>
+      </w:r>
+    </w:p>
+    <w:p>
+      <w:pPr>
+        <w:spacing w:before="240" w:line="360" w:lineRule="auto"/>
+        <w:ind w:firstLine="709"/>
+        <w:jc w:val="both"/>
+        <w:rPr>
+          <w:rFonts w:ascii="Times New Roman" w:hAnsi="Times New Roman" w:cs="Times New Roman"/>
+        </w:rPr>
+      </w:pPr>
+      <w:r>
+        <w:rPr>
+          <w:rFonts w:ascii="Times New Roman" w:hAnsi="Times New Roman" w:cs="Times New Roman"/>
+        </w:rPr>
+        <w:t>A integração com o referencial da Coleção 9 do MapBiomas permitiu estratificar o défice florestal em dois períodos, balizados pela data de 22 de julho de 2008. Os dados quantificam a existência de 6,5 milhões de hectares classificados como Passivo Consolidado (Figura 4) e 2,2 milhões de hectares como Passivo Não Consolidado (Figura 5). O processamento dos cenários demonstra que a totalidade da área convertida no Delta de Regularização</w:t>
+      </w:r>
+      <w:r>
+        <w:rPr>
+          <w:rFonts w:ascii="Times New Roman" w:hAnsi="Times New Roman" w:cs="Times New Roman"/>
+        </w:rPr>
+        <w:t xml:space="preserve"> </w:t>
+      </w:r>
+      <w:r>
+        <w:rPr>
+          <w:rFonts w:ascii="Times New Roman" w:hAnsi="Times New Roman" w:cs="Times New Roman"/>
+        </w:rPr>
+        <w:t>(</w:t>
+      </w:r>
+      <m:oMath>
+        <m:sSub>
+          <m:sSubPr>
+            <m:ctrlPr>
+              <w:rPr>
+                <w:rFonts w:ascii="Cambria Math" w:hAnsi="Cambria Math" w:cs="Times New Roman"/>
+                <w:i/>
+              </w:rPr>
+            </m:ctrlPr>
+          </m:sSubPr>
+          <m:e>
+            <m:r>
+              <m:rPr>
+                <m:sty m:val="p"/>
+              </m:rPr>
+              <w:rPr>
+                <w:rFonts w:ascii="Cambria Math" w:hAnsi="Cambria Math" w:cs="Times New Roman"/>
+              </w:rPr>
+              <m:t>Δ</m:t>
+            </m:r>
+            <m:ctrlPr>
+              <w:rPr>
+                <w:rFonts w:ascii="Cambria Math" w:hAnsi="Cambria Math" w:cs="Times New Roman"/>
+              </w:rPr>
+            </m:ctrlPr>
+          </m:e>
+          <m:sub>
+            <m:r>
+              <w:rPr>
+                <w:rFonts w:ascii="Cambria Math" w:hAnsi="Cambria Math" w:cs="Times New Roman"/>
+              </w:rPr>
+              <m:t>reg</m:t>
+            </m:r>
+          </m:sub>
+        </m:sSub>
+      </m:oMath>
+      <w:r>
+        <w:rPr>
+          <w:rFonts w:ascii="Times New Roman" w:hAnsi="Times New Roman" w:cs="Times New Roman"/>
+        </w:rPr>
+        <w:t xml:space="preserve">), </w:t>
+      </w:r>
+      <w:r>
+        <w:rPr>
+          <w:rFonts w:ascii="Times New Roman" w:hAnsi="Times New Roman" w:cs="Times New Roman"/>
+        </w:rPr>
+        <w:t>é deduzida exclusivamente do montante de passivo consolidado. O volume de passivo não consolidado mantém-se matematicamente inalterado em ambas as simulações (80% e 50%), atestando a aderência espacial do modelo ao marco temporal da legislação vigente.</w:t>
+      </w:r>
+    </w:p>
+    <w:p>
+      <w:pPr>
+        <w:keepNext/>
+        <w:spacing w:before="240" w:line="360" w:lineRule="auto"/>
+        <w:jc w:val="both"/>
+      </w:pPr>
       <w:r>
         <w:rPr>
           <w:rFonts w:ascii="Times New Roman" w:hAnsi="Times New Roman" w:cs="Times New Roman"/>
           <w:b/>
           <w:bCs/>
-        </w:rPr>
-        <w:t>Recurso Especial nº 1.284.069/RS</w:t>
-      </w:r>
-      <w:r>
-        <w:rPr>
-          <w:rFonts w:ascii="Times New Roman" w:hAnsi="Times New Roman" w:cs="Times New Roman"/>
-        </w:rPr>
-        <w:t>. Relator: Ministro Herman Benjamin. Julgado em 17 nov. 2016. DJe 28 ago. 2020.</w:t>
-      </w:r>
-    </w:p>
-    <w:p>
-      <w:pPr>
-        <w:spacing w:line="360" w:lineRule="auto"/>
-        <w:jc w:val="both"/>
-        <w:rPr>
-          <w:rFonts w:ascii="Times New Roman" w:hAnsi="Times New Roman" w:cs="Times New Roman"/>
-        </w:rPr>
-      </w:pPr>
-      <w:r>
-        <w:rPr>
-          <w:rFonts w:ascii="Times New Roman" w:hAnsi="Times New Roman" w:cs="Times New Roman"/>
-        </w:rPr>
-        <w:t xml:space="preserve">BRASIL. Superior Tribunal de Justiça (2. Turma). </w:t>
-      </w:r>
+          <w:noProof/>
+        </w:rPr>
+        <w:lastRenderedPageBreak/>
+        <w:drawing>
+          <wp:inline distT="0" distB="0" distL="0" distR="0" wp14:anchorId="104CD70D" wp14:editId="676BF852">
+            <wp:extent cx="5759450" cy="3455670"/>
+            <wp:effectExtent l="19050" t="19050" r="12700" b="11430"/>
+            <wp:docPr id="733104055" name="Imagem 4"/>
+            <wp:cNvGraphicFramePr>
+              <a:graphicFrameLocks xmlns:a="http://schemas.openxmlformats.org/drawingml/2006/main" noChangeAspect="1"/>
+            </wp:cNvGraphicFramePr>
+            <a:graphic xmlns:a="http://schemas.openxmlformats.org/drawingml/2006/main">
+              <a:graphicData uri="http://schemas.openxmlformats.org/drawingml/2006/picture">
+                <pic:pic xmlns:pic="http://schemas.openxmlformats.org/drawingml/2006/picture">
+                  <pic:nvPicPr>
+                    <pic:cNvPr id="733104055" name="Imagem 733104055"/>
+                    <pic:cNvPicPr/>
+                  </pic:nvPicPr>
+                  <pic:blipFill>
+                    <a:blip r:embed="rId9" cstate="print">
+                      <a:extLst>
+                        <a:ext uri="{28A0092B-C50C-407E-A947-70E740481C1C}">
+                          <a14:useLocalDpi xmlns:a14="http://schemas.microsoft.com/office/drawing/2010/main" val="0"/>
+                        </a:ext>
+                      </a:extLst>
+                    </a:blip>
+                    <a:stretch>
+                      <a:fillRect/>
+                    </a:stretch>
+                  </pic:blipFill>
+                  <pic:spPr>
+                    <a:xfrm>
+                      <a:off x="0" y="0"/>
+                      <a:ext cx="5759450" cy="3455670"/>
+                    </a:xfrm>
+                    <a:prstGeom prst="rect">
+                      <a:avLst/>
+                    </a:prstGeom>
+                    <a:ln>
+                      <a:solidFill>
+                        <a:schemeClr val="tx1">
+                          <a:lumMod val="50000"/>
+                          <a:lumOff val="50000"/>
+                        </a:schemeClr>
+                      </a:solidFill>
+                    </a:ln>
+                  </pic:spPr>
+                </pic:pic>
+              </a:graphicData>
+            </a:graphic>
+          </wp:inline>
+        </w:drawing>
+      </w:r>
+    </w:p>
+    <w:p>
+      <w:pPr>
+        <w:pStyle w:val="Legenda"/>
+        <w:jc w:val="both"/>
+        <w:rPr>
+          <w:rFonts w:ascii="Times New Roman" w:hAnsi="Times New Roman" w:cs="Times New Roman"/>
+          <w:i w:val="0"/>
+          <w:iCs w:val="0"/>
+          <w:color w:val="auto"/>
+          <w:sz w:val="20"/>
+          <w:szCs w:val="20"/>
+        </w:rPr>
+      </w:pPr>
+      <w:r>
+        <w:rPr>
+          <w:rFonts w:ascii="Times New Roman" w:hAnsi="Times New Roman" w:cs="Times New Roman"/>
+          <w:i w:val="0"/>
+          <w:iCs w:val="0"/>
+          <w:color w:val="auto"/>
+          <w:sz w:val="20"/>
+          <w:szCs w:val="20"/>
+        </w:rPr>
+        <w:t xml:space="preserve">Figura </w:t>
+      </w:r>
+      <w:r>
+        <w:rPr>
+          <w:rFonts w:ascii="Times New Roman" w:hAnsi="Times New Roman" w:cs="Times New Roman"/>
+          <w:i w:val="0"/>
+          <w:iCs w:val="0"/>
+          <w:color w:val="auto"/>
+          <w:sz w:val="20"/>
+          <w:szCs w:val="20"/>
+        </w:rPr>
+        <w:fldChar w:fldCharType="begin"/>
+      </w:r>
+      <w:r>
+        <w:rPr>
+          <w:rFonts w:ascii="Times New Roman" w:hAnsi="Times New Roman" w:cs="Times New Roman"/>
+          <w:i w:val="0"/>
+          <w:iCs w:val="0"/>
+          <w:color w:val="auto"/>
+          <w:sz w:val="20"/>
+          <w:szCs w:val="20"/>
+        </w:rPr>
+        <w:instrText xml:space="preserve"> SEQ Figura \* ARABIC </w:instrText>
+      </w:r>
+      <w:r>
+        <w:rPr>
+          <w:rFonts w:ascii="Times New Roman" w:hAnsi="Times New Roman" w:cs="Times New Roman"/>
+          <w:i w:val="0"/>
+          <w:iCs w:val="0"/>
+          <w:color w:val="auto"/>
+          <w:sz w:val="20"/>
+          <w:szCs w:val="20"/>
+        </w:rPr>
+        <w:fldChar w:fldCharType="separate"/>
+      </w:r>
+      <w:r>
+        <w:rPr>
+          <w:rFonts w:ascii="Times New Roman" w:hAnsi="Times New Roman" w:cs="Times New Roman"/>
+          <w:i w:val="0"/>
+          <w:iCs w:val="0"/>
+          <w:noProof/>
+          <w:color w:val="auto"/>
+          <w:sz w:val="20"/>
+          <w:szCs w:val="20"/>
+        </w:rPr>
+        <w:t>4</w:t>
+      </w:r>
+      <w:r>
+        <w:rPr>
+          <w:rFonts w:ascii="Times New Roman" w:hAnsi="Times New Roman" w:cs="Times New Roman"/>
+          <w:i w:val="0"/>
+          <w:iCs w:val="0"/>
+          <w:color w:val="auto"/>
+          <w:sz w:val="20"/>
+          <w:szCs w:val="20"/>
+        </w:rPr>
+        <w:fldChar w:fldCharType="end"/>
+      </w:r>
+      <w:r>
+        <w:rPr>
+          <w:rFonts w:ascii="Times New Roman" w:hAnsi="Times New Roman" w:cs="Times New Roman"/>
+          <w:i w:val="0"/>
+          <w:iCs w:val="0"/>
+          <w:color w:val="auto"/>
+          <w:sz w:val="20"/>
+          <w:szCs w:val="20"/>
+        </w:rPr>
+        <w:t xml:space="preserve"> – Distribuição do Passivo Consolidado (supressões anteriores a 22 de julho de 2008) nos imóveis rurais acima de 4 módulos fiscais no Estado do Pará. Fonte: Elaborado pelo autor (2026).</w:t>
+      </w:r>
+    </w:p>
+    <w:p>
+      <w:pPr>
+        <w:keepNext/>
+        <w:spacing w:before="240" w:line="360" w:lineRule="auto"/>
+        <w:jc w:val="both"/>
+      </w:pPr>
       <w:r>
         <w:rPr>
           <w:rFonts w:ascii="Times New Roman" w:hAnsi="Times New Roman" w:cs="Times New Roman"/>
           <w:b/>
           <w:bCs/>
-        </w:rPr>
-        <w:t>Recurso Especial nº 1.644.195/SC</w:t>
-      </w:r>
-      <w:r>
-        <w:rPr>
-          <w:rFonts w:ascii="Times New Roman" w:hAnsi="Times New Roman" w:cs="Times New Roman"/>
-        </w:rPr>
-        <w:t>. Relator: Ministro Herman Benjamin. Julgado em 27 abr. 2017. DJe 08 mai. 2017.</w:t>
-      </w:r>
-    </w:p>
-    <w:p>
-      <w:pPr>
-        <w:spacing w:line="360" w:lineRule="auto"/>
-        <w:jc w:val="both"/>
-        <w:rPr>
-          <w:rFonts w:ascii="Times New Roman" w:hAnsi="Times New Roman" w:cs="Times New Roman"/>
-        </w:rPr>
-      </w:pPr>
-      <w:r>
-        <w:rPr>
-          <w:rFonts w:ascii="Times New Roman" w:hAnsi="Times New Roman" w:cs="Times New Roman"/>
-        </w:rPr>
-        <w:lastRenderedPageBreak/>
-        <w:t xml:space="preserve">BRASIL. </w:t>
-      </w:r>
+          <w:noProof/>
+        </w:rPr>
+        <w:drawing>
+          <wp:inline distT="0" distB="0" distL="0" distR="0" wp14:anchorId="3D888902" wp14:editId="68F057FA">
+            <wp:extent cx="5759450" cy="3455670"/>
+            <wp:effectExtent l="19050" t="19050" r="12700" b="11430"/>
+            <wp:docPr id="1153197786" name="Imagem 5"/>
+            <wp:cNvGraphicFramePr>
+              <a:graphicFrameLocks xmlns:a="http://schemas.openxmlformats.org/drawingml/2006/main" noChangeAspect="1"/>
+            </wp:cNvGraphicFramePr>
+            <a:graphic xmlns:a="http://schemas.openxmlformats.org/drawingml/2006/main">
+              <a:graphicData uri="http://schemas.openxmlformats.org/drawingml/2006/picture">
+                <pic:pic xmlns:pic="http://schemas.openxmlformats.org/drawingml/2006/picture">
+                  <pic:nvPicPr>
+                    <pic:cNvPr id="1153197786" name="Imagem 1153197786"/>
+                    <pic:cNvPicPr/>
+                  </pic:nvPicPr>
+                  <pic:blipFill>
+                    <a:blip r:embed="rId10" cstate="print">
+                      <a:extLst>
+                        <a:ext uri="{28A0092B-C50C-407E-A947-70E740481C1C}">
+                          <a14:useLocalDpi xmlns:a14="http://schemas.microsoft.com/office/drawing/2010/main" val="0"/>
+                        </a:ext>
+                      </a:extLst>
+                    </a:blip>
+                    <a:stretch>
+                      <a:fillRect/>
+                    </a:stretch>
+                  </pic:blipFill>
+                  <pic:spPr>
+                    <a:xfrm>
+                      <a:off x="0" y="0"/>
+                      <a:ext cx="5759450" cy="3455670"/>
+                    </a:xfrm>
+                    <a:prstGeom prst="rect">
+                      <a:avLst/>
+                    </a:prstGeom>
+                    <a:ln>
+                      <a:solidFill>
+                        <a:schemeClr val="tx1">
+                          <a:lumMod val="50000"/>
+                          <a:lumOff val="50000"/>
+                        </a:schemeClr>
+                      </a:solidFill>
+                    </a:ln>
+                  </pic:spPr>
+                </pic:pic>
+              </a:graphicData>
+            </a:graphic>
+          </wp:inline>
+        </w:drawing>
+      </w:r>
+    </w:p>
+    <w:p>
+      <w:pPr>
+        <w:pStyle w:val="Legenda"/>
+        <w:jc w:val="both"/>
+        <w:rPr>
+          <w:rFonts w:ascii="Times New Roman" w:hAnsi="Times New Roman" w:cs="Times New Roman"/>
+          <w:i w:val="0"/>
+          <w:iCs w:val="0"/>
+          <w:color w:val="auto"/>
+          <w:sz w:val="20"/>
+          <w:szCs w:val="20"/>
+        </w:rPr>
+      </w:pPr>
+      <w:r>
+        <w:rPr>
+          <w:rFonts w:ascii="Times New Roman" w:hAnsi="Times New Roman" w:cs="Times New Roman"/>
+          <w:i w:val="0"/>
+          <w:iCs w:val="0"/>
+          <w:color w:val="auto"/>
+          <w:sz w:val="20"/>
+          <w:szCs w:val="20"/>
+        </w:rPr>
+        <w:t xml:space="preserve">Figura </w:t>
+      </w:r>
+      <w:r>
+        <w:rPr>
+          <w:rFonts w:ascii="Times New Roman" w:hAnsi="Times New Roman" w:cs="Times New Roman"/>
+          <w:i w:val="0"/>
+          <w:iCs w:val="0"/>
+          <w:color w:val="auto"/>
+          <w:sz w:val="20"/>
+          <w:szCs w:val="20"/>
+        </w:rPr>
+        <w:fldChar w:fldCharType="begin"/>
+      </w:r>
+      <w:r>
+        <w:rPr>
+          <w:rFonts w:ascii="Times New Roman" w:hAnsi="Times New Roman" w:cs="Times New Roman"/>
+          <w:i w:val="0"/>
+          <w:iCs w:val="0"/>
+          <w:color w:val="auto"/>
+          <w:sz w:val="20"/>
+          <w:szCs w:val="20"/>
+        </w:rPr>
+        <w:instrText xml:space="preserve"> SEQ Figura \* ARABIC </w:instrText>
+      </w:r>
+      <w:r>
+        <w:rPr>
+          <w:rFonts w:ascii="Times New Roman" w:hAnsi="Times New Roman" w:cs="Times New Roman"/>
+          <w:i w:val="0"/>
+          <w:iCs w:val="0"/>
+          <w:color w:val="auto"/>
+          <w:sz w:val="20"/>
+          <w:szCs w:val="20"/>
+        </w:rPr>
+        <w:fldChar w:fldCharType="separate"/>
+      </w:r>
+      <w:r>
+        <w:rPr>
+          <w:rFonts w:ascii="Times New Roman" w:hAnsi="Times New Roman" w:cs="Times New Roman"/>
+          <w:i w:val="0"/>
+          <w:iCs w:val="0"/>
+          <w:noProof/>
+          <w:color w:val="auto"/>
+          <w:sz w:val="20"/>
+          <w:szCs w:val="20"/>
+        </w:rPr>
+        <w:t>5</w:t>
+      </w:r>
+      <w:r>
+        <w:rPr>
+          <w:rFonts w:ascii="Times New Roman" w:hAnsi="Times New Roman" w:cs="Times New Roman"/>
+          <w:i w:val="0"/>
+          <w:iCs w:val="0"/>
+          <w:color w:val="auto"/>
+          <w:sz w:val="20"/>
+          <w:szCs w:val="20"/>
+        </w:rPr>
+        <w:fldChar w:fldCharType="end"/>
+      </w:r>
+      <w:r>
+        <w:rPr>
+          <w:rFonts w:ascii="Times New Roman" w:hAnsi="Times New Roman" w:cs="Times New Roman"/>
+          <w:i w:val="0"/>
+          <w:iCs w:val="0"/>
+          <w:color w:val="auto"/>
+          <w:sz w:val="20"/>
+          <w:szCs w:val="20"/>
+        </w:rPr>
+        <w:t xml:space="preserve"> – Distribuição do Passivo Não Consolidado (supressões posteriores a 22 de julho de 2008) nos imóveis rurais acima de 4 módulos fiscais no Estado do Pará. Fonte: Elaborado pelo autor (2026).</w:t>
+      </w:r>
+    </w:p>
+    <w:p>
+      <w:pPr>
+        <w:spacing w:before="240" w:line="360" w:lineRule="auto"/>
+        <w:jc w:val="both"/>
+        <w:rPr>
+          <w:rFonts w:ascii="Times New Roman" w:hAnsi="Times New Roman" w:cs="Times New Roman"/>
+        </w:rPr>
+      </w:pPr>
+      <w:r>
+        <w:rPr>
+          <w:rFonts w:ascii="Times New Roman" w:hAnsi="Times New Roman" w:cs="Times New Roman"/>
+        </w:rPr>
+        <w:t>4.4 DISTRIBUIÇÃO MUNICIPAL E ÁREAS DE MAIOR INCIDÊNCIA</w:t>
+      </w:r>
+    </w:p>
+    <w:p>
+      <w:pPr>
+        <w:spacing w:before="240" w:line="360" w:lineRule="auto"/>
+        <w:jc w:val="both"/>
+        <w:rPr>
+          <w:rFonts w:ascii="Times New Roman" w:hAnsi="Times New Roman" w:cs="Times New Roman"/>
+        </w:rPr>
+      </w:pPr>
       <w:r>
         <w:rPr>
           <w:rFonts w:ascii="Times New Roman" w:hAnsi="Times New Roman" w:cs="Times New Roman"/>
           <w:b/>
           <w:bCs/>
         </w:rPr>
+        <w:t>4.4 Distribuição Municipal e Áreas de Maior Incidência</w:t>
+      </w:r>
+    </w:p>
+    <w:p>
+      <w:pPr>
+        <w:spacing w:before="240" w:line="360" w:lineRule="auto"/>
+        <w:ind w:firstLine="709"/>
+        <w:jc w:val="both"/>
+        <w:rPr>
+          <w:rFonts w:ascii="Times New Roman" w:hAnsi="Times New Roman" w:cs="Times New Roman"/>
+        </w:rPr>
+      </w:pPr>
+      <w:r>
+        <w:rPr>
+          <w:rFonts w:ascii="Times New Roman" w:hAnsi="Times New Roman" w:cs="Times New Roman"/>
+        </w:rPr>
+        <w:lastRenderedPageBreak/>
+        <w:t>A agregação espacial dos dados permitiu quantificar o volume do Delta de Regularização (</w:t>
+      </w:r>
+      <m:oMath>
+        <m:sSub>
+          <m:sSubPr>
+            <m:ctrlPr>
+              <w:rPr>
+                <w:rFonts w:ascii="Cambria Math" w:hAnsi="Cambria Math" w:cs="Times New Roman"/>
+                <w:i/>
+              </w:rPr>
+            </m:ctrlPr>
+          </m:sSubPr>
+          <m:e>
+            <m:r>
+              <m:rPr>
+                <m:sty m:val="p"/>
+              </m:rPr>
+              <w:rPr>
+                <w:rFonts w:ascii="Cambria Math" w:hAnsi="Cambria Math" w:cs="Times New Roman"/>
+              </w:rPr>
+              <m:t>Δ</m:t>
+            </m:r>
+            <m:ctrlPr>
+              <w:rPr>
+                <w:rFonts w:ascii="Cambria Math" w:hAnsi="Cambria Math" w:cs="Times New Roman"/>
+              </w:rPr>
+            </m:ctrlPr>
+          </m:e>
+          <m:sub>
+            <m:r>
+              <w:rPr>
+                <w:rFonts w:ascii="Cambria Math" w:hAnsi="Cambria Math" w:cs="Times New Roman"/>
+              </w:rPr>
+              <m:t>reg</m:t>
+            </m:r>
+          </m:sub>
+        </m:sSub>
+      </m:oMath>
+      <w:r>
+        <w:rPr>
+          <w:rFonts w:ascii="Times New Roman" w:hAnsi="Times New Roman" w:cs="Times New Roman"/>
+        </w:rPr>
+        <w:t xml:space="preserve">), ao nível municipal. A análise do ranking demonstra uma assimetria na distribuição destes valores, com concentração aguda em municípios específicos (Figura 6). O município de São Félix do Xingu regista o maior valor absoluto, contabilizando 790.303 hectares de  </w:t>
+      </w:r>
+      <m:oMath>
+        <m:sSub>
+          <m:sSubPr>
+            <m:ctrlPr>
+              <w:rPr>
+                <w:rFonts w:ascii="Cambria Math" w:hAnsi="Cambria Math" w:cs="Times New Roman"/>
+                <w:i/>
+              </w:rPr>
+            </m:ctrlPr>
+          </m:sSubPr>
+          <m:e>
+            <m:r>
+              <m:rPr>
+                <m:sty m:val="p"/>
+              </m:rPr>
+              <w:rPr>
+                <w:rFonts w:ascii="Cambria Math" w:hAnsi="Cambria Math" w:cs="Times New Roman"/>
+              </w:rPr>
+              <m:t>Δ</m:t>
+            </m:r>
+            <m:ctrlPr>
+              <w:rPr>
+                <w:rFonts w:ascii="Cambria Math" w:hAnsi="Cambria Math" w:cs="Times New Roman"/>
+              </w:rPr>
+            </m:ctrlPr>
+          </m:e>
+          <m:sub>
+            <m:r>
+              <w:rPr>
+                <w:rFonts w:ascii="Cambria Math" w:hAnsi="Cambria Math" w:cs="Times New Roman"/>
+              </w:rPr>
+              <m:t>reg</m:t>
+            </m:r>
+          </m:sub>
+        </m:sSub>
+      </m:oMath>
+      <w:r>
+        <w:rPr>
+          <w:rFonts w:ascii="Times New Roman" w:hAnsi="Times New Roman" w:cs="Times New Roman"/>
+        </w:rPr>
+        <w:t xml:space="preserve"> </w:t>
+      </w:r>
+      <w:r>
+        <w:rPr>
+          <w:rFonts w:ascii="Times New Roman" w:hAnsi="Times New Roman" w:cs="Times New Roman"/>
+        </w:rPr>
+        <w:t>distribuídos por 2.271 imóveis rurais. Na sequência, identificam-se Altamira (240.786 hectares), Ourilândia do Norte (63.549 hectares) e Jacareacanga (35.759 hectares). A espacialização destes resultados evidencia que os maiores volumes de área subtraída do défice concentram-se predominantemente nas regiões central e sudeste do território analisado (Figura 7).</w:t>
+      </w:r>
+    </w:p>
+    <w:p>
+      <w:pPr>
+        <w:keepNext/>
+        <w:spacing w:before="240" w:line="360" w:lineRule="auto"/>
+        <w:jc w:val="both"/>
+      </w:pPr>
+      <w:r>
+        <w:rPr>
+          <w:rFonts w:ascii="Times New Roman" w:hAnsi="Times New Roman" w:cs="Times New Roman"/>
+          <w:b/>
+          <w:bCs/>
+          <w:noProof/>
+        </w:rPr>
+        <w:drawing>
+          <wp:inline distT="0" distB="0" distL="0" distR="0" wp14:anchorId="192EA388" wp14:editId="6FBDBA8D">
+            <wp:extent cx="5759450" cy="3455670"/>
+            <wp:effectExtent l="19050" t="19050" r="12700" b="11430"/>
+            <wp:docPr id="907158545" name="Imagem 7"/>
+            <wp:cNvGraphicFramePr>
+              <a:graphicFrameLocks xmlns:a="http://schemas.openxmlformats.org/drawingml/2006/main" noChangeAspect="1"/>
+            </wp:cNvGraphicFramePr>
+            <a:graphic xmlns:a="http://schemas.openxmlformats.org/drawingml/2006/main">
+              <a:graphicData uri="http://schemas.openxmlformats.org/drawingml/2006/picture">
+                <pic:pic xmlns:pic="http://schemas.openxmlformats.org/drawingml/2006/picture">
+                  <pic:nvPicPr>
+                    <pic:cNvPr id="907158545" name="Imagem 907158545"/>
+                    <pic:cNvPicPr/>
+                  </pic:nvPicPr>
+                  <pic:blipFill>
+                    <a:blip r:embed="rId11" cstate="print">
+                      <a:extLst>
+                        <a:ext uri="{28A0092B-C50C-407E-A947-70E740481C1C}">
+                          <a14:useLocalDpi xmlns:a14="http://schemas.microsoft.com/office/drawing/2010/main" val="0"/>
+                        </a:ext>
+                      </a:extLst>
+                    </a:blip>
+                    <a:stretch>
+                      <a:fillRect/>
+                    </a:stretch>
+                  </pic:blipFill>
+                  <pic:spPr>
+                    <a:xfrm>
+                      <a:off x="0" y="0"/>
+                      <a:ext cx="5759450" cy="3455670"/>
+                    </a:xfrm>
+                    <a:prstGeom prst="rect">
+                      <a:avLst/>
+                    </a:prstGeom>
+                    <a:ln>
+                      <a:solidFill>
+                        <a:schemeClr val="tx1">
+                          <a:lumMod val="50000"/>
+                          <a:lumOff val="50000"/>
+                        </a:schemeClr>
+                      </a:solidFill>
+                    </a:ln>
+                  </pic:spPr>
+                </pic:pic>
+              </a:graphicData>
+            </a:graphic>
+          </wp:inline>
+        </w:drawing>
+      </w:r>
+    </w:p>
+    <w:p>
+      <w:pPr>
+        <w:pStyle w:val="Legenda"/>
+        <w:jc w:val="both"/>
+        <w:rPr>
+          <w:rFonts w:ascii="Times New Roman" w:hAnsi="Times New Roman" w:cs="Times New Roman"/>
+          <w:i w:val="0"/>
+          <w:iCs w:val="0"/>
+          <w:color w:val="auto"/>
+          <w:sz w:val="20"/>
+          <w:szCs w:val="20"/>
+        </w:rPr>
+      </w:pPr>
+      <w:r>
+        <w:rPr>
+          <w:rFonts w:ascii="Times New Roman" w:hAnsi="Times New Roman" w:cs="Times New Roman"/>
+          <w:i w:val="0"/>
+          <w:iCs w:val="0"/>
+          <w:color w:val="auto"/>
+          <w:sz w:val="20"/>
+          <w:szCs w:val="20"/>
+        </w:rPr>
+        <w:t xml:space="preserve">Figura </w:t>
+      </w:r>
+      <w:r>
+        <w:rPr>
+          <w:rFonts w:ascii="Times New Roman" w:hAnsi="Times New Roman" w:cs="Times New Roman"/>
+          <w:i w:val="0"/>
+          <w:iCs w:val="0"/>
+          <w:color w:val="auto"/>
+          <w:sz w:val="20"/>
+          <w:szCs w:val="20"/>
+        </w:rPr>
+        <w:fldChar w:fldCharType="begin"/>
+      </w:r>
+      <w:r>
+        <w:rPr>
+          <w:rFonts w:ascii="Times New Roman" w:hAnsi="Times New Roman" w:cs="Times New Roman"/>
+          <w:i w:val="0"/>
+          <w:iCs w:val="0"/>
+          <w:color w:val="auto"/>
+          <w:sz w:val="20"/>
+          <w:szCs w:val="20"/>
+        </w:rPr>
+        <w:instrText xml:space="preserve"> SEQ Figura \* ARABIC </w:instrText>
+      </w:r>
+      <w:r>
+        <w:rPr>
+          <w:rFonts w:ascii="Times New Roman" w:hAnsi="Times New Roman" w:cs="Times New Roman"/>
+          <w:i w:val="0"/>
+          <w:iCs w:val="0"/>
+          <w:color w:val="auto"/>
+          <w:sz w:val="20"/>
+          <w:szCs w:val="20"/>
+        </w:rPr>
+        <w:fldChar w:fldCharType="separate"/>
+      </w:r>
+      <w:r>
+        <w:rPr>
+          <w:rFonts w:ascii="Times New Roman" w:hAnsi="Times New Roman" w:cs="Times New Roman"/>
+          <w:i w:val="0"/>
+          <w:iCs w:val="0"/>
+          <w:noProof/>
+          <w:color w:val="auto"/>
+          <w:sz w:val="20"/>
+          <w:szCs w:val="20"/>
+        </w:rPr>
+        <w:t>6</w:t>
+      </w:r>
+      <w:r>
+        <w:rPr>
+          <w:rFonts w:ascii="Times New Roman" w:hAnsi="Times New Roman" w:cs="Times New Roman"/>
+          <w:i w:val="0"/>
+          <w:iCs w:val="0"/>
+          <w:color w:val="auto"/>
+          <w:sz w:val="20"/>
+          <w:szCs w:val="20"/>
+        </w:rPr>
+        <w:fldChar w:fldCharType="end"/>
+      </w:r>
+      <w:r>
+        <w:rPr>
+          <w:rFonts w:ascii="Times New Roman" w:hAnsi="Times New Roman" w:cs="Times New Roman"/>
+          <w:i w:val="0"/>
+          <w:iCs w:val="0"/>
+          <w:color w:val="auto"/>
+          <w:sz w:val="20"/>
+          <w:szCs w:val="20"/>
+        </w:rPr>
+        <w:t xml:space="preserve"> </w:t>
+      </w:r>
+      <w:r>
+        <w:rPr>
+          <w:rFonts w:ascii="Times New Roman" w:hAnsi="Times New Roman" w:cs="Times New Roman"/>
+          <w:i w:val="0"/>
+          <w:iCs w:val="0"/>
+          <w:color w:val="auto"/>
+          <w:sz w:val="20"/>
+          <w:szCs w:val="20"/>
+        </w:rPr>
+        <w:t>– Ranking dos 10 municípios com maior volume de Delta de Regularização em imóveis rurais acima de 4 módulos fiscais no Pará. Fonte: Elaborado pelo autor (2026).</w:t>
+      </w:r>
+    </w:p>
+    <w:p>
+      <w:pPr>
+        <w:keepNext/>
+        <w:spacing w:before="240" w:line="360" w:lineRule="auto"/>
+        <w:jc w:val="both"/>
+      </w:pPr>
+      <w:r>
+        <w:rPr>
+          <w:rFonts w:ascii="Times New Roman" w:hAnsi="Times New Roman" w:cs="Times New Roman"/>
+          <w:i/>
+          <w:iCs/>
+          <w:noProof/>
+        </w:rPr>
+        <w:lastRenderedPageBreak/>
+        <w:drawing>
+          <wp:inline distT="0" distB="0" distL="0" distR="0" wp14:anchorId="18A59511" wp14:editId="2B86DC4A">
+            <wp:extent cx="5759450" cy="4072890"/>
+            <wp:effectExtent l="19050" t="19050" r="12700" b="22860"/>
+            <wp:docPr id="1693271300" name="Imagem 8"/>
+            <wp:cNvGraphicFramePr>
+              <a:graphicFrameLocks xmlns:a="http://schemas.openxmlformats.org/drawingml/2006/main" noChangeAspect="1"/>
+            </wp:cNvGraphicFramePr>
+            <a:graphic xmlns:a="http://schemas.openxmlformats.org/drawingml/2006/main">
+              <a:graphicData uri="http://schemas.openxmlformats.org/drawingml/2006/picture">
+                <pic:pic xmlns:pic="http://schemas.openxmlformats.org/drawingml/2006/picture">
+                  <pic:nvPicPr>
+                    <pic:cNvPr id="1693271300" name="Imagem 1693271300"/>
+                    <pic:cNvPicPr/>
+                  </pic:nvPicPr>
+                  <pic:blipFill>
+                    <a:blip r:embed="rId12" cstate="print">
+                      <a:extLst>
+                        <a:ext uri="{28A0092B-C50C-407E-A947-70E740481C1C}">
+                          <a14:useLocalDpi xmlns:a14="http://schemas.microsoft.com/office/drawing/2010/main" val="0"/>
+                        </a:ext>
+                      </a:extLst>
+                    </a:blip>
+                    <a:stretch>
+                      <a:fillRect/>
+                    </a:stretch>
+                  </pic:blipFill>
+                  <pic:spPr>
+                    <a:xfrm>
+                      <a:off x="0" y="0"/>
+                      <a:ext cx="5759450" cy="4072890"/>
+                    </a:xfrm>
+                    <a:prstGeom prst="rect">
+                      <a:avLst/>
+                    </a:prstGeom>
+                    <a:ln>
+                      <a:solidFill>
+                        <a:schemeClr val="tx1">
+                          <a:lumMod val="50000"/>
+                          <a:lumOff val="50000"/>
+                        </a:schemeClr>
+                      </a:solidFill>
+                    </a:ln>
+                  </pic:spPr>
+                </pic:pic>
+              </a:graphicData>
+            </a:graphic>
+          </wp:inline>
+        </w:drawing>
+      </w:r>
+    </w:p>
+    <w:p>
+      <w:pPr>
+        <w:pStyle w:val="Legenda"/>
+        <w:jc w:val="both"/>
+        <w:rPr>
+          <w:i w:val="0"/>
+          <w:iCs w:val="0"/>
+          <w:color w:val="auto"/>
+        </w:rPr>
+      </w:pPr>
+      <w:r>
+        <w:rPr>
+          <w:i w:val="0"/>
+          <w:iCs w:val="0"/>
+          <w:color w:val="auto"/>
+        </w:rPr>
+        <w:t xml:space="preserve">Figura </w:t>
+      </w:r>
+      <w:r>
+        <w:rPr>
+          <w:i w:val="0"/>
+          <w:iCs w:val="0"/>
+          <w:color w:val="auto"/>
+        </w:rPr>
+        <w:fldChar w:fldCharType="begin"/>
+      </w:r>
+      <w:r>
+        <w:rPr>
+          <w:i w:val="0"/>
+          <w:iCs w:val="0"/>
+          <w:color w:val="auto"/>
+        </w:rPr>
+        <w:instrText xml:space="preserve"> SEQ Figura \* ARABIC </w:instrText>
+      </w:r>
+      <w:r>
+        <w:rPr>
+          <w:i w:val="0"/>
+          <w:iCs w:val="0"/>
+          <w:color w:val="auto"/>
+        </w:rPr>
+        <w:fldChar w:fldCharType="separate"/>
+      </w:r>
+      <w:r>
+        <w:rPr>
+          <w:i w:val="0"/>
+          <w:iCs w:val="0"/>
+          <w:noProof/>
+          <w:color w:val="auto"/>
+        </w:rPr>
+        <w:t>7</w:t>
+      </w:r>
+      <w:r>
+        <w:rPr>
+          <w:i w:val="0"/>
+          <w:iCs w:val="0"/>
+          <w:color w:val="auto"/>
+        </w:rPr>
+        <w:fldChar w:fldCharType="end"/>
+      </w:r>
+      <w:r>
+        <w:rPr>
+          <w:i w:val="0"/>
+          <w:iCs w:val="0"/>
+          <w:color w:val="auto"/>
+        </w:rPr>
+        <w:t xml:space="preserve"> – Distribuição espacial do Delta de Regularização ($\Delta_{reg}$) por município no Estado do Pará. Fonte: Elaborado pelo autor (2026).</w:t>
+      </w:r>
+    </w:p>
+    <w:p>
+      <w:pPr>
+        <w:spacing w:before="240" w:line="360" w:lineRule="auto"/>
+        <w:jc w:val="both"/>
+        <w:rPr>
+          <w:rFonts w:ascii="Times New Roman" w:hAnsi="Times New Roman" w:cs="Times New Roman"/>
+          <w:b/>
+          <w:bCs/>
+        </w:rPr>
+      </w:pPr>
+      <w:r>
+        <w:rPr>
+          <w:rFonts w:ascii="Times New Roman" w:hAnsi="Times New Roman" w:cs="Times New Roman"/>
+          <w:b/>
+          <w:bCs/>
+        </w:rPr>
+        <w:t>4.5 Tipologia do Passivo e Potencial de Conformidade</w:t>
+      </w:r>
+    </w:p>
+    <w:p>
+      <w:pPr>
+        <w:spacing w:after="0" w:line="360" w:lineRule="auto"/>
+        <w:ind w:firstLine="709"/>
+        <w:jc w:val="both"/>
+        <w:rPr>
+          <w:rFonts w:ascii="Times New Roman" w:hAnsi="Times New Roman" w:cs="Times New Roman"/>
+        </w:rPr>
+      </w:pPr>
+      <w:r>
+        <w:rPr>
+          <w:rFonts w:ascii="Times New Roman" w:hAnsi="Times New Roman" w:cs="Times New Roman"/>
+        </w:rPr>
+        <w:t>A análise qualitativa estratificou os 16.525 imóveis localizados em municípios elegíveis de acordo com a natureza temporal do défice detectado e a magnitude da supressão pós-2008. Os dados revelam que 44,8% da amostra (7.402 imóveis) não apresenta passivo não consolidado, indicando a ausência de supressão de vegetação nativa após o marco de 22 de julho de 2008 (Figura 8).</w:t>
+      </w:r>
+    </w:p>
+    <w:p>
+      <w:pPr>
+        <w:keepNext/>
+        <w:spacing w:after="0" w:line="360" w:lineRule="auto"/>
+        <w:jc w:val="center"/>
+      </w:pPr>
+      <w:r>
+        <w:rPr>
+          <w:rFonts w:ascii="Times New Roman" w:hAnsi="Times New Roman" w:cs="Times New Roman"/>
+          <w:noProof/>
+        </w:rPr>
+        <w:lastRenderedPageBreak/>
+        <w:drawing>
+          <wp:inline distT="0" distB="0" distL="0" distR="0" wp14:anchorId="1501EF11" wp14:editId="44E472AF">
+            <wp:extent cx="2878668" cy="3120390"/>
+            <wp:effectExtent l="19050" t="19050" r="17145" b="22860"/>
+            <wp:docPr id="481501230" name="Imagem 9"/>
+            <wp:cNvGraphicFramePr>
+              <a:graphicFrameLocks xmlns:a="http://schemas.openxmlformats.org/drawingml/2006/main" noChangeAspect="1"/>
+            </wp:cNvGraphicFramePr>
+            <a:graphic xmlns:a="http://schemas.openxmlformats.org/drawingml/2006/main">
+              <a:graphicData uri="http://schemas.openxmlformats.org/drawingml/2006/picture">
+                <pic:pic xmlns:pic="http://schemas.openxmlformats.org/drawingml/2006/picture">
+                  <pic:nvPicPr>
+                    <pic:cNvPr id="481501230" name="Imagem 481501230"/>
+                    <pic:cNvPicPr/>
+                  </pic:nvPicPr>
+                  <pic:blipFill rotWithShape="1">
+                    <a:blip r:embed="rId13" cstate="print">
+                      <a:extLst>
+                        <a:ext uri="{28A0092B-C50C-407E-A947-70E740481C1C}">
+                          <a14:useLocalDpi xmlns:a14="http://schemas.microsoft.com/office/drawing/2010/main" val="0"/>
+                        </a:ext>
+                      </a:extLst>
+                    </a:blip>
+                    <a:srcRect l="15678" r="15126"/>
+                    <a:stretch>
+                      <a:fillRect/>
+                    </a:stretch>
+                  </pic:blipFill>
+                  <pic:spPr bwMode="auto">
+                    <a:xfrm>
+                      <a:off x="0" y="0"/>
+                      <a:ext cx="2891560" cy="3134364"/>
+                    </a:xfrm>
+                    <a:prstGeom prst="rect">
+                      <a:avLst/>
+                    </a:prstGeom>
+                    <a:ln w="9525" cap="flat" cmpd="sng" algn="ctr">
+                      <a:solidFill>
+                        <a:sysClr val="windowText" lastClr="000000">
+                          <a:lumMod val="50000"/>
+                          <a:lumOff val="50000"/>
+                        </a:sysClr>
+                      </a:solidFill>
+                      <a:prstDash val="solid"/>
+                      <a:round/>
+                      <a:headEnd type="none" w="med" len="med"/>
+                      <a:tailEnd type="none" w="med" len="med"/>
+                      <a:extLst>
+                        <a:ext uri="{C807C97D-BFC1-408E-A445-0C87EB9F89A2}">
+                          <ask:lineSketchStyleProps xmlns:ask="http://schemas.microsoft.com/office/drawing/2018/sketchyshapes" sd="0">
+                            <a:custGeom>
+                              <a:avLst/>
+                              <a:gdLst/>
+                              <a:ahLst/>
+                              <a:cxnLst/>
+                              <a:rect l="0" t="0" r="0" b="0"/>
+                              <a:pathLst/>
+                            </a:custGeom>
+                            <ask:type/>
+                          </ask:lineSketchStyleProps>
+                        </a:ext>
+                      </a:extLst>
+                    </a:ln>
+                    <a:extLst>
+                      <a:ext uri="{53640926-AAD7-44D8-BBD7-CCE9431645EC}">
+                        <a14:shadowObscured xmlns:a14="http://schemas.microsoft.com/office/drawing/2010/main"/>
+                      </a:ext>
+                    </a:extLst>
+                  </pic:spPr>
+                </pic:pic>
+              </a:graphicData>
+            </a:graphic>
+          </wp:inline>
+        </w:drawing>
+      </w:r>
+    </w:p>
+    <w:p>
+      <w:pPr>
+        <w:pStyle w:val="Legenda"/>
+        <w:jc w:val="both"/>
+        <w:rPr>
+          <w:rFonts w:ascii="Times New Roman" w:hAnsi="Times New Roman" w:cs="Times New Roman"/>
+          <w:i w:val="0"/>
+          <w:iCs w:val="0"/>
+          <w:color w:val="auto"/>
+          <w:sz w:val="20"/>
+          <w:szCs w:val="20"/>
+        </w:rPr>
+      </w:pPr>
+      <w:r>
+        <w:rPr>
+          <w:rFonts w:ascii="Times New Roman" w:hAnsi="Times New Roman" w:cs="Times New Roman"/>
+          <w:i w:val="0"/>
+          <w:iCs w:val="0"/>
+          <w:color w:val="auto"/>
+          <w:sz w:val="20"/>
+          <w:szCs w:val="20"/>
+        </w:rPr>
+        <w:t xml:space="preserve">Figura </w:t>
+      </w:r>
+      <w:r>
+        <w:rPr>
+          <w:rFonts w:ascii="Times New Roman" w:hAnsi="Times New Roman" w:cs="Times New Roman"/>
+          <w:i w:val="0"/>
+          <w:iCs w:val="0"/>
+          <w:color w:val="auto"/>
+          <w:sz w:val="20"/>
+          <w:szCs w:val="20"/>
+        </w:rPr>
+        <w:fldChar w:fldCharType="begin"/>
+      </w:r>
+      <w:r>
+        <w:rPr>
+          <w:rFonts w:ascii="Times New Roman" w:hAnsi="Times New Roman" w:cs="Times New Roman"/>
+          <w:i w:val="0"/>
+          <w:iCs w:val="0"/>
+          <w:color w:val="auto"/>
+          <w:sz w:val="20"/>
+          <w:szCs w:val="20"/>
+        </w:rPr>
+        <w:instrText xml:space="preserve"> SEQ Figura \* ARABIC </w:instrText>
+      </w:r>
+      <w:r>
+        <w:rPr>
+          <w:rFonts w:ascii="Times New Roman" w:hAnsi="Times New Roman" w:cs="Times New Roman"/>
+          <w:i w:val="0"/>
+          <w:iCs w:val="0"/>
+          <w:color w:val="auto"/>
+          <w:sz w:val="20"/>
+          <w:szCs w:val="20"/>
+        </w:rPr>
+        <w:fldChar w:fldCharType="separate"/>
+      </w:r>
+      <w:r>
+        <w:rPr>
+          <w:rFonts w:ascii="Times New Roman" w:hAnsi="Times New Roman" w:cs="Times New Roman"/>
+          <w:i w:val="0"/>
+          <w:iCs w:val="0"/>
+          <w:noProof/>
+          <w:color w:val="auto"/>
+          <w:sz w:val="20"/>
+          <w:szCs w:val="20"/>
+        </w:rPr>
+        <w:t>8</w:t>
+      </w:r>
+      <w:r>
+        <w:rPr>
+          <w:rFonts w:ascii="Times New Roman" w:hAnsi="Times New Roman" w:cs="Times New Roman"/>
+          <w:i w:val="0"/>
+          <w:iCs w:val="0"/>
+          <w:color w:val="auto"/>
+          <w:sz w:val="20"/>
+          <w:szCs w:val="20"/>
+        </w:rPr>
+        <w:fldChar w:fldCharType="end"/>
+      </w:r>
+      <w:r>
+        <w:rPr>
+          <w:rFonts w:ascii="Times New Roman" w:hAnsi="Times New Roman" w:cs="Times New Roman"/>
+          <w:i w:val="0"/>
+          <w:iCs w:val="0"/>
+          <w:color w:val="auto"/>
+          <w:sz w:val="20"/>
+          <w:szCs w:val="20"/>
+        </w:rPr>
+        <w:t xml:space="preserve"> – Proporção de imóveis rurais elegíveis segundo a ocorrência de passivo não consolidado (pós-2008). Elaborado pelo autor (2026).</w:t>
+      </w:r>
+    </w:p>
+    <w:p>
+      <w:pPr>
+        <w:spacing w:after="0" w:line="360" w:lineRule="auto"/>
+        <w:ind w:firstLine="709"/>
+        <w:rPr>
+          <w:rFonts w:ascii="Times New Roman" w:hAnsi="Times New Roman" w:cs="Times New Roman"/>
+        </w:rPr>
+      </w:pPr>
+      <w:r>
+        <w:rPr>
+          <w:rFonts w:ascii="Times New Roman" w:hAnsi="Times New Roman" w:cs="Times New Roman"/>
+          <w:i/>
+          <w:iCs/>
+        </w:rPr>
+        <w:t xml:space="preserve"> </w:t>
+      </w:r>
+      <w:r>
+        <w:rPr>
+          <w:rFonts w:ascii="Times New Roman" w:hAnsi="Times New Roman" w:cs="Times New Roman"/>
+        </w:rPr>
+        <w:t>A desagregação por status de imóvel identifica cinco categorias exclusivas (Figura 9). O grupo classificado como "Elegível - Apenas Passivo Consolidado" totaliza 4.838 propriedades, representando o segmento com maior potencial de regularização imediata via Artigo 12. Por outro lado, o somatório dos imóveis que apresentam passivo não consolidado ("Apenas Passivo Não Consolidado" e "Ambos Passivos") perfaz 9.123 unidades (55,2% dos elegíveis), mantendo a necessidade de recomposição integral das áreas suprimidas após 2008.</w:t>
+      </w:r>
+    </w:p>
+    <w:p>
+      <w:pPr>
+        <w:keepNext/>
+        <w:spacing w:after="0" w:line="360" w:lineRule="auto"/>
+        <w:jc w:val="center"/>
+      </w:pPr>
+      <w:r>
+        <w:rPr>
+          <w:rFonts w:ascii="Times New Roman" w:hAnsi="Times New Roman" w:cs="Times New Roman"/>
+          <w:b/>
+          <w:bCs/>
+          <w:noProof/>
+        </w:rPr>
+        <w:drawing>
+          <wp:inline distT="0" distB="0" distL="0" distR="0" wp14:anchorId="43CBA3B5" wp14:editId="52C1F07A">
+            <wp:extent cx="5368290" cy="3220974"/>
+            <wp:effectExtent l="19050" t="19050" r="22860" b="17780"/>
+            <wp:docPr id="320232888" name="Imagem 10"/>
+            <wp:cNvGraphicFramePr>
+              <a:graphicFrameLocks xmlns:a="http://schemas.openxmlformats.org/drawingml/2006/main" noChangeAspect="1"/>
+            </wp:cNvGraphicFramePr>
+            <a:graphic xmlns:a="http://schemas.openxmlformats.org/drawingml/2006/main">
+              <a:graphicData uri="http://schemas.openxmlformats.org/drawingml/2006/picture">
+                <pic:pic xmlns:pic="http://schemas.openxmlformats.org/drawingml/2006/picture">
+                  <pic:nvPicPr>
+                    <pic:cNvPr id="320232888" name="Imagem 320232888"/>
+                    <pic:cNvPicPr/>
+                  </pic:nvPicPr>
+                  <pic:blipFill>
+                    <a:blip r:embed="rId14" cstate="print">
+                      <a:extLst>
+                        <a:ext uri="{28A0092B-C50C-407E-A947-70E740481C1C}">
+                          <a14:useLocalDpi xmlns:a14="http://schemas.microsoft.com/office/drawing/2010/main" val="0"/>
+                        </a:ext>
+                      </a:extLst>
+                    </a:blip>
+                    <a:stretch>
+                      <a:fillRect/>
+                    </a:stretch>
+                  </pic:blipFill>
+                  <pic:spPr>
+                    <a:xfrm>
+                      <a:off x="0" y="0"/>
+                      <a:ext cx="5369743" cy="3221846"/>
+                    </a:xfrm>
+                    <a:prstGeom prst="rect">
+                      <a:avLst/>
+                    </a:prstGeom>
+                    <a:ln>
+                      <a:solidFill>
+                        <a:schemeClr val="tx1">
+                          <a:lumMod val="50000"/>
+                          <a:lumOff val="50000"/>
+                        </a:schemeClr>
+                      </a:solidFill>
+                    </a:ln>
+                  </pic:spPr>
+                </pic:pic>
+              </a:graphicData>
+            </a:graphic>
+          </wp:inline>
+        </w:drawing>
+      </w:r>
+    </w:p>
+    <w:p>
+      <w:pPr>
+        <w:pStyle w:val="Legenda"/>
+        <w:jc w:val="both"/>
+        <w:rPr>
+          <w:rFonts w:ascii="Times New Roman" w:hAnsi="Times New Roman" w:cs="Times New Roman"/>
+          <w:i w:val="0"/>
+          <w:iCs w:val="0"/>
+          <w:color w:val="auto"/>
+          <w:sz w:val="20"/>
+          <w:szCs w:val="20"/>
+        </w:rPr>
+      </w:pPr>
+      <w:r>
+        <w:rPr>
+          <w:rFonts w:ascii="Times New Roman" w:hAnsi="Times New Roman" w:cs="Times New Roman"/>
+          <w:i w:val="0"/>
+          <w:iCs w:val="0"/>
+          <w:color w:val="auto"/>
+          <w:sz w:val="20"/>
+          <w:szCs w:val="20"/>
+        </w:rPr>
+        <w:t xml:space="preserve">Figura </w:t>
+      </w:r>
+      <w:r>
+        <w:rPr>
+          <w:rFonts w:ascii="Times New Roman" w:hAnsi="Times New Roman" w:cs="Times New Roman"/>
+          <w:i w:val="0"/>
+          <w:iCs w:val="0"/>
+          <w:color w:val="auto"/>
+          <w:sz w:val="20"/>
+          <w:szCs w:val="20"/>
+        </w:rPr>
+        <w:fldChar w:fldCharType="begin"/>
+      </w:r>
+      <w:r>
+        <w:rPr>
+          <w:rFonts w:ascii="Times New Roman" w:hAnsi="Times New Roman" w:cs="Times New Roman"/>
+          <w:i w:val="0"/>
+          <w:iCs w:val="0"/>
+          <w:color w:val="auto"/>
+          <w:sz w:val="20"/>
+          <w:szCs w:val="20"/>
+        </w:rPr>
+        <w:instrText xml:space="preserve"> SEQ Figura \* ARABIC </w:instrText>
+      </w:r>
+      <w:r>
+        <w:rPr>
+          <w:rFonts w:ascii="Times New Roman" w:hAnsi="Times New Roman" w:cs="Times New Roman"/>
+          <w:i w:val="0"/>
+          <w:iCs w:val="0"/>
+          <w:color w:val="auto"/>
+          <w:sz w:val="20"/>
+          <w:szCs w:val="20"/>
+        </w:rPr>
+        <w:fldChar w:fldCharType="separate"/>
+      </w:r>
+      <w:r>
+        <w:rPr>
+          <w:rFonts w:ascii="Times New Roman" w:hAnsi="Times New Roman" w:cs="Times New Roman"/>
+          <w:i w:val="0"/>
+          <w:iCs w:val="0"/>
+          <w:noProof/>
+          <w:color w:val="auto"/>
+          <w:sz w:val="20"/>
+          <w:szCs w:val="20"/>
+        </w:rPr>
+        <w:t>9</w:t>
+      </w:r>
+      <w:r>
+        <w:rPr>
+          <w:rFonts w:ascii="Times New Roman" w:hAnsi="Times New Roman" w:cs="Times New Roman"/>
+          <w:i w:val="0"/>
+          <w:iCs w:val="0"/>
+          <w:color w:val="auto"/>
+          <w:sz w:val="20"/>
+          <w:szCs w:val="20"/>
+        </w:rPr>
+        <w:fldChar w:fldCharType="end"/>
+      </w:r>
+      <w:r>
+        <w:rPr>
+          <w:rFonts w:ascii="Times New Roman" w:hAnsi="Times New Roman" w:cs="Times New Roman"/>
+          <w:i w:val="0"/>
+          <w:iCs w:val="0"/>
+          <w:color w:val="auto"/>
+          <w:sz w:val="20"/>
+          <w:szCs w:val="20"/>
+        </w:rPr>
+        <w:t xml:space="preserve"> – Quantitativo de imóveis rurais elegíveis por categoria de status de passivo ambiental. Elaborado pelo autor (2026).</w:t>
+      </w:r>
+    </w:p>
+    <w:p>
+      <w:pPr>
+        <w:spacing w:after="0" w:line="360" w:lineRule="auto"/>
+        <w:ind w:firstLine="709"/>
+        <w:jc w:val="both"/>
+        <w:rPr>
+          <w:rFonts w:ascii="Times New Roman" w:hAnsi="Times New Roman" w:cs="Times New Roman"/>
+        </w:rPr>
+      </w:pPr>
+      <w:r>
+        <w:rPr>
+          <w:rFonts w:ascii="Times New Roman" w:hAnsi="Times New Roman" w:cs="Times New Roman"/>
+        </w:rPr>
+        <w:lastRenderedPageBreak/>
+        <w:t>A comparação do impacto médio da redução demonstra que os imóveis sem passivo não consolidado registram um Delta de Regularização ($\Delta_{reg}$) médio de 185,6 hectares, valor ligeiramente superior aos 181,9 hectares de média observados no grupo com passivo recente (Figura 10).</w:t>
+      </w:r>
+    </w:p>
+    <w:p>
+      <w:pPr>
+        <w:keepNext/>
+        <w:spacing w:after="0" w:line="360" w:lineRule="auto"/>
+        <w:jc w:val="center"/>
+      </w:pPr>
+      <w:r>
+        <w:rPr>
+          <w:rFonts w:ascii="Times New Roman" w:hAnsi="Times New Roman" w:cs="Times New Roman"/>
+          <w:b/>
+          <w:bCs/>
+          <w:noProof/>
+        </w:rPr>
+        <w:drawing>
+          <wp:inline distT="0" distB="0" distL="0" distR="0" wp14:anchorId="7F927DF7" wp14:editId="1E7335D2">
+            <wp:extent cx="4888230" cy="3666442"/>
+            <wp:effectExtent l="19050" t="19050" r="26670" b="10795"/>
+            <wp:docPr id="1996467611" name="Imagem 11"/>
+            <wp:cNvGraphicFramePr>
+              <a:graphicFrameLocks xmlns:a="http://schemas.openxmlformats.org/drawingml/2006/main" noChangeAspect="1"/>
+            </wp:cNvGraphicFramePr>
+            <a:graphic xmlns:a="http://schemas.openxmlformats.org/drawingml/2006/main">
+              <a:graphicData uri="http://schemas.openxmlformats.org/drawingml/2006/picture">
+                <pic:pic xmlns:pic="http://schemas.openxmlformats.org/drawingml/2006/picture">
+                  <pic:nvPicPr>
+                    <pic:cNvPr id="1996467611" name="Imagem 1996467611"/>
+                    <pic:cNvPicPr/>
+                  </pic:nvPicPr>
+                  <pic:blipFill>
+                    <a:blip r:embed="rId15" cstate="print">
+                      <a:extLst>
+                        <a:ext uri="{28A0092B-C50C-407E-A947-70E740481C1C}">
+                          <a14:useLocalDpi xmlns:a14="http://schemas.microsoft.com/office/drawing/2010/main" val="0"/>
+                        </a:ext>
+                      </a:extLst>
+                    </a:blip>
+                    <a:stretch>
+                      <a:fillRect/>
+                    </a:stretch>
+                  </pic:blipFill>
+                  <pic:spPr>
+                    <a:xfrm>
+                      <a:off x="0" y="0"/>
+                      <a:ext cx="4900820" cy="3675886"/>
+                    </a:xfrm>
+                    <a:prstGeom prst="rect">
+                      <a:avLst/>
+                    </a:prstGeom>
+                    <a:ln>
+                      <a:solidFill>
+                        <a:schemeClr val="tx1">
+                          <a:lumMod val="50000"/>
+                          <a:lumOff val="50000"/>
+                        </a:schemeClr>
+                      </a:solidFill>
+                    </a:ln>
+                  </pic:spPr>
+                </pic:pic>
+              </a:graphicData>
+            </a:graphic>
+          </wp:inline>
+        </w:drawing>
+      </w:r>
+    </w:p>
+    <w:p>
+      <w:pPr>
+        <w:pStyle w:val="Legenda"/>
+        <w:jc w:val="both"/>
+        <w:rPr>
+          <w:rFonts w:ascii="Times New Roman" w:hAnsi="Times New Roman" w:cs="Times New Roman"/>
+          <w:i w:val="0"/>
+          <w:iCs w:val="0"/>
+          <w:color w:val="auto"/>
+          <w:sz w:val="20"/>
+          <w:szCs w:val="20"/>
+        </w:rPr>
+      </w:pPr>
+      <w:r>
+        <w:rPr>
+          <w:rFonts w:ascii="Times New Roman" w:hAnsi="Times New Roman" w:cs="Times New Roman"/>
+          <w:i w:val="0"/>
+          <w:iCs w:val="0"/>
+          <w:color w:val="auto"/>
+          <w:sz w:val="20"/>
+          <w:szCs w:val="20"/>
+        </w:rPr>
+        <w:t xml:space="preserve">Figura </w:t>
+      </w:r>
+      <w:r>
+        <w:rPr>
+          <w:rFonts w:ascii="Times New Roman" w:hAnsi="Times New Roman" w:cs="Times New Roman"/>
+          <w:i w:val="0"/>
+          <w:iCs w:val="0"/>
+          <w:color w:val="auto"/>
+          <w:sz w:val="20"/>
+          <w:szCs w:val="20"/>
+        </w:rPr>
+        <w:fldChar w:fldCharType="begin"/>
+      </w:r>
+      <w:r>
+        <w:rPr>
+          <w:rFonts w:ascii="Times New Roman" w:hAnsi="Times New Roman" w:cs="Times New Roman"/>
+          <w:i w:val="0"/>
+          <w:iCs w:val="0"/>
+          <w:color w:val="auto"/>
+          <w:sz w:val="20"/>
+          <w:szCs w:val="20"/>
+        </w:rPr>
+        <w:instrText xml:space="preserve"> SEQ Figura \* ARABIC </w:instrText>
+      </w:r>
+      <w:r>
+        <w:rPr>
+          <w:rFonts w:ascii="Times New Roman" w:hAnsi="Times New Roman" w:cs="Times New Roman"/>
+          <w:i w:val="0"/>
+          <w:iCs w:val="0"/>
+          <w:color w:val="auto"/>
+          <w:sz w:val="20"/>
+          <w:szCs w:val="20"/>
+        </w:rPr>
+        <w:fldChar w:fldCharType="separate"/>
+      </w:r>
+      <w:r>
+        <w:rPr>
+          <w:rFonts w:ascii="Times New Roman" w:hAnsi="Times New Roman" w:cs="Times New Roman"/>
+          <w:i w:val="0"/>
+          <w:iCs w:val="0"/>
+          <w:noProof/>
+          <w:color w:val="auto"/>
+          <w:sz w:val="20"/>
+          <w:szCs w:val="20"/>
+        </w:rPr>
+        <w:t>10</w:t>
+      </w:r>
+      <w:r>
+        <w:rPr>
+          <w:rFonts w:ascii="Times New Roman" w:hAnsi="Times New Roman" w:cs="Times New Roman"/>
+          <w:i w:val="0"/>
+          <w:iCs w:val="0"/>
+          <w:color w:val="auto"/>
+          <w:sz w:val="20"/>
+          <w:szCs w:val="20"/>
+        </w:rPr>
+        <w:fldChar w:fldCharType="end"/>
+      </w:r>
+      <w:r>
+        <w:rPr>
+          <w:rFonts w:ascii="Times New Roman" w:hAnsi="Times New Roman" w:cs="Times New Roman"/>
+          <w:i w:val="0"/>
+          <w:iCs w:val="0"/>
+          <w:color w:val="auto"/>
+          <w:sz w:val="20"/>
+          <w:szCs w:val="20"/>
+        </w:rPr>
+        <w:t xml:space="preserve"> – Comparativo do Delta de Regularização \Delta_{reg} médio entre imóveis elegíveis com e sem passivo não consolidado. Elaborado pelo autor (2026).</w:t>
+      </w:r>
+    </w:p>
+    <w:p>
+      <w:pPr>
+        <w:spacing w:after="0" w:line="360" w:lineRule="auto"/>
+        <w:ind w:firstLine="709"/>
+        <w:jc w:val="both"/>
+        <w:rPr>
+          <w:rFonts w:ascii="Times New Roman" w:hAnsi="Times New Roman" w:cs="Times New Roman"/>
+        </w:rPr>
+      </w:pPr>
+      <w:r>
+        <w:rPr>
+          <w:rFonts w:ascii="Times New Roman" w:hAnsi="Times New Roman" w:cs="Times New Roman"/>
+        </w:rPr>
+        <w:t>Por fim, a estratificação por magnitude do passivo não consolidado indica que, entre os imóveis com supressão pós-2008, 4.620 propriedades apresentam défices de até 50 hectares (classe "Pequeno"), enquanto 520 imóveis registram passivos superiores a 500 hectares (classe "Muito Grande").</w:t>
+      </w:r>
+    </w:p>
+    <w:p>
+      <w:pPr>
+        <w:spacing w:before="240" w:line="360" w:lineRule="auto"/>
+        <w:jc w:val="both"/>
+        <w:rPr>
+          <w:rFonts w:ascii="Times New Roman" w:hAnsi="Times New Roman" w:cs="Times New Roman"/>
+        </w:rPr>
+      </w:pPr>
+      <w:r>
+        <w:rPr>
+          <w:rFonts w:ascii="Times New Roman" w:hAnsi="Times New Roman" w:cs="Times New Roman"/>
+          <w:b/>
+          <w:bCs/>
+        </w:rPr>
+        <w:t>5 CONCLUSÃO</w:t>
+      </w:r>
+    </w:p>
+    <w:p>
+      <w:pPr>
+        <w:spacing w:before="240" w:line="360" w:lineRule="auto"/>
+        <w:jc w:val="both"/>
+        <w:rPr>
+          <w:rFonts w:ascii="Times New Roman" w:hAnsi="Times New Roman" w:cs="Times New Roman"/>
+        </w:rPr>
+      </w:pPr>
+      <w:r>
+        <w:rPr>
+          <w:rFonts w:ascii="Times New Roman" w:hAnsi="Times New Roman" w:cs="Times New Roman"/>
+          <w:b/>
+          <w:bCs/>
+        </w:rPr>
+        <w:t>6 REFERÊNCIAS</w:t>
+      </w:r>
+    </w:p>
+    <w:p>
+      <w:pPr>
+        <w:spacing w:line="360" w:lineRule="auto"/>
+        <w:jc w:val="both"/>
+        <w:rPr>
+          <w:rFonts w:ascii="Times New Roman" w:hAnsi="Times New Roman" w:cs="Times New Roman"/>
+        </w:rPr>
+      </w:pPr>
+      <w:r>
+        <w:rPr>
+          <w:rFonts w:ascii="Times New Roman" w:hAnsi="Times New Roman" w:cs="Times New Roman"/>
+        </w:rPr>
+        <w:t xml:space="preserve">ALMEIDA, C. A. de et al. </w:t>
+      </w:r>
+      <w:r>
+        <w:rPr>
+          <w:rFonts w:ascii="Times New Roman" w:hAnsi="Times New Roman" w:cs="Times New Roman"/>
+          <w:b/>
+          <w:bCs/>
+        </w:rPr>
+        <w:t>Metodologia utilizada nos sistemas PRODES e DETER</w:t>
+      </w:r>
+      <w:r>
+        <w:rPr>
+          <w:rFonts w:ascii="Times New Roman" w:hAnsi="Times New Roman" w:cs="Times New Roman"/>
+        </w:rPr>
+        <w:t>. 2. ed. São José dos Campos: INPE, 2022.</w:t>
+      </w:r>
+    </w:p>
+    <w:p>
+      <w:pPr>
+        <w:spacing w:line="360" w:lineRule="auto"/>
+        <w:jc w:val="both"/>
+        <w:rPr>
+          <w:rFonts w:ascii="Times New Roman" w:hAnsi="Times New Roman" w:cs="Times New Roman"/>
+        </w:rPr>
+      </w:pPr>
+      <w:r>
+        <w:rPr>
+          <w:rFonts w:ascii="Times New Roman" w:hAnsi="Times New Roman" w:cs="Times New Roman"/>
+        </w:rPr>
+        <w:t xml:space="preserve">BRASIL. </w:t>
+      </w:r>
+      <w:r>
+        <w:rPr>
+          <w:rFonts w:ascii="Times New Roman" w:hAnsi="Times New Roman" w:cs="Times New Roman"/>
+          <w:b/>
+          <w:bCs/>
+        </w:rPr>
+        <w:t>Decreto de 24 de abril de 2013</w:t>
+      </w:r>
+      <w:r>
+        <w:rPr>
+          <w:rFonts w:ascii="Times New Roman" w:hAnsi="Times New Roman" w:cs="Times New Roman"/>
+        </w:rPr>
+        <w:t>. Brasília, DF: Presidência da República, 2013.</w:t>
+      </w:r>
+    </w:p>
+    <w:p>
+      <w:pPr>
+        <w:spacing w:line="360" w:lineRule="auto"/>
+        <w:jc w:val="both"/>
+        <w:rPr>
+          <w:rFonts w:ascii="Times New Roman" w:hAnsi="Times New Roman" w:cs="Times New Roman"/>
+        </w:rPr>
+      </w:pPr>
+      <w:r>
+        <w:rPr>
+          <w:rFonts w:ascii="Times New Roman" w:hAnsi="Times New Roman" w:cs="Times New Roman"/>
+        </w:rPr>
+        <w:t xml:space="preserve">BRASIL. </w:t>
+      </w:r>
+      <w:r>
+        <w:rPr>
+          <w:rFonts w:ascii="Times New Roman" w:hAnsi="Times New Roman" w:cs="Times New Roman"/>
+          <w:b/>
+          <w:bCs/>
+        </w:rPr>
+        <w:t>Lei nº 12.651, de 25 de maio de 2012</w:t>
+      </w:r>
+      <w:r>
+        <w:rPr>
+          <w:rFonts w:ascii="Times New Roman" w:hAnsi="Times New Roman" w:cs="Times New Roman"/>
+        </w:rPr>
+        <w:t xml:space="preserve">. Dispõe sobre a proteção da vegetação nativa; altera as Leis nºs 6.938, de 31 de agosto de 1981, 9.393, de 19 de dezembro de 1996, e 11.428, </w:t>
+      </w:r>
+      <w:r>
+        <w:rPr>
+          <w:rFonts w:ascii="Times New Roman" w:hAnsi="Times New Roman" w:cs="Times New Roman"/>
+        </w:rPr>
+        <w:lastRenderedPageBreak/>
+        <w:t>de 22 de dezembro de 2006; revoga as Leis nºs 4.771, de 15 de setembro de 1965, e 7.754, de 14 de abril de 1989, e a Medida Provisória nº 2.166-67, de 24 de agosto de 2001; e dá outras providências. Diário Oficial da União, Brasília, DF, 28 maio 2012.</w:t>
+      </w:r>
+    </w:p>
+    <w:p>
+      <w:pPr>
+        <w:spacing w:line="360" w:lineRule="auto"/>
+        <w:jc w:val="both"/>
+        <w:rPr>
+          <w:rFonts w:ascii="Times New Roman" w:hAnsi="Times New Roman" w:cs="Times New Roman"/>
+        </w:rPr>
+      </w:pPr>
+      <w:r>
+        <w:rPr>
+          <w:rFonts w:ascii="Times New Roman" w:hAnsi="Times New Roman" w:cs="Times New Roman"/>
+        </w:rPr>
+        <w:t xml:space="preserve">BRASIL. Superior Tribunal de Justiça (2. Turma). </w:t>
+      </w:r>
+      <w:r>
+        <w:rPr>
+          <w:rFonts w:ascii="Times New Roman" w:hAnsi="Times New Roman" w:cs="Times New Roman"/>
+          <w:b/>
+          <w:bCs/>
+        </w:rPr>
+        <w:t>Recurso Especial nº 1.284.069/RS</w:t>
+      </w:r>
+      <w:r>
+        <w:rPr>
+          <w:rFonts w:ascii="Times New Roman" w:hAnsi="Times New Roman" w:cs="Times New Roman"/>
+        </w:rPr>
+        <w:t>. Relator: Ministro Herman Benjamin. Julgado em 17 nov. 2016. DJe 28 ago. 2020.</w:t>
+      </w:r>
+    </w:p>
+    <w:p>
+      <w:pPr>
+        <w:spacing w:line="360" w:lineRule="auto"/>
+        <w:jc w:val="both"/>
+        <w:rPr>
+          <w:rFonts w:ascii="Times New Roman" w:hAnsi="Times New Roman" w:cs="Times New Roman"/>
+        </w:rPr>
+      </w:pPr>
+      <w:r>
+        <w:rPr>
+          <w:rFonts w:ascii="Times New Roman" w:hAnsi="Times New Roman" w:cs="Times New Roman"/>
+        </w:rPr>
+        <w:t xml:space="preserve">BRASIL. Superior Tribunal de Justiça (2. Turma). </w:t>
+      </w:r>
+      <w:r>
+        <w:rPr>
+          <w:rFonts w:ascii="Times New Roman" w:hAnsi="Times New Roman" w:cs="Times New Roman"/>
+          <w:b/>
+          <w:bCs/>
+        </w:rPr>
+        <w:t>Recurso Especial nº 1.644.195/SC</w:t>
+      </w:r>
+      <w:r>
+        <w:rPr>
+          <w:rFonts w:ascii="Times New Roman" w:hAnsi="Times New Roman" w:cs="Times New Roman"/>
+        </w:rPr>
+        <w:t>. Relator: Ministro Herman Benjamin. Julgado em 27 abr. 2017. DJe 08 mai. 2017.</w:t>
+      </w:r>
+    </w:p>
+    <w:p>
+      <w:pPr>
+        <w:spacing w:line="360" w:lineRule="auto"/>
+        <w:jc w:val="both"/>
+        <w:rPr>
+          <w:rFonts w:ascii="Times New Roman" w:hAnsi="Times New Roman" w:cs="Times New Roman"/>
+        </w:rPr>
+      </w:pPr>
+      <w:r>
+        <w:rPr>
+          <w:rFonts w:ascii="Times New Roman" w:hAnsi="Times New Roman" w:cs="Times New Roman"/>
+        </w:rPr>
+        <w:t xml:space="preserve">BRASIL. </w:t>
+      </w:r>
+      <w:r>
+        <w:rPr>
+          <w:rFonts w:ascii="Times New Roman" w:hAnsi="Times New Roman" w:cs="Times New Roman"/>
+          <w:b/>
+          <w:bCs/>
+        </w:rPr>
         <w:t>Lei nº 8.629, de 25 de fevereiro de 1993</w:t>
       </w:r>
       <w:r>
@@ -4464,7 +6907,7 @@
         </w:rPr>
         <w:t xml:space="preserve">. Dispõe sobre a regulamentação dos dispositivos constitucionais relativos à reforma agrária, previstos no Capítulo III, Título VII, da Constituição Federal. Brasília, DF: Presidência da República, [1993]. Disponível em: </w:t>
       </w:r>
-      <w:hyperlink r:id="rId6" w:tgtFrame="_blank" w:history="1">
+      <w:hyperlink r:id="rId16" w:tgtFrame="_blank" w:history="1">
         <w:r>
           <w:rPr>
             <w:rStyle w:val="Hyperlink"/>
@@ -4666,6 +7109,7 @@
         <w:rPr>
           <w:rFonts w:ascii="Times New Roman" w:hAnsi="Times New Roman" w:cs="Times New Roman"/>
         </w:rPr>
+        <w:lastRenderedPageBreak/>
         <w:t xml:space="preserve">PARÁ. Secretaria de Estado de Meio Ambiente e Sustentabilidade. </w:t>
       </w:r>
       <w:r>
@@ -4724,7 +7168,6 @@
         <w:rPr>
           <w:rFonts w:ascii="Times New Roman" w:hAnsi="Times New Roman" w:cs="Times New Roman"/>
         </w:rPr>
-        <w:lastRenderedPageBreak/>
         <w:t xml:space="preserve">PARÁ. Secretaria de Estado de Meio Ambiente e Sustentabilidade. </w:t>
       </w:r>
       <w:r>
@@ -4828,7 +7271,7 @@
         </w:rPr>
         <w:t xml:space="preserve">: scripts para processamento de dados do CAR e integração com Google Earth Engine. Versão 1.0. Belém: NGEO-IDEFLOR-Bio, 2026. Disponível em: </w:t>
       </w:r>
-      <w:hyperlink r:id="rId7" w:tgtFrame="_blank" w:history="1">
+      <w:hyperlink r:id="rId17" w:tgtFrame="_blank" w:history="1">
         <w:r>
           <w:rPr>
             <w:rStyle w:val="Hyperlink"/>
@@ -4930,7 +7373,7 @@
         </w:rPr>
         <w:t xml:space="preserve">: a language and environment for statistical computing. Vienna: R Foundation for Statistical Computing, 2024. Disponível em: </w:t>
       </w:r>
-      <w:hyperlink r:id="rId8" w:tgtFrame="_blank" w:history="1">
+      <w:hyperlink r:id="rId18" w:tgtFrame="_blank" w:history="1">
         <w:r>
           <w:rPr>
             <w:rStyle w:val="Hyperlink"/>
@@ -4958,6 +7401,7 @@
         <w:rPr>
           <w:rFonts w:ascii="Times New Roman" w:hAnsi="Times New Roman" w:cs="Times New Roman"/>
         </w:rPr>
+        <w:lastRenderedPageBreak/>
         <w:t xml:space="preserve">WICKHAM, H. et al. Welcome to the </w:t>
       </w:r>
       <w:r>
@@ -5512,6 +7956,157 @@
     </w:lvl>
   </w:abstractNum>
   <w:abstractNum w:abstractNumId="4" w15:restartNumberingAfterBreak="0">
+    <w:nsid w:val="49B153F1"/>
+    <w:multiLevelType w:val="multilevel"/>
+    <w:tmpl w:val="DBB435F0"/>
+    <w:lvl w:ilvl="0">
+      <w:start w:val="1"/>
+      <w:numFmt w:val="bullet"/>
+      <w:lvlText w:val="-"/>
+      <w:lvlJc w:val="left"/>
+      <w:pPr>
+        <w:tabs>
+          <w:tab w:val="num" w:pos="720"/>
+        </w:tabs>
+        <w:ind w:left="720" w:hanging="360"/>
+      </w:pPr>
+      <w:rPr>
+        <w:rFonts w:ascii="Times New Roman" w:hAnsi="Times New Roman" w:hint="default"/>
+        <w:b/>
+        <w:i w:val="0"/>
+        <w:sz w:val="24"/>
+      </w:rPr>
+    </w:lvl>
+    <w:lvl w:ilvl="1" w:tentative="1">
+      <w:start w:val="1"/>
+      <w:numFmt w:val="bullet"/>
+      <w:lvlText w:val="o"/>
+      <w:lvlJc w:val="left"/>
+      <w:pPr>
+        <w:tabs>
+          <w:tab w:val="num" w:pos="1440"/>
+        </w:tabs>
+        <w:ind w:left="1440" w:hanging="360"/>
+      </w:pPr>
+      <w:rPr>
+        <w:rFonts w:ascii="Courier New" w:hAnsi="Courier New" w:hint="default"/>
+        <w:sz w:val="20"/>
+      </w:rPr>
+    </w:lvl>
+    <w:lvl w:ilvl="2" w:tentative="1">
+      <w:start w:val="1"/>
+      <w:numFmt w:val="bullet"/>
+      <w:lvlText w:val=""/>
+      <w:lvlJc w:val="left"/>
+      <w:pPr>
+        <w:tabs>
+          <w:tab w:val="num" w:pos="2160"/>
+        </w:tabs>
+        <w:ind w:left="2160" w:hanging="360"/>
+      </w:pPr>
+      <w:rPr>
+        <w:rFonts w:ascii="Wingdings" w:hAnsi="Wingdings" w:hint="default"/>
+        <w:sz w:val="20"/>
+      </w:rPr>
+    </w:lvl>
+    <w:lvl w:ilvl="3" w:tentative="1">
+      <w:start w:val="1"/>
+      <w:numFmt w:val="bullet"/>
+      <w:lvlText w:val=""/>
+      <w:lvlJc w:val="left"/>
+      <w:pPr>
+        <w:tabs>
+          <w:tab w:val="num" w:pos="2880"/>
+        </w:tabs>
+        <w:ind w:left="2880" w:hanging="360"/>
+      </w:pPr>
+      <w:rPr>
+        <w:rFonts w:ascii="Wingdings" w:hAnsi="Wingdings" w:hint="default"/>
+        <w:sz w:val="20"/>
+      </w:rPr>
+    </w:lvl>
+    <w:lvl w:ilvl="4" w:tentative="1">
+      <w:start w:val="1"/>
+      <w:numFmt w:val="bullet"/>
+      <w:lvlText w:val=""/>
+      <w:lvlJc w:val="left"/>
+      <w:pPr>
+        <w:tabs>
+          <w:tab w:val="num" w:pos="3600"/>
+        </w:tabs>
+        <w:ind w:left="3600" w:hanging="360"/>
+      </w:pPr>
+      <w:rPr>
+        <w:rFonts w:ascii="Wingdings" w:hAnsi="Wingdings" w:hint="default"/>
+        <w:sz w:val="20"/>
+      </w:rPr>
+    </w:lvl>
+    <w:lvl w:ilvl="5" w:tentative="1">
+      <w:start w:val="1"/>
+      <w:numFmt w:val="bullet"/>
+      <w:lvlText w:val=""/>
+      <w:lvlJc w:val="left"/>
+      <w:pPr>
+        <w:tabs>
+          <w:tab w:val="num" w:pos="4320"/>
+        </w:tabs>
+        <w:ind w:left="4320" w:hanging="360"/>
+      </w:pPr>
+      <w:rPr>
+        <w:rFonts w:ascii="Wingdings" w:hAnsi="Wingdings" w:hint="default"/>
+        <w:sz w:val="20"/>
+      </w:rPr>
+    </w:lvl>
+    <w:lvl w:ilvl="6" w:tentative="1">
+      <w:start w:val="1"/>
+      <w:numFmt w:val="bullet"/>
+      <w:lvlText w:val=""/>
+      <w:lvlJc w:val="left"/>
+      <w:pPr>
+        <w:tabs>
+          <w:tab w:val="num" w:pos="5040"/>
+        </w:tabs>
+        <w:ind w:left="5040" w:hanging="360"/>
+      </w:pPr>
+      <w:rPr>
+        <w:rFonts w:ascii="Wingdings" w:hAnsi="Wingdings" w:hint="default"/>
+        <w:sz w:val="20"/>
+      </w:rPr>
+    </w:lvl>
+    <w:lvl w:ilvl="7" w:tentative="1">
+      <w:start w:val="1"/>
+      <w:numFmt w:val="bullet"/>
+      <w:lvlText w:val=""/>
+      <w:lvlJc w:val="left"/>
+      <w:pPr>
+        <w:tabs>
+          <w:tab w:val="num" w:pos="5760"/>
+        </w:tabs>
+        <w:ind w:left="5760" w:hanging="360"/>
+      </w:pPr>
+      <w:rPr>
+        <w:rFonts w:ascii="Wingdings" w:hAnsi="Wingdings" w:hint="default"/>
+        <w:sz w:val="20"/>
+      </w:rPr>
+    </w:lvl>
+    <w:lvl w:ilvl="8" w:tentative="1">
+      <w:start w:val="1"/>
+      <w:numFmt w:val="bullet"/>
+      <w:lvlText w:val=""/>
+      <w:lvlJc w:val="left"/>
+      <w:pPr>
+        <w:tabs>
+          <w:tab w:val="num" w:pos="6480"/>
+        </w:tabs>
+        <w:ind w:left="6480" w:hanging="360"/>
+      </w:pPr>
+      <w:rPr>
+        <w:rFonts w:ascii="Wingdings" w:hAnsi="Wingdings" w:hint="default"/>
+        <w:sz w:val="20"/>
+      </w:rPr>
+    </w:lvl>
+  </w:abstractNum>
+  <w:abstractNum w:abstractNumId="5" w15:restartNumberingAfterBreak="0">
     <w:nsid w:val="52E8440A"/>
     <w:multiLevelType w:val="multilevel"/>
     <w:tmpl w:val="ABCE72B0"/>
@@ -5622,6 +8217,155 @@
         </w:tabs>
         <w:ind w:left="6480" w:hanging="360"/>
       </w:pPr>
+    </w:lvl>
+  </w:abstractNum>
+  <w:abstractNum w:abstractNumId="6" w15:restartNumberingAfterBreak="0">
+    <w:nsid w:val="69CC794D"/>
+    <w:multiLevelType w:val="multilevel"/>
+    <w:tmpl w:val="96B8971E"/>
+    <w:lvl w:ilvl="0">
+      <w:start w:val="1"/>
+      <w:numFmt w:val="bullet"/>
+      <w:lvlText w:val=""/>
+      <w:lvlJc w:val="left"/>
+      <w:pPr>
+        <w:tabs>
+          <w:tab w:val="num" w:pos="720"/>
+        </w:tabs>
+        <w:ind w:left="720" w:hanging="360"/>
+      </w:pPr>
+      <w:rPr>
+        <w:rFonts w:ascii="Symbol" w:hAnsi="Symbol" w:hint="default"/>
+        <w:sz w:val="20"/>
+      </w:rPr>
+    </w:lvl>
+    <w:lvl w:ilvl="1" w:tentative="1">
+      <w:start w:val="1"/>
+      <w:numFmt w:val="bullet"/>
+      <w:lvlText w:val="o"/>
+      <w:lvlJc w:val="left"/>
+      <w:pPr>
+        <w:tabs>
+          <w:tab w:val="num" w:pos="1440"/>
+        </w:tabs>
+        <w:ind w:left="1440" w:hanging="360"/>
+      </w:pPr>
+      <w:rPr>
+        <w:rFonts w:ascii="Courier New" w:hAnsi="Courier New" w:hint="default"/>
+        <w:sz w:val="20"/>
+      </w:rPr>
+    </w:lvl>
+    <w:lvl w:ilvl="2" w:tentative="1">
+      <w:start w:val="1"/>
+      <w:numFmt w:val="bullet"/>
+      <w:lvlText w:val=""/>
+      <w:lvlJc w:val="left"/>
+      <w:pPr>
+        <w:tabs>
+          <w:tab w:val="num" w:pos="2160"/>
+        </w:tabs>
+        <w:ind w:left="2160" w:hanging="360"/>
+      </w:pPr>
+      <w:rPr>
+        <w:rFonts w:ascii="Wingdings" w:hAnsi="Wingdings" w:hint="default"/>
+        <w:sz w:val="20"/>
+      </w:rPr>
+    </w:lvl>
+    <w:lvl w:ilvl="3" w:tentative="1">
+      <w:start w:val="1"/>
+      <w:numFmt w:val="bullet"/>
+      <w:lvlText w:val=""/>
+      <w:lvlJc w:val="left"/>
+      <w:pPr>
+        <w:tabs>
+          <w:tab w:val="num" w:pos="2880"/>
+        </w:tabs>
+        <w:ind w:left="2880" w:hanging="360"/>
+      </w:pPr>
+      <w:rPr>
+        <w:rFonts w:ascii="Wingdings" w:hAnsi="Wingdings" w:hint="default"/>
+        <w:sz w:val="20"/>
+      </w:rPr>
+    </w:lvl>
+    <w:lvl w:ilvl="4" w:tentative="1">
+      <w:start w:val="1"/>
+      <w:numFmt w:val="bullet"/>
+      <w:lvlText w:val=""/>
+      <w:lvlJc w:val="left"/>
+      <w:pPr>
+        <w:tabs>
+          <w:tab w:val="num" w:pos="3600"/>
+        </w:tabs>
+        <w:ind w:left="3600" w:hanging="360"/>
+      </w:pPr>
+      <w:rPr>
+        <w:rFonts w:ascii="Wingdings" w:hAnsi="Wingdings" w:hint="default"/>
+        <w:sz w:val="20"/>
+      </w:rPr>
+    </w:lvl>
+    <w:lvl w:ilvl="5" w:tentative="1">
+      <w:start w:val="1"/>
+      <w:numFmt w:val="bullet"/>
+      <w:lvlText w:val=""/>
+      <w:lvlJc w:val="left"/>
+      <w:pPr>
+        <w:tabs>
+          <w:tab w:val="num" w:pos="4320"/>
+        </w:tabs>
+        <w:ind w:left="4320" w:hanging="360"/>
+      </w:pPr>
+      <w:rPr>
+        <w:rFonts w:ascii="Wingdings" w:hAnsi="Wingdings" w:hint="default"/>
+        <w:sz w:val="20"/>
+      </w:rPr>
+    </w:lvl>
+    <w:lvl w:ilvl="6" w:tentative="1">
+      <w:start w:val="1"/>
+      <w:numFmt w:val="bullet"/>
+      <w:lvlText w:val=""/>
+      <w:lvlJc w:val="left"/>
+      <w:pPr>
+        <w:tabs>
+          <w:tab w:val="num" w:pos="5040"/>
+        </w:tabs>
+        <w:ind w:left="5040" w:hanging="360"/>
+      </w:pPr>
+      <w:rPr>
+        <w:rFonts w:ascii="Wingdings" w:hAnsi="Wingdings" w:hint="default"/>
+        <w:sz w:val="20"/>
+      </w:rPr>
+    </w:lvl>
+    <w:lvl w:ilvl="7" w:tentative="1">
+      <w:start w:val="1"/>
+      <w:numFmt w:val="bullet"/>
+      <w:lvlText w:val=""/>
+      <w:lvlJc w:val="left"/>
+      <w:pPr>
+        <w:tabs>
+          <w:tab w:val="num" w:pos="5760"/>
+        </w:tabs>
+        <w:ind w:left="5760" w:hanging="360"/>
+      </w:pPr>
+      <w:rPr>
+        <w:rFonts w:ascii="Wingdings" w:hAnsi="Wingdings" w:hint="default"/>
+        <w:sz w:val="20"/>
+      </w:rPr>
+    </w:lvl>
+    <w:lvl w:ilvl="8" w:tentative="1">
+      <w:start w:val="1"/>
+      <w:numFmt w:val="bullet"/>
+      <w:lvlText w:val=""/>
+      <w:lvlJc w:val="left"/>
+      <w:pPr>
+        <w:tabs>
+          <w:tab w:val="num" w:pos="6480"/>
+        </w:tabs>
+        <w:ind w:left="6480" w:hanging="360"/>
+      </w:pPr>
+      <w:rPr>
+        <w:rFonts w:ascii="Wingdings" w:hAnsi="Wingdings" w:hint="default"/>
+        <w:sz w:val="20"/>
+      </w:rPr>
     </w:lvl>
   </w:abstractNum>
   <w:num w:numId="1" w16cid:durableId="950282274">
@@ -5631,13 +8375,19 @@
     <w:abstractNumId w:val="1"/>
   </w:num>
   <w:num w:numId="3" w16cid:durableId="1755202286">
-    <w:abstractNumId w:val="4"/>
+    <w:abstractNumId w:val="5"/>
   </w:num>
   <w:num w:numId="4" w16cid:durableId="1336424144">
     <w:abstractNumId w:val="2"/>
   </w:num>
   <w:num w:numId="5" w16cid:durableId="1045524977">
     <w:abstractNumId w:val="0"/>
+  </w:num>
+  <w:num w:numId="6" w16cid:durableId="1683387836">
+    <w:abstractNumId w:val="6"/>
+  </w:num>
+  <w:num w:numId="7" w16cid:durableId="57173494">
+    <w:abstractNumId w:val="4"/>
   </w:num>
 </w:numbering>
 </file>
@@ -6591,6 +9341,25 @@
       <w:color w:val="666666"/>
     </w:rPr>
   </w:style>
+  <w:style w:type="paragraph" w:styleId="Legenda">
+    <w:name w:val="caption"/>
+    <w:basedOn w:val="Normal"/>
+    <w:next w:val="Normal"/>
+    <w:uiPriority w:val="35"/>
+    <w:unhideWhenUsed/>
+    <w:qFormat/>
+    <w:rsid w:val="00C16FF3"/>
+    <w:pPr>
+      <w:spacing w:after="200" w:line="240" w:lineRule="auto"/>
+    </w:pPr>
+    <w:rPr>
+      <w:i/>
+      <w:iCs/>
+      <w:color w:val="0E2841" w:themeColor="text2"/>
+      <w:sz w:val="18"/>
+      <w:szCs w:val="18"/>
+    </w:rPr>
+  </w:style>
 </w:styles>
 </file>
 

</xml_diff>

<commit_message>
Atualização final do relatório.
</commit_message>
<xml_diff>
--- a/Análise Geoestatística do Passivo de Reserva Legal em Imóveis de Médio e Grande Porte no Estado do Pará.docx
+++ b/Análise Geoestatística do Passivo de Reserva Legal em Imóveis de Médio e Grande Porte no Estado do Pará.docx
@@ -700,7 +700,7 @@
           <w:r>
             <w:fldChar w:fldCharType="separate"/>
           </w:r>
-          <w:hyperlink w:anchor="_Toc224251724" w:history="1">
+          <w:hyperlink w:anchor="_Toc224253735" w:history="1">
             <w:r>
               <w:rPr>
                 <w:rStyle w:val="Hyperlink"/>
@@ -728,7 +728,7 @@
                 <w:noProof/>
                 <w:webHidden/>
               </w:rPr>
-              <w:instrText xml:space="preserve"> PAGEREF _Toc224251724 \h </w:instrText>
+              <w:instrText xml:space="preserve"> PAGEREF _Toc224253735 \h </w:instrText>
             </w:r>
             <w:r>
               <w:rPr>
@@ -771,7 +771,7 @@
               <w:lang w:eastAsia="pt-BR"/>
             </w:rPr>
           </w:pPr>
-          <w:hyperlink w:anchor="_Toc224251725" w:history="1">
+          <w:hyperlink w:anchor="_Toc224253736" w:history="1">
             <w:r>
               <w:rPr>
                 <w:rStyle w:val="Hyperlink"/>
@@ -799,7 +799,7 @@
                 <w:noProof/>
                 <w:webHidden/>
               </w:rPr>
-              <w:instrText xml:space="preserve"> PAGEREF _Toc224251725 \h </w:instrText>
+              <w:instrText xml:space="preserve"> PAGEREF _Toc224253736 \h </w:instrText>
             </w:r>
             <w:r>
               <w:rPr>
@@ -842,7 +842,7 @@
               <w:lang w:eastAsia="pt-BR"/>
             </w:rPr>
           </w:pPr>
-          <w:hyperlink w:anchor="_Toc224251726" w:history="1">
+          <w:hyperlink w:anchor="_Toc224253737" w:history="1">
             <w:r>
               <w:rPr>
                 <w:rStyle w:val="Hyperlink"/>
@@ -870,7 +870,7 @@
                 <w:noProof/>
                 <w:webHidden/>
               </w:rPr>
-              <w:instrText xml:space="preserve"> PAGEREF _Toc224251726 \h </w:instrText>
+              <w:instrText xml:space="preserve"> PAGEREF _Toc224253737 \h </w:instrText>
             </w:r>
             <w:r>
               <w:rPr>
@@ -913,7 +913,7 @@
               <w:lang w:eastAsia="pt-BR"/>
             </w:rPr>
           </w:pPr>
-          <w:hyperlink w:anchor="_Toc224251727" w:history="1">
+          <w:hyperlink w:anchor="_Toc224253738" w:history="1">
             <w:r>
               <w:rPr>
                 <w:rStyle w:val="Hyperlink"/>
@@ -943,7 +943,7 @@
                 <w:noProof/>
                 <w:webHidden/>
               </w:rPr>
-              <w:instrText xml:space="preserve"> PAGEREF _Toc224251727 \h </w:instrText>
+              <w:instrText xml:space="preserve"> PAGEREF _Toc224253738 \h </w:instrText>
             </w:r>
             <w:r>
               <w:rPr>
@@ -986,7 +986,7 @@
               <w:lang w:eastAsia="pt-BR"/>
             </w:rPr>
           </w:pPr>
-          <w:hyperlink w:anchor="_Toc224251728" w:history="1">
+          <w:hyperlink w:anchor="_Toc224253739" w:history="1">
             <w:r>
               <w:rPr>
                 <w:rStyle w:val="Hyperlink"/>
@@ -1016,7 +1016,7 @@
                 <w:noProof/>
                 <w:webHidden/>
               </w:rPr>
-              <w:instrText xml:space="preserve"> PAGEREF _Toc224251728 \h </w:instrText>
+              <w:instrText xml:space="preserve"> PAGEREF _Toc224253739 \h </w:instrText>
             </w:r>
             <w:r>
               <w:rPr>
@@ -1059,7 +1059,7 @@
               <w:lang w:eastAsia="pt-BR"/>
             </w:rPr>
           </w:pPr>
-          <w:hyperlink w:anchor="_Toc224251729" w:history="1">
+          <w:hyperlink w:anchor="_Toc224253740" w:history="1">
             <w:r>
               <w:rPr>
                 <w:rStyle w:val="Hyperlink"/>
@@ -1087,7 +1087,7 @@
                 <w:noProof/>
                 <w:webHidden/>
               </w:rPr>
-              <w:instrText xml:space="preserve"> PAGEREF _Toc224251729 \h </w:instrText>
+              <w:instrText xml:space="preserve"> PAGEREF _Toc224253740 \h </w:instrText>
             </w:r>
             <w:r>
               <w:rPr>
@@ -1130,7 +1130,7 @@
               <w:lang w:eastAsia="pt-BR"/>
             </w:rPr>
           </w:pPr>
-          <w:hyperlink w:anchor="_Toc224251730" w:history="1">
+          <w:hyperlink w:anchor="_Toc224253741" w:history="1">
             <w:r>
               <w:rPr>
                 <w:rStyle w:val="Hyperlink"/>
@@ -1160,7 +1160,7 @@
                 <w:noProof/>
                 <w:webHidden/>
               </w:rPr>
-              <w:instrText xml:space="preserve"> PAGEREF _Toc224251730 \h </w:instrText>
+              <w:instrText xml:space="preserve"> PAGEREF _Toc224253741 \h </w:instrText>
             </w:r>
             <w:r>
               <w:rPr>
@@ -1203,7 +1203,7 @@
               <w:lang w:eastAsia="pt-BR"/>
             </w:rPr>
           </w:pPr>
-          <w:hyperlink w:anchor="_Toc224251731" w:history="1">
+          <w:hyperlink w:anchor="_Toc224253742" w:history="1">
             <w:r>
               <w:rPr>
                 <w:rStyle w:val="Hyperlink"/>
@@ -1233,7 +1233,7 @@
                 <w:noProof/>
                 <w:webHidden/>
               </w:rPr>
-              <w:instrText xml:space="preserve"> PAGEREF _Toc224251731 \h </w:instrText>
+              <w:instrText xml:space="preserve"> PAGEREF _Toc224253742 \h </w:instrText>
             </w:r>
             <w:r>
               <w:rPr>
@@ -1276,7 +1276,7 @@
               <w:lang w:eastAsia="pt-BR"/>
             </w:rPr>
           </w:pPr>
-          <w:hyperlink w:anchor="_Toc224251732" w:history="1">
+          <w:hyperlink w:anchor="_Toc224253743" w:history="1">
             <w:r>
               <w:rPr>
                 <w:rStyle w:val="Hyperlink"/>
@@ -1306,7 +1306,7 @@
                 <w:noProof/>
                 <w:webHidden/>
               </w:rPr>
-              <w:instrText xml:space="preserve"> PAGEREF _Toc224251732 \h </w:instrText>
+              <w:instrText xml:space="preserve"> PAGEREF _Toc224253743 \h </w:instrText>
             </w:r>
             <w:r>
               <w:rPr>
@@ -1349,7 +1349,7 @@
               <w:lang w:eastAsia="pt-BR"/>
             </w:rPr>
           </w:pPr>
-          <w:hyperlink w:anchor="_Toc224251733" w:history="1">
+          <w:hyperlink w:anchor="_Toc224253744" w:history="1">
             <w:r>
               <w:rPr>
                 <w:rStyle w:val="Hyperlink"/>
@@ -1379,7 +1379,7 @@
                 <w:noProof/>
                 <w:webHidden/>
               </w:rPr>
-              <w:instrText xml:space="preserve"> PAGEREF _Toc224251733 \h </w:instrText>
+              <w:instrText xml:space="preserve"> PAGEREF _Toc224253744 \h </w:instrText>
             </w:r>
             <w:r>
               <w:rPr>
@@ -1422,7 +1422,7 @@
               <w:lang w:eastAsia="pt-BR"/>
             </w:rPr>
           </w:pPr>
-          <w:hyperlink w:anchor="_Toc224251734" w:history="1">
+          <w:hyperlink w:anchor="_Toc224253745" w:history="1">
             <w:r>
               <w:rPr>
                 <w:rStyle w:val="Hyperlink"/>
@@ -1450,7 +1450,7 @@
                 <w:noProof/>
                 <w:webHidden/>
               </w:rPr>
-              <w:instrText xml:space="preserve"> PAGEREF _Toc224251734 \h </w:instrText>
+              <w:instrText xml:space="preserve"> PAGEREF _Toc224253745 \h </w:instrText>
             </w:r>
             <w:r>
               <w:rPr>
@@ -1493,7 +1493,7 @@
               <w:lang w:eastAsia="pt-BR"/>
             </w:rPr>
           </w:pPr>
-          <w:hyperlink w:anchor="_Toc224251735" w:history="1">
+          <w:hyperlink w:anchor="_Toc224253746" w:history="1">
             <w:r>
               <w:rPr>
                 <w:rStyle w:val="Hyperlink"/>
@@ -1521,7 +1521,7 @@
                 <w:noProof/>
                 <w:webHidden/>
               </w:rPr>
-              <w:instrText xml:space="preserve"> PAGEREF _Toc224251735 \h </w:instrText>
+              <w:instrText xml:space="preserve"> PAGEREF _Toc224253746 \h </w:instrText>
             </w:r>
             <w:r>
               <w:rPr>
@@ -1564,7 +1564,7 @@
               <w:lang w:eastAsia="pt-BR"/>
             </w:rPr>
           </w:pPr>
-          <w:hyperlink w:anchor="_Toc224251736" w:history="1">
+          <w:hyperlink w:anchor="_Toc224253747" w:history="1">
             <w:r>
               <w:rPr>
                 <w:rStyle w:val="Hyperlink"/>
@@ -1592,7 +1592,7 @@
                 <w:noProof/>
                 <w:webHidden/>
               </w:rPr>
-              <w:instrText xml:space="preserve"> PAGEREF _Toc224251736 \h </w:instrText>
+              <w:instrText xml:space="preserve"> PAGEREF _Toc224253747 \h </w:instrText>
             </w:r>
             <w:r>
               <w:rPr>
@@ -1635,7 +1635,7 @@
               <w:lang w:eastAsia="pt-BR"/>
             </w:rPr>
           </w:pPr>
-          <w:hyperlink w:anchor="_Toc224251737" w:history="1">
+          <w:hyperlink w:anchor="_Toc224253748" w:history="1">
             <w:r>
               <w:rPr>
                 <w:rStyle w:val="Hyperlink"/>
@@ -1663,7 +1663,7 @@
                 <w:noProof/>
                 <w:webHidden/>
               </w:rPr>
-              <w:instrText xml:space="preserve"> PAGEREF _Toc224251737 \h </w:instrText>
+              <w:instrText xml:space="preserve"> PAGEREF _Toc224253748 \h </w:instrText>
             </w:r>
             <w:r>
               <w:rPr>
@@ -1706,7 +1706,7 @@
               <w:lang w:eastAsia="pt-BR"/>
             </w:rPr>
           </w:pPr>
-          <w:hyperlink w:anchor="_Toc224251738" w:history="1">
+          <w:hyperlink w:anchor="_Toc224253749" w:history="1">
             <w:r>
               <w:rPr>
                 <w:rStyle w:val="Hyperlink"/>
@@ -1736,7 +1736,7 @@
                 <w:noProof/>
                 <w:webHidden/>
               </w:rPr>
-              <w:instrText xml:space="preserve"> PAGEREF _Toc224251738 \h </w:instrText>
+              <w:instrText xml:space="preserve"> PAGEREF _Toc224253749 \h </w:instrText>
             </w:r>
             <w:r>
               <w:rPr>
@@ -1779,7 +1779,7 @@
               <w:lang w:eastAsia="pt-BR"/>
             </w:rPr>
           </w:pPr>
-          <w:hyperlink w:anchor="_Toc224251739" w:history="1">
+          <w:hyperlink w:anchor="_Toc224253750" w:history="1">
             <w:r>
               <w:rPr>
                 <w:rStyle w:val="Hyperlink"/>
@@ -1809,7 +1809,7 @@
                 <w:noProof/>
                 <w:webHidden/>
               </w:rPr>
-              <w:instrText xml:space="preserve"> PAGEREF _Toc224251739 \h </w:instrText>
+              <w:instrText xml:space="preserve"> PAGEREF _Toc224253750 \h </w:instrText>
             </w:r>
             <w:r>
               <w:rPr>
@@ -1852,7 +1852,7 @@
               <w:lang w:eastAsia="pt-BR"/>
             </w:rPr>
           </w:pPr>
-          <w:hyperlink w:anchor="_Toc224251740" w:history="1">
+          <w:hyperlink w:anchor="_Toc224253751" w:history="1">
             <w:r>
               <w:rPr>
                 <w:rStyle w:val="Hyperlink"/>
@@ -1882,7 +1882,7 @@
                 <w:noProof/>
                 <w:webHidden/>
               </w:rPr>
-              <w:instrText xml:space="preserve"> PAGEREF _Toc224251740 \h </w:instrText>
+              <w:instrText xml:space="preserve"> PAGEREF _Toc224253751 \h </w:instrText>
             </w:r>
             <w:r>
               <w:rPr>
@@ -1925,7 +1925,7 @@
               <w:lang w:eastAsia="pt-BR"/>
             </w:rPr>
           </w:pPr>
-          <w:hyperlink w:anchor="_Toc224251741" w:history="1">
+          <w:hyperlink w:anchor="_Toc224253752" w:history="1">
             <w:r>
               <w:rPr>
                 <w:rStyle w:val="Hyperlink"/>
@@ -1955,7 +1955,7 @@
                 <w:noProof/>
                 <w:webHidden/>
               </w:rPr>
-              <w:instrText xml:space="preserve"> PAGEREF _Toc224251741 \h </w:instrText>
+              <w:instrText xml:space="preserve"> PAGEREF _Toc224253752 \h </w:instrText>
             </w:r>
             <w:r>
               <w:rPr>
@@ -1998,7 +1998,7 @@
               <w:lang w:eastAsia="pt-BR"/>
             </w:rPr>
           </w:pPr>
-          <w:hyperlink w:anchor="_Toc224251742" w:history="1">
+          <w:hyperlink w:anchor="_Toc224253753" w:history="1">
             <w:r>
               <w:rPr>
                 <w:rStyle w:val="Hyperlink"/>
@@ -2026,7 +2026,7 @@
                 <w:noProof/>
                 <w:webHidden/>
               </w:rPr>
-              <w:instrText xml:space="preserve"> PAGEREF _Toc224251742 \h </w:instrText>
+              <w:instrText xml:space="preserve"> PAGEREF _Toc224253753 \h </w:instrText>
             </w:r>
             <w:r>
               <w:rPr>
@@ -2069,7 +2069,7 @@
               <w:lang w:eastAsia="pt-BR"/>
             </w:rPr>
           </w:pPr>
-          <w:hyperlink w:anchor="_Toc224251743" w:history="1">
+          <w:hyperlink w:anchor="_Toc224253754" w:history="1">
             <w:r>
               <w:rPr>
                 <w:rStyle w:val="Hyperlink"/>
@@ -2099,7 +2099,7 @@
                 <w:noProof/>
                 <w:webHidden/>
               </w:rPr>
-              <w:instrText xml:space="preserve"> PAGEREF _Toc224251743 \h </w:instrText>
+              <w:instrText xml:space="preserve"> PAGEREF _Toc224253754 \h </w:instrText>
             </w:r>
             <w:r>
               <w:rPr>
@@ -2142,7 +2142,7 @@
               <w:lang w:eastAsia="pt-BR"/>
             </w:rPr>
           </w:pPr>
-          <w:hyperlink w:anchor="_Toc224251744" w:history="1">
+          <w:hyperlink w:anchor="_Toc224253755" w:history="1">
             <w:r>
               <w:rPr>
                 <w:rStyle w:val="Hyperlink"/>
@@ -2172,7 +2172,7 @@
                 <w:noProof/>
                 <w:webHidden/>
               </w:rPr>
-              <w:instrText xml:space="preserve"> PAGEREF _Toc224251744 \h </w:instrText>
+              <w:instrText xml:space="preserve"> PAGEREF _Toc224253755 \h </w:instrText>
             </w:r>
             <w:r>
               <w:rPr>
@@ -2215,7 +2215,7 @@
               <w:lang w:eastAsia="pt-BR"/>
             </w:rPr>
           </w:pPr>
-          <w:hyperlink w:anchor="_Toc224251745" w:history="1">
+          <w:hyperlink w:anchor="_Toc224253756" w:history="1">
             <w:r>
               <w:rPr>
                 <w:rStyle w:val="Hyperlink"/>
@@ -2243,7 +2243,7 @@
                 <w:noProof/>
                 <w:webHidden/>
               </w:rPr>
-              <w:instrText xml:space="preserve"> PAGEREF _Toc224251745 \h </w:instrText>
+              <w:instrText xml:space="preserve"> PAGEREF _Toc224253756 \h </w:instrText>
             </w:r>
             <w:r>
               <w:rPr>
@@ -2286,7 +2286,7 @@
               <w:lang w:eastAsia="pt-BR"/>
             </w:rPr>
           </w:pPr>
-          <w:hyperlink w:anchor="_Toc224251746" w:history="1">
+          <w:hyperlink w:anchor="_Toc224253757" w:history="1">
             <w:r>
               <w:rPr>
                 <w:rStyle w:val="Hyperlink"/>
@@ -2316,7 +2316,7 @@
                 <w:noProof/>
                 <w:webHidden/>
               </w:rPr>
-              <w:instrText xml:space="preserve"> PAGEREF _Toc224251746 \h </w:instrText>
+              <w:instrText xml:space="preserve"> PAGEREF _Toc224253757 \h </w:instrText>
             </w:r>
             <w:r>
               <w:rPr>
@@ -2359,7 +2359,7 @@
               <w:lang w:eastAsia="pt-BR"/>
             </w:rPr>
           </w:pPr>
-          <w:hyperlink w:anchor="_Toc224251747" w:history="1">
+          <w:hyperlink w:anchor="_Toc224253758" w:history="1">
             <w:r>
               <w:rPr>
                 <w:rStyle w:val="Hyperlink"/>
@@ -2389,7 +2389,7 @@
                 <w:noProof/>
                 <w:webHidden/>
               </w:rPr>
-              <w:instrText xml:space="preserve"> PAGEREF _Toc224251747 \h </w:instrText>
+              <w:instrText xml:space="preserve"> PAGEREF _Toc224253758 \h </w:instrText>
             </w:r>
             <w:r>
               <w:rPr>
@@ -2432,7 +2432,7 @@
               <w:lang w:eastAsia="pt-BR"/>
             </w:rPr>
           </w:pPr>
-          <w:hyperlink w:anchor="_Toc224251748" w:history="1">
+          <w:hyperlink w:anchor="_Toc224253759" w:history="1">
             <w:r>
               <w:rPr>
                 <w:rStyle w:val="Hyperlink"/>
@@ -2462,7 +2462,7 @@
                 <w:noProof/>
                 <w:webHidden/>
               </w:rPr>
-              <w:instrText xml:space="preserve"> PAGEREF _Toc224251748 \h </w:instrText>
+              <w:instrText xml:space="preserve"> PAGEREF _Toc224253759 \h </w:instrText>
             </w:r>
             <w:r>
               <w:rPr>
@@ -2505,7 +2505,7 @@
               <w:lang w:eastAsia="pt-BR"/>
             </w:rPr>
           </w:pPr>
-          <w:hyperlink w:anchor="_Toc224251749" w:history="1">
+          <w:hyperlink w:anchor="_Toc224253760" w:history="1">
             <w:r>
               <w:rPr>
                 <w:rStyle w:val="Hyperlink"/>
@@ -2535,7 +2535,7 @@
                 <w:noProof/>
                 <w:webHidden/>
               </w:rPr>
-              <w:instrText xml:space="preserve"> PAGEREF _Toc224251749 \h </w:instrText>
+              <w:instrText xml:space="preserve"> PAGEREF _Toc224253760 \h </w:instrText>
             </w:r>
             <w:r>
               <w:rPr>
@@ -2578,7 +2578,7 @@
               <w:lang w:eastAsia="pt-BR"/>
             </w:rPr>
           </w:pPr>
-          <w:hyperlink w:anchor="_Toc224251750" w:history="1">
+          <w:hyperlink w:anchor="_Toc224253761" w:history="1">
             <w:r>
               <w:rPr>
                 <w:rStyle w:val="Hyperlink"/>
@@ -2606,7 +2606,7 @@
                 <w:noProof/>
                 <w:webHidden/>
               </w:rPr>
-              <w:instrText xml:space="preserve"> PAGEREF _Toc224251750 \h </w:instrText>
+              <w:instrText xml:space="preserve"> PAGEREF _Toc224253761 \h </w:instrText>
             </w:r>
             <w:r>
               <w:rPr>
@@ -2649,7 +2649,7 @@
               <w:lang w:eastAsia="pt-BR"/>
             </w:rPr>
           </w:pPr>
-          <w:hyperlink w:anchor="_Toc224251751" w:history="1">
+          <w:hyperlink w:anchor="_Toc224253762" w:history="1">
             <w:r>
               <w:rPr>
                 <w:rStyle w:val="Hyperlink"/>
@@ -2677,7 +2677,7 @@
                 <w:noProof/>
                 <w:webHidden/>
               </w:rPr>
-              <w:instrText xml:space="preserve"> PAGEREF _Toc224251751 \h </w:instrText>
+              <w:instrText xml:space="preserve"> PAGEREF _Toc224253762 \h </w:instrText>
             </w:r>
             <w:r>
               <w:rPr>
@@ -2720,7 +2720,7 @@
               <w:lang w:eastAsia="pt-BR"/>
             </w:rPr>
           </w:pPr>
-          <w:hyperlink w:anchor="_Toc224251752" w:history="1">
+          <w:hyperlink w:anchor="_Toc224253763" w:history="1">
             <w:r>
               <w:rPr>
                 <w:rStyle w:val="Hyperlink"/>
@@ -2748,7 +2748,7 @@
                 <w:noProof/>
                 <w:webHidden/>
               </w:rPr>
-              <w:instrText xml:space="preserve"> PAGEREF _Toc224251752 \h </w:instrText>
+              <w:instrText xml:space="preserve"> PAGEREF _Toc224253763 \h </w:instrText>
             </w:r>
             <w:r>
               <w:rPr>
@@ -2791,7 +2791,7 @@
               <w:lang w:eastAsia="pt-BR"/>
             </w:rPr>
           </w:pPr>
-          <w:hyperlink w:anchor="_Toc224251753" w:history="1">
+          <w:hyperlink w:anchor="_Toc224253764" w:history="1">
             <w:r>
               <w:rPr>
                 <w:rStyle w:val="Hyperlink"/>
@@ -2819,7 +2819,7 @@
                 <w:noProof/>
                 <w:webHidden/>
               </w:rPr>
-              <w:instrText xml:space="preserve"> PAGEREF _Toc224251753 \h </w:instrText>
+              <w:instrText xml:space="preserve"> PAGEREF _Toc224253764 \h </w:instrText>
             </w:r>
             <w:r>
               <w:rPr>
@@ -2862,7 +2862,7 @@
               <w:lang w:eastAsia="pt-BR"/>
             </w:rPr>
           </w:pPr>
-          <w:hyperlink w:anchor="_Toc224251754" w:history="1">
+          <w:hyperlink w:anchor="_Toc224253765" w:history="1">
             <w:r>
               <w:rPr>
                 <w:rStyle w:val="Hyperlink"/>
@@ -2890,7 +2890,7 @@
                 <w:noProof/>
                 <w:webHidden/>
               </w:rPr>
-              <w:instrText xml:space="preserve"> PAGEREF _Toc224251754 \h </w:instrText>
+              <w:instrText xml:space="preserve"> PAGEREF _Toc224253765 \h </w:instrText>
             </w:r>
             <w:r>
               <w:rPr>
@@ -2933,7 +2933,7 @@
               <w:lang w:eastAsia="pt-BR"/>
             </w:rPr>
           </w:pPr>
-          <w:hyperlink w:anchor="_Toc224251755" w:history="1">
+          <w:hyperlink w:anchor="_Toc224253766" w:history="1">
             <w:r>
               <w:rPr>
                 <w:rStyle w:val="Hyperlink"/>
@@ -2963,7 +2963,7 @@
                 <w:noProof/>
                 <w:webHidden/>
               </w:rPr>
-              <w:instrText xml:space="preserve"> PAGEREF _Toc224251755 \h </w:instrText>
+              <w:instrText xml:space="preserve"> PAGEREF _Toc224253766 \h </w:instrText>
             </w:r>
             <w:r>
               <w:rPr>
@@ -3006,7 +3006,7 @@
               <w:lang w:eastAsia="pt-BR"/>
             </w:rPr>
           </w:pPr>
-          <w:hyperlink w:anchor="_Toc224251756" w:history="1">
+          <w:hyperlink w:anchor="_Toc224253767" w:history="1">
             <w:r>
               <w:rPr>
                 <w:rStyle w:val="Hyperlink"/>
@@ -3036,7 +3036,7 @@
                 <w:noProof/>
                 <w:webHidden/>
               </w:rPr>
-              <w:instrText xml:space="preserve"> PAGEREF _Toc224251756 \h </w:instrText>
+              <w:instrText xml:space="preserve"> PAGEREF _Toc224253767 \h </w:instrText>
             </w:r>
             <w:r>
               <w:rPr>
@@ -3079,7 +3079,7 @@
               <w:lang w:eastAsia="pt-BR"/>
             </w:rPr>
           </w:pPr>
-          <w:hyperlink w:anchor="_Toc224251757" w:history="1">
+          <w:hyperlink w:anchor="_Toc224253768" w:history="1">
             <w:r>
               <w:rPr>
                 <w:rStyle w:val="Hyperlink"/>
@@ -3109,7 +3109,7 @@
                 <w:noProof/>
                 <w:webHidden/>
               </w:rPr>
-              <w:instrText xml:space="preserve"> PAGEREF _Toc224251757 \h </w:instrText>
+              <w:instrText xml:space="preserve"> PAGEREF _Toc224253768 \h </w:instrText>
             </w:r>
             <w:r>
               <w:rPr>
@@ -3152,7 +3152,7 @@
               <w:lang w:eastAsia="pt-BR"/>
             </w:rPr>
           </w:pPr>
-          <w:hyperlink w:anchor="_Toc224251758" w:history="1">
+          <w:hyperlink w:anchor="_Toc224253769" w:history="1">
             <w:r>
               <w:rPr>
                 <w:rStyle w:val="Hyperlink"/>
@@ -3180,7 +3180,7 @@
                 <w:noProof/>
                 <w:webHidden/>
               </w:rPr>
-              <w:instrText xml:space="preserve"> PAGEREF _Toc224251758 \h </w:instrText>
+              <w:instrText xml:space="preserve"> PAGEREF _Toc224253769 \h </w:instrText>
             </w:r>
             <w:r>
               <w:rPr>
@@ -3223,7 +3223,7 @@
               <w:lang w:eastAsia="pt-BR"/>
             </w:rPr>
           </w:pPr>
-          <w:hyperlink w:anchor="_Toc224251759" w:history="1">
+          <w:hyperlink w:anchor="_Toc224253770" w:history="1">
             <w:r>
               <w:rPr>
                 <w:rStyle w:val="Hyperlink"/>
@@ -3251,7 +3251,7 @@
                 <w:noProof/>
                 <w:webHidden/>
               </w:rPr>
-              <w:instrText xml:space="preserve"> PAGEREF _Toc224251759 \h </w:instrText>
+              <w:instrText xml:space="preserve"> PAGEREF _Toc224253770 \h </w:instrText>
             </w:r>
             <w:r>
               <w:rPr>
@@ -3294,7 +3294,7 @@
               <w:lang w:eastAsia="pt-BR"/>
             </w:rPr>
           </w:pPr>
-          <w:hyperlink w:anchor="_Toc224251760" w:history="1">
+          <w:hyperlink w:anchor="_Toc224253771" w:history="1">
             <w:r>
               <w:rPr>
                 <w:rStyle w:val="Hyperlink"/>
@@ -3324,7 +3324,7 @@
                 <w:noProof/>
                 <w:webHidden/>
               </w:rPr>
-              <w:instrText xml:space="preserve"> PAGEREF _Toc224251760 \h </w:instrText>
+              <w:instrText xml:space="preserve"> PAGEREF _Toc224253771 \h </w:instrText>
             </w:r>
             <w:r>
               <w:rPr>
@@ -3367,7 +3367,7 @@
               <w:lang w:eastAsia="pt-BR"/>
             </w:rPr>
           </w:pPr>
-          <w:hyperlink w:anchor="_Toc224251761" w:history="1">
+          <w:hyperlink w:anchor="_Toc224253772" w:history="1">
             <w:r>
               <w:rPr>
                 <w:rStyle w:val="Hyperlink"/>
@@ -3397,7 +3397,7 @@
                 <w:noProof/>
                 <w:webHidden/>
               </w:rPr>
-              <w:instrText xml:space="preserve"> PAGEREF _Toc224251761 \h </w:instrText>
+              <w:instrText xml:space="preserve"> PAGEREF _Toc224253772 \h </w:instrText>
             </w:r>
             <w:r>
               <w:rPr>
@@ -3440,7 +3440,7 @@
               <w:lang w:eastAsia="pt-BR"/>
             </w:rPr>
           </w:pPr>
-          <w:hyperlink w:anchor="_Toc224251762" w:history="1">
+          <w:hyperlink w:anchor="_Toc224253773" w:history="1">
             <w:r>
               <w:rPr>
                 <w:rStyle w:val="Hyperlink"/>
@@ -3470,7 +3470,7 @@
                 <w:noProof/>
                 <w:webHidden/>
               </w:rPr>
-              <w:instrText xml:space="preserve"> PAGEREF _Toc224251762 \h </w:instrText>
+              <w:instrText xml:space="preserve"> PAGEREF _Toc224253773 \h </w:instrText>
             </w:r>
             <w:r>
               <w:rPr>
@@ -3513,7 +3513,7 @@
               <w:lang w:eastAsia="pt-BR"/>
             </w:rPr>
           </w:pPr>
-          <w:hyperlink w:anchor="_Toc224251763" w:history="1">
+          <w:hyperlink w:anchor="_Toc224253774" w:history="1">
             <w:r>
               <w:rPr>
                 <w:rStyle w:val="Hyperlink"/>
@@ -3541,7 +3541,7 @@
                 <w:noProof/>
                 <w:webHidden/>
               </w:rPr>
-              <w:instrText xml:space="preserve"> PAGEREF _Toc224251763 \h </w:instrText>
+              <w:instrText xml:space="preserve"> PAGEREF _Toc224253774 \h </w:instrText>
             </w:r>
             <w:r>
               <w:rPr>
@@ -3584,7 +3584,7 @@
               <w:lang w:eastAsia="pt-BR"/>
             </w:rPr>
           </w:pPr>
-          <w:hyperlink w:anchor="_Toc224251764" w:history="1">
+          <w:hyperlink w:anchor="_Toc224253775" w:history="1">
             <w:r>
               <w:rPr>
                 <w:rStyle w:val="Hyperlink"/>
@@ -3612,7 +3612,7 @@
                 <w:noProof/>
                 <w:webHidden/>
               </w:rPr>
-              <w:instrText xml:space="preserve"> PAGEREF _Toc224251764 \h </w:instrText>
+              <w:instrText xml:space="preserve"> PAGEREF _Toc224253775 \h </w:instrText>
             </w:r>
             <w:r>
               <w:rPr>
@@ -3655,7 +3655,7 @@
               <w:lang w:eastAsia="pt-BR"/>
             </w:rPr>
           </w:pPr>
-          <w:hyperlink w:anchor="_Toc224251765" w:history="1">
+          <w:hyperlink w:anchor="_Toc224253776" w:history="1">
             <w:r>
               <w:rPr>
                 <w:rStyle w:val="Hyperlink"/>
@@ -3683,7 +3683,7 @@
                 <w:noProof/>
                 <w:webHidden/>
               </w:rPr>
-              <w:instrText xml:space="preserve"> PAGEREF _Toc224251765 \h </w:instrText>
+              <w:instrText xml:space="preserve"> PAGEREF _Toc224253776 \h </w:instrText>
             </w:r>
             <w:r>
               <w:rPr>
@@ -3726,7 +3726,7 @@
               <w:lang w:eastAsia="pt-BR"/>
             </w:rPr>
           </w:pPr>
-          <w:hyperlink w:anchor="_Toc224251766" w:history="1">
+          <w:hyperlink w:anchor="_Toc224253777" w:history="1">
             <w:r>
               <w:rPr>
                 <w:rStyle w:val="Hyperlink"/>
@@ -3754,7 +3754,7 @@
                 <w:noProof/>
                 <w:webHidden/>
               </w:rPr>
-              <w:instrText xml:space="preserve"> PAGEREF _Toc224251766 \h </w:instrText>
+              <w:instrText xml:space="preserve"> PAGEREF _Toc224253777 \h </w:instrText>
             </w:r>
             <w:r>
               <w:rPr>
@@ -3797,7 +3797,7 @@
               <w:lang w:eastAsia="pt-BR"/>
             </w:rPr>
           </w:pPr>
-          <w:hyperlink w:anchor="_Toc224251767" w:history="1">
+          <w:hyperlink w:anchor="_Toc224253778" w:history="1">
             <w:r>
               <w:rPr>
                 <w:rStyle w:val="Hyperlink"/>
@@ -3825,7 +3825,7 @@
                 <w:noProof/>
                 <w:webHidden/>
               </w:rPr>
-              <w:instrText xml:space="preserve"> PAGEREF _Toc224251767 \h </w:instrText>
+              <w:instrText xml:space="preserve"> PAGEREF _Toc224253778 \h </w:instrText>
             </w:r>
             <w:r>
               <w:rPr>
@@ -3868,7 +3868,7 @@
               <w:lang w:eastAsia="pt-BR"/>
             </w:rPr>
           </w:pPr>
-          <w:hyperlink w:anchor="_Toc224251768" w:history="1">
+          <w:hyperlink w:anchor="_Toc224253779" w:history="1">
             <w:r>
               <w:rPr>
                 <w:rStyle w:val="Hyperlink"/>
@@ -3896,7 +3896,7 @@
                 <w:noProof/>
                 <w:webHidden/>
               </w:rPr>
-              <w:instrText xml:space="preserve"> PAGEREF _Toc224251768 \h </w:instrText>
+              <w:instrText xml:space="preserve"> PAGEREF _Toc224253779 \h </w:instrText>
             </w:r>
             <w:r>
               <w:rPr>
@@ -3939,7 +3939,7 @@
               <w:lang w:eastAsia="pt-BR"/>
             </w:rPr>
           </w:pPr>
-          <w:hyperlink w:anchor="_Toc224251769" w:history="1">
+          <w:hyperlink w:anchor="_Toc224253780" w:history="1">
             <w:r>
               <w:rPr>
                 <w:rStyle w:val="Hyperlink"/>
@@ -3967,7 +3967,7 @@
                 <w:noProof/>
                 <w:webHidden/>
               </w:rPr>
-              <w:instrText xml:space="preserve"> PAGEREF _Toc224251769 \h </w:instrText>
+              <w:instrText xml:space="preserve"> PAGEREF _Toc224253780 \h </w:instrText>
             </w:r>
             <w:r>
               <w:rPr>
@@ -4010,7 +4010,7 @@
               <w:lang w:eastAsia="pt-BR"/>
             </w:rPr>
           </w:pPr>
-          <w:hyperlink w:anchor="_Toc224251770" w:history="1">
+          <w:hyperlink w:anchor="_Toc224253781" w:history="1">
             <w:r>
               <w:rPr>
                 <w:rStyle w:val="Hyperlink"/>
@@ -4038,7 +4038,7 @@
                 <w:noProof/>
                 <w:webHidden/>
               </w:rPr>
-              <w:instrText xml:space="preserve"> PAGEREF _Toc224251770 \h </w:instrText>
+              <w:instrText xml:space="preserve"> PAGEREF _Toc224253781 \h </w:instrText>
             </w:r>
             <w:r>
               <w:rPr>
@@ -4081,7 +4081,7 @@
               <w:lang w:eastAsia="pt-BR"/>
             </w:rPr>
           </w:pPr>
-          <w:hyperlink w:anchor="_Toc224251771" w:history="1">
+          <w:hyperlink w:anchor="_Toc224253782" w:history="1">
             <w:r>
               <w:rPr>
                 <w:rStyle w:val="Hyperlink"/>
@@ -4109,7 +4109,7 @@
                 <w:noProof/>
                 <w:webHidden/>
               </w:rPr>
-              <w:instrText xml:space="preserve"> PAGEREF _Toc224251771 \h </w:instrText>
+              <w:instrText xml:space="preserve"> PAGEREF _Toc224253782 \h </w:instrText>
             </w:r>
             <w:r>
               <w:rPr>
@@ -4152,7 +4152,7 @@
               <w:lang w:eastAsia="pt-BR"/>
             </w:rPr>
           </w:pPr>
-          <w:hyperlink w:anchor="_Toc224251772" w:history="1">
+          <w:hyperlink w:anchor="_Toc224253783" w:history="1">
             <w:r>
               <w:rPr>
                 <w:rStyle w:val="Hyperlink"/>
@@ -4180,7 +4180,7 @@
                 <w:noProof/>
                 <w:webHidden/>
               </w:rPr>
-              <w:instrText xml:space="preserve"> PAGEREF _Toc224251772 \h </w:instrText>
+              <w:instrText xml:space="preserve"> PAGEREF _Toc224253783 \h </w:instrText>
             </w:r>
             <w:r>
               <w:rPr>
@@ -4223,7 +4223,7 @@
               <w:lang w:eastAsia="pt-BR"/>
             </w:rPr>
           </w:pPr>
-          <w:hyperlink w:anchor="_Toc224251773" w:history="1">
+          <w:hyperlink w:anchor="_Toc224253784" w:history="1">
             <w:r>
               <w:rPr>
                 <w:rStyle w:val="Hyperlink"/>
@@ -4251,7 +4251,7 @@
                 <w:noProof/>
                 <w:webHidden/>
               </w:rPr>
-              <w:instrText xml:space="preserve"> PAGEREF _Toc224251773 \h </w:instrText>
+              <w:instrText xml:space="preserve"> PAGEREF _Toc224253784 \h </w:instrText>
             </w:r>
             <w:r>
               <w:rPr>
@@ -4294,7 +4294,7 @@
               <w:lang w:eastAsia="pt-BR"/>
             </w:rPr>
           </w:pPr>
-          <w:hyperlink w:anchor="_Toc224251774" w:history="1">
+          <w:hyperlink w:anchor="_Toc224253785" w:history="1">
             <w:r>
               <w:rPr>
                 <w:rStyle w:val="Hyperlink"/>
@@ -4322,7 +4322,7 @@
                 <w:noProof/>
                 <w:webHidden/>
               </w:rPr>
-              <w:instrText xml:space="preserve"> PAGEREF _Toc224251774 \h </w:instrText>
+              <w:instrText xml:space="preserve"> PAGEREF _Toc224253785 \h </w:instrText>
             </w:r>
             <w:r>
               <w:rPr>
@@ -4365,7 +4365,7 @@
               <w:lang w:eastAsia="pt-BR"/>
             </w:rPr>
           </w:pPr>
-          <w:hyperlink w:anchor="_Toc224251775" w:history="1">
+          <w:hyperlink w:anchor="_Toc224253786" w:history="1">
             <w:r>
               <w:rPr>
                 <w:rStyle w:val="Hyperlink"/>
@@ -4393,7 +4393,7 @@
                 <w:noProof/>
                 <w:webHidden/>
               </w:rPr>
-              <w:instrText xml:space="preserve"> PAGEREF _Toc224251775 \h </w:instrText>
+              <w:instrText xml:space="preserve"> PAGEREF _Toc224253786 \h </w:instrText>
             </w:r>
             <w:r>
               <w:rPr>
@@ -4436,7 +4436,7 @@
               <w:lang w:eastAsia="pt-BR"/>
             </w:rPr>
           </w:pPr>
-          <w:hyperlink w:anchor="_Toc224251776" w:history="1">
+          <w:hyperlink w:anchor="_Toc224253787" w:history="1">
             <w:r>
               <w:rPr>
                 <w:rStyle w:val="Hyperlink"/>
@@ -4464,7 +4464,7 @@
                 <w:noProof/>
                 <w:webHidden/>
               </w:rPr>
-              <w:instrText xml:space="preserve"> PAGEREF _Toc224251776 \h </w:instrText>
+              <w:instrText xml:space="preserve"> PAGEREF _Toc224253787 \h </w:instrText>
             </w:r>
             <w:r>
               <w:rPr>
@@ -4575,13 +4575,7 @@
         <w:rPr>
           <w:rFonts w:ascii="Times New Roman" w:hAnsi="Times New Roman" w:cs="Times New Roman"/>
         </w:rPr>
-        <w:t>E</w:t>
-      </w:r>
-      <w:r>
-        <w:rPr>
-          <w:rFonts w:ascii="Times New Roman" w:hAnsi="Times New Roman" w:cs="Times New Roman"/>
-        </w:rPr>
-        <w:t>ste relatório técnico apresenta a análise geoestatística do passivo de Reserva Legal (RL) em imóveis rurais acima de quatro módulos fiscais no estado do Pará, sob a ótica da regra de transição estabelecida pelo Art. 12, § 4º da Lei nº 12.651/2012 . A metodologia integrou o processamento de grandes volumes de dados do SICAR-PA utilizando rotinas de automação em Python e Google Earth Engine, com análise estatística em linguagem R. A aplicação do critério de elegibilidade baseado na sobreposição municipal com áreas protegidas (Unidades de Conservação de domínio público e Terras Indígenas) superior a 50% identificou 18 municípios aptos, gerando um Delta de Regularização (</w:t>
+        <w:t>Este relatório técnico apresenta a análise geoestatística do passivo de Reserva Legal (RL) em imóveis rurais acima de quatro módulos fiscais no estado do Pará, sob a ótica da regra de transição estabelecida pelo Art. 12, § 4º da Lei nº 12.651/2012 . A metodologia integrou o processamento de grandes volumes de dados do SICAR-PA utilizando rotinas de automação em Python e Google Earth Engine, com análise estatística em linguagem R. A aplicação do critério de elegibilidade baseado na sobreposição municipal com áreas protegidas (Unidades de Conservação de domínio público e Terras Indígenas) superior a 50% identificou 18 municípios aptos, gerando um Delta de Regularização (</w:t>
       </w:r>
       <m:oMath>
         <m:sSub>
@@ -4623,19 +4617,7 @@
         <w:rPr>
           <w:rFonts w:ascii="Times New Roman" w:hAnsi="Times New Roman" w:cs="Times New Roman"/>
         </w:rPr>
-        <w:t>) de aproximadamente 5,8 milhões de hectares</w:t>
-      </w:r>
-      <w:r>
-        <w:rPr>
-          <w:rFonts w:ascii="Times New Roman" w:hAnsi="Times New Roman" w:cs="Times New Roman"/>
-        </w:rPr>
-        <w:t xml:space="preserve">. </w:t>
-      </w:r>
-      <w:r>
-        <w:rPr>
-          <w:rFonts w:ascii="Times New Roman" w:hAnsi="Times New Roman" w:cs="Times New Roman"/>
-        </w:rPr>
-        <w:t>A validação temporal via MapBiomas (Coleção 9) confirmou que a redução do passivo incide exclusivamente sobre áreas consolidadas antes de 22 de julho de 2008, mantendo-se a obrigatoriedade de recomposição para os 2,2 milhões de hectares de passivo não consolidado detectados. Os achados em 8.153 imóveis elegíveis demonstram que a transição normativa possibilita a conformidade ambiental imediata de 3.564 propriedades, permitindo o redirecionamento estratégico das ações de monitoramento e fomento florestal do estado para o passivo gerado após o marco legal de 2008.</w:t>
+        <w:t>) de aproximadamente 5,8 milhões de hectares. A validação temporal via MapBiomas (Coleção 9) confirmou que a redução do passivo incide exclusivamente sobre áreas consolidadas antes de 22 de julho de 2008, mantendo-se a obrigatoriedade de recomposição para os 2,2 milhões de hectares de passivo não consolidado detectados. Os achados em 8.153 imóveis elegíveis demonstram que a transição normativa possibilita a conformidade ambiental imediata de 3.564 propriedades, permitindo o redirecionamento estratégico das ações de monitoramento e fomento florestal do estado para o passivo gerado após o marco legal de 2008.</w:t>
       </w:r>
     </w:p>
     <w:p>
@@ -4719,7 +4701,7 @@
           <w:rFonts w:cs="Times New Roman"/>
         </w:rPr>
       </w:pPr>
-      <w:bookmarkStart w:id="0" w:name="_Toc224251724"/>
+      <w:bookmarkStart w:id="0" w:name="_Toc224253735"/>
       <w:r>
         <w:rPr>
           <w:rFonts w:cs="Times New Roman"/>
@@ -4739,7 +4721,7 @@
           <w:szCs w:val="24"/>
         </w:rPr>
       </w:pPr>
-      <w:bookmarkStart w:id="1" w:name="_Toc224251725"/>
+      <w:bookmarkStart w:id="1" w:name="_Toc224253736"/>
       <w:r>
         <w:rPr>
           <w:rFonts w:ascii="Times New Roman" w:hAnsi="Times New Roman" w:cs="Times New Roman"/>
@@ -4889,7 +4871,7 @@
           <w:szCs w:val="24"/>
         </w:rPr>
       </w:pPr>
-      <w:bookmarkStart w:id="2" w:name="_Toc224251726"/>
+      <w:bookmarkStart w:id="2" w:name="_Toc224253737"/>
       <w:r>
         <w:rPr>
           <w:rFonts w:ascii="Times New Roman" w:hAnsi="Times New Roman" w:cs="Times New Roman"/>
@@ -4912,7 +4894,7 @@
           <w:szCs w:val="24"/>
         </w:rPr>
       </w:pPr>
-      <w:bookmarkStart w:id="3" w:name="_Toc224251727"/>
+      <w:bookmarkStart w:id="3" w:name="_Toc224253738"/>
       <w:r>
         <w:rPr>
           <w:rFonts w:ascii="Times New Roman" w:hAnsi="Times New Roman" w:cs="Times New Roman"/>
@@ -4954,7 +4936,7 @@
           <w:szCs w:val="24"/>
         </w:rPr>
       </w:pPr>
-      <w:bookmarkStart w:id="4" w:name="_Toc224251728"/>
+      <w:bookmarkStart w:id="4" w:name="_Toc224253739"/>
       <w:r>
         <w:rPr>
           <w:rFonts w:ascii="Times New Roman" w:hAnsi="Times New Roman" w:cs="Times New Roman"/>
@@ -5107,13 +5089,7 @@
         <w:rPr>
           <w:rFonts w:ascii="Times New Roman" w:hAnsi="Times New Roman" w:cs="Times New Roman"/>
         </w:rPr>
-        <w:t xml:space="preserve">: </w:t>
-      </w:r>
-      <w:r>
-        <w:rPr>
-          <w:rFonts w:ascii="Times New Roman" w:hAnsi="Times New Roman" w:cs="Times New Roman"/>
-        </w:rPr>
-        <w:t>Simular comparativamente os cenários de 80% e 50% de Reserva Legal para mensurar o Delta de Regularização, identificando o volume de área que atinge a conformidade sem necessidade de compensação ou recomposição;</w:t>
+        <w:t>: Simular comparativamente os cenários de 80% e 50% de Reserva Legal para mensurar o Delta de Regularização, identificando o volume de área que atinge a conformidade sem necessidade de compensação ou recomposição;</w:t>
       </w:r>
     </w:p>
     <w:p>
@@ -5147,7 +5123,7 @@
           <w:szCs w:val="24"/>
         </w:rPr>
       </w:pPr>
-      <w:bookmarkStart w:id="5" w:name="_Toc224251729"/>
+      <w:bookmarkStart w:id="5" w:name="_Toc224253740"/>
       <w:r>
         <w:rPr>
           <w:rFonts w:ascii="Times New Roman" w:hAnsi="Times New Roman" w:cs="Times New Roman"/>
@@ -5185,7 +5161,7 @@
           <w:szCs w:val="24"/>
         </w:rPr>
       </w:pPr>
-      <w:bookmarkStart w:id="6" w:name="_Toc224251730"/>
+      <w:bookmarkStart w:id="6" w:name="_Toc224253741"/>
       <w:r>
         <w:rPr>
           <w:rFonts w:ascii="Times New Roman" w:hAnsi="Times New Roman" w:cs="Times New Roman"/>
@@ -5262,7 +5238,7 @@
           <w:szCs w:val="24"/>
         </w:rPr>
       </w:pPr>
-      <w:bookmarkStart w:id="7" w:name="_Toc224251731"/>
+      <w:bookmarkStart w:id="7" w:name="_Toc224253742"/>
       <w:r>
         <w:rPr>
           <w:rFonts w:ascii="Times New Roman" w:hAnsi="Times New Roman" w:cs="Times New Roman"/>
@@ -5318,7 +5294,7 @@
           <w:szCs w:val="24"/>
         </w:rPr>
       </w:pPr>
-      <w:bookmarkStart w:id="8" w:name="_Toc224251732"/>
+      <w:bookmarkStart w:id="8" w:name="_Toc224253743"/>
       <w:r>
         <w:rPr>
           <w:rFonts w:ascii="Times New Roman" w:hAnsi="Times New Roman" w:cs="Times New Roman"/>
@@ -5381,7 +5357,7 @@
           <w:szCs w:val="24"/>
         </w:rPr>
       </w:pPr>
-      <w:bookmarkStart w:id="9" w:name="_Toc224251733"/>
+      <w:bookmarkStart w:id="9" w:name="_Toc224253744"/>
       <w:r>
         <w:rPr>
           <w:rFonts w:ascii="Times New Roman" w:hAnsi="Times New Roman" w:cs="Times New Roman"/>
@@ -5434,7 +5410,7 @@
           <w:rFonts w:cs="Times New Roman"/>
         </w:rPr>
       </w:pPr>
-      <w:bookmarkStart w:id="10" w:name="_Toc224251734"/>
+      <w:bookmarkStart w:id="10" w:name="_Toc224253745"/>
       <w:r>
         <w:rPr>
           <w:rFonts w:cs="Times New Roman"/>
@@ -5453,7 +5429,7 @@
           <w:szCs w:val="24"/>
         </w:rPr>
       </w:pPr>
-      <w:bookmarkStart w:id="11" w:name="_Toc224251735"/>
+      <w:bookmarkStart w:id="11" w:name="_Toc224253746"/>
       <w:r>
         <w:rPr>
           <w:rFonts w:ascii="Times New Roman" w:hAnsi="Times New Roman" w:cs="Times New Roman"/>
@@ -5528,7 +5504,7 @@
           <w:szCs w:val="24"/>
         </w:rPr>
       </w:pPr>
-      <w:bookmarkStart w:id="12" w:name="_Toc224251736"/>
+      <w:bookmarkStart w:id="12" w:name="_Toc224253747"/>
       <w:r>
         <w:rPr>
           <w:rFonts w:ascii="Times New Roman" w:hAnsi="Times New Roman" w:cs="Times New Roman"/>
@@ -5638,7 +5614,7 @@
           <w:szCs w:val="24"/>
         </w:rPr>
       </w:pPr>
-      <w:bookmarkStart w:id="13" w:name="_Toc224251737"/>
+      <w:bookmarkStart w:id="13" w:name="_Toc224253748"/>
       <w:r>
         <w:rPr>
           <w:rFonts w:ascii="Times New Roman" w:hAnsi="Times New Roman" w:cs="Times New Roman"/>
@@ -5676,7 +5652,7 @@
           <w:szCs w:val="24"/>
         </w:rPr>
       </w:pPr>
-      <w:bookmarkStart w:id="14" w:name="_Toc224251738"/>
+      <w:bookmarkStart w:id="14" w:name="_Toc224253749"/>
       <w:r>
         <w:rPr>
           <w:rFonts w:ascii="Times New Roman" w:hAnsi="Times New Roman" w:cs="Times New Roman"/>
@@ -5745,7 +5721,7 @@
           <w:szCs w:val="24"/>
         </w:rPr>
       </w:pPr>
-      <w:bookmarkStart w:id="15" w:name="_Toc224251739"/>
+      <w:bookmarkStart w:id="15" w:name="_Toc224253750"/>
       <w:r>
         <w:rPr>
           <w:rFonts w:ascii="Times New Roman" w:hAnsi="Times New Roman" w:cs="Times New Roman"/>
@@ -5821,7 +5797,7 @@
           <w:szCs w:val="24"/>
         </w:rPr>
       </w:pPr>
-      <w:bookmarkStart w:id="16" w:name="_Toc224251740"/>
+      <w:bookmarkStart w:id="16" w:name="_Toc224253751"/>
       <w:r>
         <w:rPr>
           <w:rFonts w:ascii="Times New Roman" w:hAnsi="Times New Roman" w:cs="Times New Roman"/>
@@ -5912,7 +5888,7 @@
           <w:szCs w:val="24"/>
         </w:rPr>
       </w:pPr>
-      <w:bookmarkStart w:id="17" w:name="_Toc224251741"/>
+      <w:bookmarkStart w:id="17" w:name="_Toc224253752"/>
       <w:r>
         <w:rPr>
           <w:rFonts w:ascii="Times New Roman" w:hAnsi="Times New Roman" w:cs="Times New Roman"/>
@@ -6049,7 +6025,7 @@
           <w:szCs w:val="24"/>
         </w:rPr>
       </w:pPr>
-      <w:bookmarkStart w:id="18" w:name="_Toc224251742"/>
+      <w:bookmarkStart w:id="18" w:name="_Toc224253753"/>
       <w:r>
         <w:rPr>
           <w:rFonts w:ascii="Times New Roman" w:hAnsi="Times New Roman" w:cs="Times New Roman"/>
@@ -6087,7 +6063,7 @@
           <w:szCs w:val="24"/>
         </w:rPr>
       </w:pPr>
-      <w:bookmarkStart w:id="19" w:name="_Toc224251743"/>
+      <w:bookmarkStart w:id="19" w:name="_Toc224253754"/>
       <w:r>
         <w:rPr>
           <w:rFonts w:ascii="Times New Roman" w:hAnsi="Times New Roman" w:cs="Times New Roman"/>
@@ -6206,7 +6182,7 @@
           <w:szCs w:val="24"/>
         </w:rPr>
       </w:pPr>
-      <w:bookmarkStart w:id="20" w:name="_Toc224251744"/>
+      <w:bookmarkStart w:id="20" w:name="_Toc224253755"/>
       <w:r>
         <w:rPr>
           <w:rFonts w:ascii="Times New Roman" w:hAnsi="Times New Roman" w:cs="Times New Roman"/>
@@ -6273,7 +6249,7 @@
           <w:szCs w:val="24"/>
         </w:rPr>
       </w:pPr>
-      <w:bookmarkStart w:id="21" w:name="_Toc224251745"/>
+      <w:bookmarkStart w:id="21" w:name="_Toc224253756"/>
       <w:r>
         <w:rPr>
           <w:rFonts w:ascii="Times New Roman" w:hAnsi="Times New Roman" w:cs="Times New Roman"/>
@@ -6327,7 +6303,7 @@
           <w:szCs w:val="24"/>
         </w:rPr>
       </w:pPr>
-      <w:bookmarkStart w:id="22" w:name="_Toc224251746"/>
+      <w:bookmarkStart w:id="22" w:name="_Toc224253757"/>
       <w:r>
         <w:rPr>
           <w:rFonts w:ascii="Times New Roman" w:hAnsi="Times New Roman" w:cs="Times New Roman"/>
@@ -6412,7 +6388,7 @@
           <w:szCs w:val="24"/>
         </w:rPr>
       </w:pPr>
-      <w:bookmarkStart w:id="23" w:name="_Toc224251747"/>
+      <w:bookmarkStart w:id="23" w:name="_Toc224253758"/>
       <w:r>
         <w:rPr>
           <w:rFonts w:ascii="Times New Roman" w:hAnsi="Times New Roman" w:cs="Times New Roman"/>
@@ -6536,7 +6512,7 @@
           <w:szCs w:val="24"/>
         </w:rPr>
       </w:pPr>
-      <w:bookmarkStart w:id="24" w:name="_Toc224251748"/>
+      <w:bookmarkStart w:id="24" w:name="_Toc224253759"/>
       <w:r>
         <w:rPr>
           <w:rFonts w:ascii="Times New Roman" w:hAnsi="Times New Roman" w:cs="Times New Roman"/>
@@ -6583,7 +6559,7 @@
           <w:szCs w:val="24"/>
         </w:rPr>
       </w:pPr>
-      <w:bookmarkStart w:id="25" w:name="_Toc224251749"/>
+      <w:bookmarkStart w:id="25" w:name="_Toc224253760"/>
       <w:r>
         <w:rPr>
           <w:rFonts w:ascii="Times New Roman" w:hAnsi="Times New Roman" w:cs="Times New Roman"/>
@@ -6650,7 +6626,7 @@
           <w:rFonts w:cs="Times New Roman"/>
         </w:rPr>
       </w:pPr>
-      <w:bookmarkStart w:id="26" w:name="_Toc224251750"/>
+      <w:bookmarkStart w:id="26" w:name="_Toc224253761"/>
       <w:r>
         <w:rPr>
           <w:rFonts w:cs="Times New Roman"/>
@@ -6699,7 +6675,7 @@
           <w:szCs w:val="24"/>
         </w:rPr>
       </w:pPr>
-      <w:bookmarkStart w:id="27" w:name="_Toc224251751"/>
+      <w:bookmarkStart w:id="27" w:name="_Toc224253762"/>
       <w:r>
         <w:rPr>
           <w:rFonts w:ascii="Times New Roman" w:hAnsi="Times New Roman" w:cs="Times New Roman"/>
@@ -6749,6 +6725,21 @@
         </w:rPr>
         <w:t>Esta categorização fundamenta-se nos critérios de classificação de imóveis rurais estabelecidos pela legislação federal, que define como média propriedade o imóvel rural com área superior a 4 (quatro) e até 15 (quinze) módulos fiscais, e como grande propriedade o imóvel com área superior a 15 (quinze) módulos fiscais (BRASIL, 1993).</w:t>
       </w:r>
+      <w:r>
+        <w:t xml:space="preserve"> </w:t>
+      </w:r>
+      <w:r>
+        <w:rPr>
+          <w:rFonts w:ascii="Times New Roman" w:hAnsi="Times New Roman" w:cs="Times New Roman"/>
+        </w:rPr>
+        <w:t>A exclusão de imóveis de pequeno porte (até 4 MF) nesta análise decorre da aplicação do Artigo 67 da Lei nº 12.651/2012, que já desobriga tais propriedades da recomposição da Reserva Legal além da vegetação nativa existente em 22 de julho de 2008 . Portanto, o foco desta modelagem recai sobre o estrato fundiário que carece de mecanismos automáticos de conformidade, concentrando o maior volume de passivo ambiental passível de regularização via Artigo 12</w:t>
+      </w:r>
+      <w:r>
+        <w:rPr>
+          <w:rFonts w:ascii="Times New Roman" w:hAnsi="Times New Roman" w:cs="Times New Roman"/>
+        </w:rPr>
+        <w:t>.</w:t>
+      </w:r>
     </w:p>
     <w:p>
       <w:pPr>
@@ -6820,7 +6811,7 @@
           <w:szCs w:val="24"/>
         </w:rPr>
       </w:pPr>
-      <w:bookmarkStart w:id="28" w:name="_Toc224251752"/>
+      <w:bookmarkStart w:id="28" w:name="_Toc224253763"/>
       <w:r>
         <w:rPr>
           <w:rFonts w:ascii="Times New Roman" w:hAnsi="Times New Roman" w:cs="Times New Roman"/>
@@ -6945,7 +6936,14 @@
         <w:rPr>
           <w:rFonts w:ascii="Times New Roman" w:hAnsi="Times New Roman" w:cs="Times New Roman"/>
         </w:rPr>
-        <w:t xml:space="preserve"> admite apenas um tipo geométrico por arquivo, a coluna de pontos foi removida. Adicionalmente, realizou-se a higienização dos metadados através do truncamento dos nomes das colunas e a conversão de tipos de dados para evitar inconsistências durante a ingestão na plataforma </w:t>
+        <w:t xml:space="preserve"> admite apenas um tipo geométrico por arquivo, a coluna de pontos foi removida. Adicionalmente, realizou-se a higienização dos metadados através do truncamento dos nomes das colunas e a </w:t>
+      </w:r>
+      <w:r>
+        <w:rPr>
+          <w:rFonts w:ascii="Times New Roman" w:hAnsi="Times New Roman" w:cs="Times New Roman"/>
+        </w:rPr>
+        <w:lastRenderedPageBreak/>
+        <w:t xml:space="preserve">conversão de tipos de dados para evitar inconsistências durante a ingestão na plataforma </w:t>
       </w:r>
       <w:r>
         <w:rPr>
@@ -7003,14 +7001,7 @@
         <w:rPr>
           <w:rFonts w:ascii="Times New Roman" w:hAnsi="Times New Roman" w:cs="Times New Roman"/>
         </w:rPr>
-        <w:t xml:space="preserve"> pela sua superioridade em performance de escrita vetorial. Os arquivos resultantes </w:t>
-      </w:r>
-      <w:r>
-        <w:rPr>
-          <w:rFonts w:ascii="Times New Roman" w:hAnsi="Times New Roman" w:cs="Times New Roman"/>
-        </w:rPr>
-        <w:lastRenderedPageBreak/>
-        <w:t xml:space="preserve">foram consolidados para </w:t>
+        <w:t xml:space="preserve"> pela sua superioridade em performance de escrita vetorial. Os arquivos resultantes foram consolidados para </w:t>
       </w:r>
       <w:r>
         <w:rPr>
@@ -7051,7 +7042,7 @@
           <w:szCs w:val="24"/>
         </w:rPr>
       </w:pPr>
-      <w:bookmarkStart w:id="29" w:name="_Toc224251753"/>
+      <w:bookmarkStart w:id="29" w:name="_Toc224253764"/>
       <w:r>
         <w:rPr>
           <w:rFonts w:ascii="Times New Roman" w:hAnsi="Times New Roman" w:cs="Times New Roman"/>
@@ -7690,6 +7681,7 @@
           <w:b/>
           <w:bCs/>
         </w:rPr>
+        <w:lastRenderedPageBreak/>
         <w:t>Identificação do Passivo Não Consolidado:</w:t>
       </w:r>
     </w:p>
@@ -7916,7 +7908,6 @@
             <w:rPr>
               <w:rFonts w:ascii="Cambria Math" w:hAnsi="Cambria Math" w:cs="Times New Roman"/>
             </w:rPr>
-            <w:lastRenderedPageBreak/>
             <m:t>Δ</m:t>
           </m:r>
           <m:r>
@@ -8350,7 +8341,7 @@
           <w:szCs w:val="24"/>
         </w:rPr>
       </w:pPr>
-      <w:bookmarkStart w:id="30" w:name="_Toc224251754"/>
+      <w:bookmarkStart w:id="30" w:name="_Toc224253765"/>
       <w:r>
         <w:rPr>
           <w:rFonts w:ascii="Times New Roman" w:hAnsi="Times New Roman" w:cs="Times New Roman"/>
@@ -8402,7 +8393,7 @@
           <w:szCs w:val="24"/>
         </w:rPr>
       </w:pPr>
-      <w:bookmarkStart w:id="31" w:name="_Toc224251755"/>
+      <w:bookmarkStart w:id="31" w:name="_Toc224253766"/>
       <w:r>
         <w:rPr>
           <w:rFonts w:ascii="Times New Roman" w:hAnsi="Times New Roman" w:cs="Times New Roman"/>
@@ -8429,7 +8420,14 @@
         <w:rPr>
           <w:rFonts w:ascii="Times New Roman" w:hAnsi="Times New Roman" w:cs="Times New Roman"/>
         </w:rPr>
-        <w:t>A base principal de imóveis rurais com área superior a 4 Módulos Fiscais (MF) foi integrada à malha de áreas protegidas, compreendendo Unidades de Conservação de domínio público e Terras Indígenas homologadas. O critério de elegibilidade para a redução da Reserva Legal (RL) de 80% para 50% foi aplicado seguindo a diretriz de que o município deve possuir mais de 50% de seu território ocupado por unidades de conservação da natureza de domínio público e por terras indígenas homologadas. Esta regra fundamenta-se no Art. 12, § 4º, da Lei nº 12.651/2012, que rege a proteção da vegetação nativa no território nacional.</w:t>
+        <w:t xml:space="preserve">A base principal de imóveis rurais com área superior a 4 Módulos Fiscais (MF) foi integrada à malha de áreas protegidas, compreendendo Unidades de Conservação de domínio público e Terras Indígenas homologadas. O critério de elegibilidade para a redução da Reserva Legal (RL) de 80% para 50% foi aplicado seguindo a diretriz de que o município deve possuir mais de 50% de seu território ocupado por unidades de conservação da natureza de domínio </w:t>
+      </w:r>
+      <w:r>
+        <w:rPr>
+          <w:rFonts w:ascii="Times New Roman" w:hAnsi="Times New Roman" w:cs="Times New Roman"/>
+        </w:rPr>
+        <w:lastRenderedPageBreak/>
+        <w:t>público e por terras indígenas homologadas. Esta regra fundamenta-se no Art. 12, § 4º, da Lei nº 12.651/2012, que rege a proteção da vegetação nativa no território nacional.</w:t>
       </w:r>
     </w:p>
     <w:p>
@@ -8442,7 +8440,7 @@
           <w:szCs w:val="24"/>
         </w:rPr>
       </w:pPr>
-      <w:bookmarkStart w:id="32" w:name="_Toc224251756"/>
+      <w:bookmarkStart w:id="32" w:name="_Toc224253767"/>
       <w:r>
         <w:rPr>
           <w:rFonts w:ascii="Times New Roman" w:hAnsi="Times New Roman" w:cs="Times New Roman"/>
@@ -8452,7 +8450,6 @@
           <w:sz w:val="24"/>
           <w:szCs w:val="24"/>
         </w:rPr>
-        <w:lastRenderedPageBreak/>
         <w:t>3.4.2 Cálculo de passivos e impacto regulatório</w:t>
       </w:r>
       <w:bookmarkEnd w:id="32"/>
@@ -8814,7 +8811,7 @@
           <w:szCs w:val="24"/>
         </w:rPr>
       </w:pPr>
-      <w:bookmarkStart w:id="33" w:name="_Toc224251757"/>
+      <w:bookmarkStart w:id="33" w:name="_Toc224253768"/>
       <w:r>
         <w:rPr>
           <w:rFonts w:ascii="Times New Roman" w:hAnsi="Times New Roman" w:cs="Times New Roman"/>
@@ -8882,7 +8879,7 @@
           <w:szCs w:val="24"/>
         </w:rPr>
       </w:pPr>
-      <w:bookmarkStart w:id="34" w:name="_Toc224251758"/>
+      <w:bookmarkStart w:id="34" w:name="_Toc224253769"/>
       <w:r>
         <w:rPr>
           <w:rFonts w:ascii="Times New Roman" w:hAnsi="Times New Roman" w:cs="Times New Roman"/>
@@ -8963,6 +8960,7 @@
         <w:rPr>
           <w:rFonts w:ascii="Times New Roman" w:hAnsi="Times New Roman" w:cs="Times New Roman"/>
         </w:rPr>
+        <w:lastRenderedPageBreak/>
         <w:t>a) mapeamento de elegibilidade (Art. 12): identificação geoespacial dos municípios aptos à redução da Reserva Legal, baseada no cruzamento entre a área total municipal e a extensão de áreas protegidas, compreendendo Unidades de Conservação de domínio público e Terras Indígenas homologadas;</w:t>
       </w:r>
     </w:p>
@@ -8978,7 +8976,6 @@
         <w:rPr>
           <w:rFonts w:ascii="Times New Roman" w:hAnsi="Times New Roman" w:cs="Times New Roman"/>
         </w:rPr>
-        <w:lastRenderedPageBreak/>
         <w:t>b) mapeamento do impacto da regularização</w:t>
       </w:r>
       <w:r>
@@ -9116,7 +9113,7 @@
           <w:szCs w:val="24"/>
         </w:rPr>
       </w:pPr>
-      <w:bookmarkStart w:id="35" w:name="_Toc224251759"/>
+      <w:bookmarkStart w:id="35" w:name="_Toc224253770"/>
       <w:r>
         <w:rPr>
           <w:rFonts w:ascii="Times New Roman" w:hAnsi="Times New Roman" w:cs="Times New Roman"/>
@@ -9168,7 +9165,7 @@
           <w:szCs w:val="24"/>
         </w:rPr>
       </w:pPr>
-      <w:bookmarkStart w:id="36" w:name="_Toc224251760"/>
+      <w:bookmarkStart w:id="36" w:name="_Toc224253771"/>
       <w:r>
         <w:rPr>
           <w:rFonts w:ascii="Times New Roman" w:hAnsi="Times New Roman" w:cs="Times New Roman"/>
@@ -9208,7 +9205,7 @@
           <w:szCs w:val="24"/>
         </w:rPr>
       </w:pPr>
-      <w:bookmarkStart w:id="37" w:name="_Toc224251761"/>
+      <w:bookmarkStart w:id="37" w:name="_Toc224253772"/>
       <w:r>
         <w:rPr>
           <w:rFonts w:ascii="Times New Roman" w:hAnsi="Times New Roman" w:cs="Times New Roman"/>
@@ -9267,6 +9264,7 @@
         <w:rPr>
           <w:rFonts w:ascii="Times New Roman" w:hAnsi="Times New Roman" w:cs="Times New Roman"/>
         </w:rPr>
+        <w:lastRenderedPageBreak/>
         <w:t>b) elegível - apenas passivo consolidado: imóveis cujo déficit é composto integralmente por supressões ocorridas antes de 22 de julho de 2008;</w:t>
       </w:r>
     </w:p>
@@ -9299,7 +9297,6 @@
         <w:rPr>
           <w:rFonts w:ascii="Times New Roman" w:hAnsi="Times New Roman" w:cs="Times New Roman"/>
         </w:rPr>
-        <w:lastRenderedPageBreak/>
         <w:t>d) elegível - ambos passivos: imóveis com ocorrência simultânea de déficits consolidados e não consolidados;</w:t>
       </w:r>
     </w:p>
@@ -9329,7 +9326,7 @@
           <w:szCs w:val="24"/>
         </w:rPr>
       </w:pPr>
-      <w:bookmarkStart w:id="38" w:name="_Toc224251762"/>
+      <w:bookmarkStart w:id="38" w:name="_Toc224253773"/>
       <w:r>
         <w:rPr>
           <w:rFonts w:ascii="Times New Roman" w:hAnsi="Times New Roman" w:cs="Times New Roman"/>
@@ -9498,7 +9495,7 @@
           <w:rFonts w:cs="Times New Roman"/>
         </w:rPr>
       </w:pPr>
-      <w:bookmarkStart w:id="39" w:name="_Toc224251763"/>
+      <w:bookmarkStart w:id="39" w:name="_Toc224253774"/>
       <w:r>
         <w:rPr>
           <w:rFonts w:cs="Times New Roman"/>
@@ -9533,7 +9530,7 @@
           <w:szCs w:val="24"/>
         </w:rPr>
       </w:pPr>
-      <w:bookmarkStart w:id="40" w:name="_Toc224251764"/>
+      <w:bookmarkStart w:id="40" w:name="_Toc224253775"/>
       <w:r>
         <w:rPr>
           <w:rFonts w:ascii="Times New Roman" w:hAnsi="Times New Roman" w:cs="Times New Roman"/>
@@ -9911,7 +9908,7 @@
           <w:szCs w:val="24"/>
         </w:rPr>
       </w:pPr>
-      <w:bookmarkStart w:id="41" w:name="_Toc224251765"/>
+      <w:bookmarkStart w:id="41" w:name="_Toc224253776"/>
       <w:r>
         <w:rPr>
           <w:rFonts w:ascii="Times New Roman" w:hAnsi="Times New Roman" w:cs="Times New Roman"/>
@@ -10232,7 +10229,7 @@
           <w:szCs w:val="24"/>
         </w:rPr>
       </w:pPr>
-      <w:bookmarkStart w:id="42" w:name="_Toc224251766"/>
+      <w:bookmarkStart w:id="42" w:name="_Toc224253777"/>
       <w:r>
         <w:rPr>
           <w:rFonts w:ascii="Times New Roman" w:hAnsi="Times New Roman" w:cs="Times New Roman"/>
@@ -10637,7 +10634,7 @@
           <w:szCs w:val="24"/>
         </w:rPr>
       </w:pPr>
-      <w:bookmarkStart w:id="43" w:name="_Toc224251767"/>
+      <w:bookmarkStart w:id="43" w:name="_Toc224253778"/>
       <w:r>
         <w:rPr>
           <w:rFonts w:ascii="Times New Roman" w:hAnsi="Times New Roman" w:cs="Times New Roman"/>
@@ -11165,7 +11162,7 @@
           <w:szCs w:val="24"/>
         </w:rPr>
       </w:pPr>
-      <w:bookmarkStart w:id="44" w:name="_Toc224251768"/>
+      <w:bookmarkStart w:id="44" w:name="_Toc224253779"/>
       <w:r>
         <w:rPr>
           <w:rFonts w:ascii="Times New Roman" w:hAnsi="Times New Roman" w:cs="Times New Roman"/>
@@ -11655,7 +11652,7 @@
         </w:rPr>
         <w:lastRenderedPageBreak/>
         <w:drawing>
-          <wp:inline distT="0" distB="0" distL="0" distR="0" wp14:anchorId="7F927DF7" wp14:editId="5E7B86F5">
+          <wp:inline distT="0" distB="0" distL="0" distR="0" wp14:anchorId="7F927DF7" wp14:editId="1E3B71A7">
             <wp:extent cx="4888230" cy="3666442"/>
             <wp:effectExtent l="19050" t="19050" r="26670" b="10795"/>
             <wp:docPr id="1996467611" name="Imagem 11"/>
@@ -11854,7 +11851,7 @@
           <w:rFonts w:cs="Times New Roman"/>
         </w:rPr>
       </w:pPr>
-      <w:bookmarkStart w:id="45" w:name="_Toc224251769"/>
+      <w:bookmarkStart w:id="45" w:name="_Toc224253780"/>
       <w:r>
         <w:rPr>
           <w:rFonts w:cs="Times New Roman"/>
@@ -11873,7 +11870,7 @@
           <w:szCs w:val="24"/>
         </w:rPr>
       </w:pPr>
-      <w:bookmarkStart w:id="46" w:name="_Toc224251770"/>
+      <w:bookmarkStart w:id="46" w:name="_Toc224253781"/>
       <w:r>
         <w:rPr>
           <w:rFonts w:ascii="Times New Roman" w:hAnsi="Times New Roman" w:cs="Times New Roman"/>
@@ -11950,7 +11947,7 @@
           <w:szCs w:val="24"/>
         </w:rPr>
       </w:pPr>
-      <w:bookmarkStart w:id="47" w:name="_Toc224251771"/>
+      <w:bookmarkStart w:id="47" w:name="_Toc224253782"/>
       <w:r>
         <w:rPr>
           <w:rFonts w:ascii="Times New Roman" w:hAnsi="Times New Roman" w:cs="Times New Roman"/>
@@ -11975,7 +11972,75 @@
         <w:rPr>
           <w:rFonts w:ascii="Times New Roman" w:hAnsi="Times New Roman" w:cs="Times New Roman"/>
         </w:rPr>
-        <w:t xml:space="preserve">Se, por um lado, a dispensa de recomposição sobre o passivo consolidado atua como um alívio econômico vital, por outro, a modelagem estabelece uma barreira ética intransponível: o isolamento do desmatamento ilegal recente. O estudo quantificou </w:t>
+        <w:t xml:space="preserve">Se, por um lado, a dispensa de recomposição sobre o passivo consolidado atua como um alívio econômico vital, por outro, a modelagem estabelece uma barreira ética intransponível: o isolamento do desmatamento ilegal recente. O estudo </w:t>
+      </w:r>
+      <w:r>
+        <w:rPr>
+          <w:rFonts w:ascii="Times New Roman" w:hAnsi="Times New Roman" w:cs="Times New Roman"/>
+        </w:rPr>
+        <w:t xml:space="preserve">quantificou 2,2 milhões de hectares de passivo não consolidado </w:t>
+      </w:r>
+      <w:r>
+        <w:rPr>
+          <w:rFonts w:ascii="Times New Roman" w:hAnsi="Times New Roman" w:cs="Times New Roman"/>
+        </w:rPr>
+        <w:t>(</w:t>
+      </w:r>
+      <w:r>
+        <w:rPr>
+          <w:rFonts w:ascii="Times New Roman" w:hAnsi="Times New Roman" w:cs="Times New Roman"/>
+        </w:rPr>
+        <w:t>supressão de vegetação nativa ocorrida após 22 de julho de 2008</w:t>
+      </w:r>
+      <w:r>
+        <w:rPr>
+          <w:rFonts w:ascii="Times New Roman" w:hAnsi="Times New Roman" w:cs="Times New Roman"/>
+        </w:rPr>
+        <w:t>)</w:t>
+      </w:r>
+      <w:r>
+        <w:rPr>
+          <w:rFonts w:ascii="Times New Roman" w:hAnsi="Times New Roman" w:cs="Times New Roman"/>
+        </w:rPr>
+        <w:t>, ressaltando</w:t>
+      </w:r>
+      <w:r>
+        <w:rPr>
+          <w:rFonts w:ascii="Times New Roman" w:hAnsi="Times New Roman" w:cs="Times New Roman"/>
+        </w:rPr>
+        <w:t xml:space="preserve"> que a redução da Reserva Legal não se traduz em um "passe livre" ou anistia para infrações recentes.</w:t>
+      </w:r>
+    </w:p>
+    <w:p>
+      <w:pPr>
+        <w:spacing w:after="0" w:line="360" w:lineRule="auto"/>
+        <w:ind w:firstLine="709"/>
+        <w:jc w:val="both"/>
+        <w:rPr>
+          <w:rFonts w:ascii="Times New Roman" w:hAnsi="Times New Roman" w:cs="Times New Roman"/>
+        </w:rPr>
+      </w:pPr>
+      <w:r>
+        <w:rPr>
+          <w:rFonts w:ascii="Times New Roman" w:hAnsi="Times New Roman" w:cs="Times New Roman"/>
+        </w:rPr>
+        <w:t>Como aponta a doutrina, a flexibilização das regras para o passivo pretérito exige, em contrapartida, um rigoroso e implacável sistema de comando e controle para as supressões futuras, a fim de não criar um incentivo moral à degradação contínua (RAJÃO et al., 2021). A separação exata entre passivo consolidado e não consolidado só é viável graças ao avanço das séries temporais de alta resolução. O uso das tecnologias de sensoriamento remoto, consagradas por iniciativas como o Projeto MapBiomas, permite mapear com alta precisão as cicatrizes de desmatamento, fornecendo laudos incontestáveis de cobertura vegetal histórica (MAPBIOMAS, 2025).</w:t>
+      </w:r>
+    </w:p>
+    <w:p>
+      <w:pPr>
+        <w:spacing w:after="0" w:line="360" w:lineRule="auto"/>
+        <w:ind w:firstLine="709"/>
+        <w:jc w:val="both"/>
+        <w:rPr>
+          <w:rFonts w:ascii="Times New Roman" w:hAnsi="Times New Roman" w:cs="Times New Roman"/>
+        </w:rPr>
+      </w:pPr>
+      <w:r>
+        <w:rPr>
+          <w:rFonts w:ascii="Times New Roman" w:hAnsi="Times New Roman" w:cs="Times New Roman"/>
+        </w:rPr>
+        <w:t xml:space="preserve">A aplicação destas ferramentas geoestatísticas na identificação da linha de corte de 2008 confere extrema segurança jurídica ao Estado. O uso de imagens de satélite e dados espaciais já se consolidou como prova documental autônoma e idônea na constatação de danos ambientais, entendimento este pacificado pelo Superior Tribunal de Justiça e parametrizado pelo Conselho Nacional de Justiça (BRASIL, 2017; BRASIL, 2020; CNJ, 2023). Dessa forma, a aplicação automatizada do Art. 12, § 4º garante que a regularização beneficie exclusivamente os produtores adequados aos critérios da consolidação, permitindo que as forças de fiscalização estaduais foquem seus recursos punitivos cirurgicamente sobre os </w:t>
       </w:r>
       <w:r>
         <w:rPr>
@@ -11989,8 +12054,37 @@
         <w:rPr>
           <w:rFonts w:ascii="Times New Roman" w:hAnsi="Times New Roman" w:cs="Times New Roman"/>
         </w:rPr>
-        <w:t xml:space="preserve"> de passivo não consolidado — supressão de vegetação nativa ocorrida após 22 de julho de 2008 —, ressaltando que a redução da Reserva Legal não se traduz em um "passe livre" ou anistia para infrações recentes.</w:t>
-      </w:r>
+        <w:t xml:space="preserve"> de ilegalidade pós-2008.</w:t>
+      </w:r>
+    </w:p>
+    <w:p>
+      <w:pPr>
+        <w:pStyle w:val="Ttulo1"/>
+        <w:rPr>
+          <w:rFonts w:cs="Times New Roman"/>
+        </w:rPr>
+      </w:pPr>
+      <w:bookmarkStart w:id="48" w:name="_Toc224253783"/>
+      <w:r>
+        <w:rPr>
+          <w:rFonts w:cs="Times New Roman"/>
+        </w:rPr>
+        <w:lastRenderedPageBreak/>
+        <w:t>6</w:t>
+      </w:r>
+      <w:r>
+        <w:rPr>
+          <w:rFonts w:cs="Times New Roman"/>
+        </w:rPr>
+        <w:t xml:space="preserve"> </w:t>
+      </w:r>
+      <w:r>
+        <w:rPr>
+          <w:rFonts w:cs="Times New Roman"/>
+        </w:rPr>
+        <w:t>CONCLUSÃO</w:t>
+      </w:r>
+      <w:bookmarkEnd w:id="48"/>
     </w:p>
     <w:p>
       <w:pPr>
@@ -12005,81 +12099,6 @@
         <w:rPr>
           <w:rFonts w:ascii="Times New Roman" w:hAnsi="Times New Roman" w:cs="Times New Roman"/>
         </w:rPr>
-        <w:t>Como aponta a doutrina, a flexibilização das regras para o passivo pretérito exige, em contrapartida, um rigoroso e implacável sistema de comando e controle para as supressões futuras, a fim de não criar um incentivo moral à degradação contínua (RAJÃO et al., 2021). A separação exata entre passivo consolidado e não consolidado só é viável graças ao avanço das séries temporais de alta resolução. O uso das tecnologias de sensoriamento remoto, consagradas por iniciativas como o Projeto MapBiomas, permite mapear com alta precisão as cicatrizes de desmatamento, fornecendo laudos incontestáveis de cobertura vegetal histórica (MAPBIOMAS, 2025).</w:t>
-      </w:r>
-    </w:p>
-    <w:p>
-      <w:pPr>
-        <w:spacing w:after="0" w:line="360" w:lineRule="auto"/>
-        <w:ind w:firstLine="709"/>
-        <w:jc w:val="both"/>
-        <w:rPr>
-          <w:rFonts w:ascii="Times New Roman" w:hAnsi="Times New Roman" w:cs="Times New Roman"/>
-        </w:rPr>
-      </w:pPr>
-      <w:r>
-        <w:rPr>
-          <w:rFonts w:ascii="Times New Roman" w:hAnsi="Times New Roman" w:cs="Times New Roman"/>
-        </w:rPr>
-        <w:t xml:space="preserve">A aplicação destas ferramentas geoestatísticas na identificação da linha de corte de 2008 confere extrema segurança jurídica ao Estado. O uso de imagens de satélite e dados espaciais já se consolidou como prova documental autônoma e idônea na constatação de danos ambientais, entendimento este pacificado pelo Superior Tribunal de Justiça e parametrizado pelo Conselho Nacional de Justiça (BRASIL, 2017; BRASIL, 2020; CNJ, 2023). Dessa forma, a aplicação automatizada do Art. 12, § 4º garante que a regularização beneficie exclusivamente os produtores adequados aos critérios da consolidação, permitindo que as forças de fiscalização estaduais foquem seus recursos punitivos cirurgicamente sobre os </w:t>
-      </w:r>
-      <w:r>
-        <w:rPr>
-          <w:rFonts w:ascii="Times New Roman" w:hAnsi="Times New Roman" w:cs="Times New Roman"/>
-          <w:b/>
-          <w:bCs/>
-        </w:rPr>
-        <w:t>2,2 milhões de hectares</w:t>
-      </w:r>
-      <w:r>
-        <w:rPr>
-          <w:rFonts w:ascii="Times New Roman" w:hAnsi="Times New Roman" w:cs="Times New Roman"/>
-        </w:rPr>
-        <w:t xml:space="preserve"> de ilegalidade pós-2008.</w:t>
-      </w:r>
-    </w:p>
-    <w:p>
-      <w:pPr>
-        <w:pStyle w:val="Ttulo1"/>
-        <w:rPr>
-          <w:rFonts w:cs="Times New Roman"/>
-        </w:rPr>
-      </w:pPr>
-      <w:bookmarkStart w:id="48" w:name="_Toc224251772"/>
-      <w:r>
-        <w:rPr>
-          <w:rFonts w:cs="Times New Roman"/>
-        </w:rPr>
-        <w:lastRenderedPageBreak/>
-        <w:t>6</w:t>
-      </w:r>
-      <w:r>
-        <w:rPr>
-          <w:rFonts w:cs="Times New Roman"/>
-        </w:rPr>
-        <w:t xml:space="preserve"> </w:t>
-      </w:r>
-      <w:r>
-        <w:rPr>
-          <w:rFonts w:cs="Times New Roman"/>
-        </w:rPr>
-        <w:t>CONCLUSÃO</w:t>
-      </w:r>
-      <w:bookmarkEnd w:id="48"/>
-    </w:p>
-    <w:p>
-      <w:pPr>
-        <w:spacing w:after="0" w:line="360" w:lineRule="auto"/>
-        <w:ind w:firstLine="709"/>
-        <w:jc w:val="both"/>
-        <w:rPr>
-          <w:rFonts w:ascii="Times New Roman" w:hAnsi="Times New Roman" w:cs="Times New Roman"/>
-        </w:rPr>
-      </w:pPr>
-      <w:r>
-        <w:rPr>
-          <w:rFonts w:ascii="Times New Roman" w:hAnsi="Times New Roman" w:cs="Times New Roman"/>
-        </w:rPr>
         <w:t>O presente estudo avaliou a viabilidade técnica e o impacto geoestatístico da aplicação do Artigo 12, § 4º da Lei nº 12.651/2012 para imóveis rurais superiores a 4 módulos fiscais no Estado do Pará. A modelagem desenvolvida permitiu quantificar a dimensão territorial e o perfil de conformidade ambiental sob o cenário de redução da Reserva Legal de 80% para 50%, fundamentando-se no critério de sobreposição municipal com áreas protegidas como o filtro absoluto de segurança jurídica.</w:t>
       </w:r>
     </w:p>
@@ -12093,7 +12112,7 @@
           <w:szCs w:val="24"/>
         </w:rPr>
       </w:pPr>
-      <w:bookmarkStart w:id="49" w:name="_Toc224251773"/>
+      <w:bookmarkStart w:id="49" w:name="_Toc224253784"/>
       <w:r>
         <w:rPr>
           <w:rFonts w:ascii="Times New Roman" w:hAnsi="Times New Roman" w:cs="Times New Roman"/>
@@ -12189,7 +12208,7 @@
           <w:szCs w:val="24"/>
         </w:rPr>
       </w:pPr>
-      <w:bookmarkStart w:id="50" w:name="_Toc224251774"/>
+      <w:bookmarkStart w:id="50" w:name="_Toc224253785"/>
       <w:r>
         <w:rPr>
           <w:rFonts w:ascii="Times New Roman" w:hAnsi="Times New Roman" w:cs="Times New Roman"/>
@@ -12297,7 +12316,7 @@
           <w:szCs w:val="24"/>
         </w:rPr>
       </w:pPr>
-      <w:bookmarkStart w:id="51" w:name="_Toc224251775"/>
+      <w:bookmarkStart w:id="51" w:name="_Toc224253786"/>
       <w:r>
         <w:rPr>
           <w:rFonts w:ascii="Times New Roman" w:hAnsi="Times New Roman" w:cs="Times New Roman"/>
@@ -12419,7 +12438,7 @@
           <w:rFonts w:cs="Times New Roman"/>
         </w:rPr>
       </w:pPr>
-      <w:bookmarkStart w:id="52" w:name="_Toc224251776"/>
+      <w:bookmarkStart w:id="52" w:name="_Toc224253787"/>
       <w:r>
         <w:rPr>
           <w:rFonts w:cs="Times New Roman"/>
@@ -12706,7 +12725,7 @@
         <w:rPr>
           <w:rFonts w:ascii="Times New Roman" w:hAnsi="Times New Roman" w:cs="Times New Roman"/>
         </w:rPr>
-        <w:t xml:space="preserve">INSTITUTO INTERNACIONAL PARA SUSTENTABILIDADE (IIS). </w:t>
+        <w:t xml:space="preserve">MAPBIOMAS. </w:t>
       </w:r>
       <w:r>
         <w:rPr>
@@ -12714,13 +12733,13 @@
           <w:b/>
           <w:bCs/>
         </w:rPr>
-        <w:t>Análise Econômica de uma Pecuária Mais Sustentável</w:t>
-      </w:r>
-      <w:r>
-        <w:rPr>
-          <w:rFonts w:ascii="Times New Roman" w:hAnsi="Times New Roman" w:cs="Times New Roman"/>
-        </w:rPr>
-        <w:t>. Rio de Janeiro: IIS, 2015.</w:t>
+        <w:t>RAD2024: Relatório Anual do Desmatamento no Brasil 2024.</w:t>
+      </w:r>
+      <w:r>
+        <w:rPr>
+          <w:rFonts w:ascii="Times New Roman" w:hAnsi="Times New Roman" w:cs="Times New Roman"/>
+        </w:rPr>
+        <w:t xml:space="preserve"> São Paulo: MapBiomas, 2025. 209 p.</w:t>
       </w:r>
     </w:p>
     <w:p>
@@ -12743,13 +12762,13 @@
           <w:b/>
           <w:bCs/>
         </w:rPr>
-        <w:t>RAD2024: Relatório Anual do Desmatamento no Brasil 2024.</w:t>
-      </w:r>
-      <w:r>
-        <w:rPr>
-          <w:rFonts w:ascii="Times New Roman" w:hAnsi="Times New Roman" w:cs="Times New Roman"/>
-        </w:rPr>
-        <w:t xml:space="preserve"> São Paulo: MapBiomas, 2025. 209 p.</w:t>
+        <w:t>Relatório Anual do Desmatamento 2021</w:t>
+      </w:r>
+      <w:r>
+        <w:rPr>
+          <w:rFonts w:ascii="Times New Roman" w:hAnsi="Times New Roman" w:cs="Times New Roman"/>
+        </w:rPr>
+        <w:t>. MapBiomas Alerta. São Paulo: MapBiomas, 2022.</w:t>
       </w:r>
     </w:p>
     <w:p>
@@ -12764,7 +12783,7 @@
         <w:rPr>
           <w:rFonts w:ascii="Times New Roman" w:hAnsi="Times New Roman" w:cs="Times New Roman"/>
         </w:rPr>
-        <w:t xml:space="preserve">MAPBIOMAS. </w:t>
+        <w:t xml:space="preserve">PARÁ. </w:t>
       </w:r>
       <w:r>
         <w:rPr>
@@ -12772,13 +12791,13 @@
           <w:b/>
           <w:bCs/>
         </w:rPr>
-        <w:t>Relatório Anual do Desmatamento 2021</w:t>
-      </w:r>
-      <w:r>
-        <w:rPr>
-          <w:rFonts w:ascii="Times New Roman" w:hAnsi="Times New Roman" w:cs="Times New Roman"/>
-        </w:rPr>
-        <w:t>. MapBiomas Alerta. São Paulo: MapBiomas, 2022.</w:t>
+        <w:t>Lei Ordinária nº 7.243, de 9 de janeiro de 2009</w:t>
+      </w:r>
+      <w:r>
+        <w:rPr>
+          <w:rFonts w:ascii="Times New Roman" w:hAnsi="Times New Roman" w:cs="Times New Roman"/>
+        </w:rPr>
+        <w:t>. Dispõe sobre o Zoneamento Ecológico-Econômico da Área de Influência das Rodovias BR-163 (Cuiabá-Santarém) e BR-230 (Transamazônica) no Estado do Pará - Zona Oeste. Diário Oficial do Estado, Belém, PA, 9 jan. 2009.</w:t>
       </w:r>
     </w:p>
     <w:p>
@@ -12801,13 +12820,13 @@
           <w:b/>
           <w:bCs/>
         </w:rPr>
-        <w:t>Lei Ordinária nº 7.243, de 9 de janeiro de 2009</w:t>
-      </w:r>
-      <w:r>
-        <w:rPr>
-          <w:rFonts w:ascii="Times New Roman" w:hAnsi="Times New Roman" w:cs="Times New Roman"/>
-        </w:rPr>
-        <w:t>. Dispõe sobre o Zoneamento Ecológico-Econômico da Área de Influência das Rodovias BR-163 (Cuiabá-Santarém) e BR-230 (Transamazônica) no Estado do Pará - Zona Oeste. Diário Oficial do Estado, Belém, PA, 9 jan. 2009.</w:t>
+        <w:t>Lei Ordinária nº 7.398, de 16 de abril de 2010</w:t>
+      </w:r>
+      <w:r>
+        <w:rPr>
+          <w:rFonts w:ascii="Times New Roman" w:hAnsi="Times New Roman" w:cs="Times New Roman"/>
+        </w:rPr>
+        <w:t>. Dispõe sobre o Zoneamento Ecológico-Econômico da Zona Leste e Calha Norte do Estado do Pará. Diário Oficial do Estado, Belém, PA, 22 abr. 2010.</w:t>
       </w:r>
     </w:p>
     <w:p>
@@ -12822,7 +12841,7 @@
         <w:rPr>
           <w:rFonts w:ascii="Times New Roman" w:hAnsi="Times New Roman" w:cs="Times New Roman"/>
         </w:rPr>
-        <w:t xml:space="preserve">PARÁ. </w:t>
+        <w:t xml:space="preserve">PARÁ. Secretaria de Estado de Meio Ambiente e Sustentabilidade. </w:t>
       </w:r>
       <w:r>
         <w:rPr>
@@ -12830,13 +12849,13 @@
           <w:b/>
           <w:bCs/>
         </w:rPr>
-        <w:t>Lei Ordinária nº 7.398, de 16 de abril de 2010</w:t>
-      </w:r>
-      <w:r>
-        <w:rPr>
-          <w:rFonts w:ascii="Times New Roman" w:hAnsi="Times New Roman" w:cs="Times New Roman"/>
-        </w:rPr>
-        <w:t>. Dispõe sobre o Zoneamento Ecológico-Econômico da Zona Leste e Calha Norte do Estado do Pará. Diário Oficial do Estado, Belém, PA, 22 abr. 2010.</w:t>
+        <w:t>Instrução Normativa nº 08, de 28 de outubro de 2015</w:t>
+      </w:r>
+      <w:r>
+        <w:rPr>
+          <w:rFonts w:ascii="Times New Roman" w:hAnsi="Times New Roman" w:cs="Times New Roman"/>
+        </w:rPr>
+        <w:t>. Define procedimentos administrativos para a realização de limpeza e autorização de supressão, a serem realizadas nas áreas de vegetação secundária em estágio inicial de regeneração, localizadas fora da Reserva Legal e da Área de Preservação Permanente - APP dos imóveis rurais, no âmbito do Estado do Pará, e dá outras providências. Diário Oficial do Estado, Belém, PA, 03 nov. 2015.</w:t>
       </w:r>
     </w:p>
     <w:p>
@@ -12859,13 +12878,13 @@
           <w:b/>
           <w:bCs/>
         </w:rPr>
-        <w:t>Instrução Normativa nº 08, de 28 de outubro de 2015</w:t>
-      </w:r>
-      <w:r>
-        <w:rPr>
-          <w:rFonts w:ascii="Times New Roman" w:hAnsi="Times New Roman" w:cs="Times New Roman"/>
-        </w:rPr>
-        <w:t>. Define procedimentos administrativos para a realização de limpeza e autorização de supressão, a serem realizadas nas áreas de vegetação secundária em estágio inicial de regeneração, localizadas fora da Reserva Legal e da Área de Preservação Permanente - APP dos imóveis rurais, no âmbito do Estado do Pará, e dá outras providências. Diário Oficial do Estado, Belém, PA, 03 nov. 2015.</w:t>
+        <w:t>Relatório de Ações do Programa Regulariza Pará 2021</w:t>
+      </w:r>
+      <w:r>
+        <w:rPr>
+          <w:rFonts w:ascii="Times New Roman" w:hAnsi="Times New Roman" w:cs="Times New Roman"/>
+        </w:rPr>
+        <w:t>: Decreto nº 941, de 3 de agosto de 2020. Belém: SEMAS, 2021.</w:t>
       </w:r>
     </w:p>
     <w:p>
@@ -12888,13 +12907,13 @@
           <w:b/>
           <w:bCs/>
         </w:rPr>
-        <w:t>Relatório de Ações do Programa Regulariza Pará 2021</w:t>
-      </w:r>
-      <w:r>
-        <w:rPr>
-          <w:rFonts w:ascii="Times New Roman" w:hAnsi="Times New Roman" w:cs="Times New Roman"/>
-        </w:rPr>
-        <w:t>: Decreto nº 941, de 3 de agosto de 2020. Belém: SEMAS, 2021.</w:t>
+        <w:t>Relatório de Gestão SEMAS 2025</w:t>
+      </w:r>
+      <w:r>
+        <w:rPr>
+          <w:rFonts w:ascii="Times New Roman" w:hAnsi="Times New Roman" w:cs="Times New Roman"/>
+        </w:rPr>
+        <w:t>. Belém: Governo do Pará, 2025.</w:t>
       </w:r>
     </w:p>
     <w:p>
@@ -12910,35 +12929,6 @@
           <w:rFonts w:ascii="Times New Roman" w:hAnsi="Times New Roman" w:cs="Times New Roman"/>
         </w:rPr>
         <w:lastRenderedPageBreak/>
-        <w:t xml:space="preserve">PARÁ. Secretaria de Estado de Meio Ambiente e Sustentabilidade. </w:t>
-      </w:r>
-      <w:r>
-        <w:rPr>
-          <w:rFonts w:ascii="Times New Roman" w:hAnsi="Times New Roman" w:cs="Times New Roman"/>
-          <w:b/>
-          <w:bCs/>
-        </w:rPr>
-        <w:t>Relatório de Gestão SEMAS 2025</w:t>
-      </w:r>
-      <w:r>
-        <w:rPr>
-          <w:rFonts w:ascii="Times New Roman" w:hAnsi="Times New Roman" w:cs="Times New Roman"/>
-        </w:rPr>
-        <w:t>. Belém: Governo do Pará, 2025.</w:t>
-      </w:r>
-    </w:p>
-    <w:p>
-      <w:pPr>
-        <w:spacing w:line="360" w:lineRule="auto"/>
-        <w:jc w:val="both"/>
-        <w:rPr>
-          <w:rFonts w:ascii="Times New Roman" w:hAnsi="Times New Roman" w:cs="Times New Roman"/>
-        </w:rPr>
-      </w:pPr>
-      <w:r>
-        <w:rPr>
-          <w:rFonts w:ascii="Times New Roman" w:hAnsi="Times New Roman" w:cs="Times New Roman"/>
-        </w:rPr>
         <w:t xml:space="preserve">PORTO, A. J. M.; SANTOS, L. M. dos. Cotas de reserva ambiental: uma interpretação da análise econômica do direito. </w:t>
       </w:r>
       <w:r>
@@ -13129,35 +13119,6 @@
           <w:rFonts w:ascii="Times New Roman" w:hAnsi="Times New Roman" w:cs="Times New Roman"/>
         </w:rPr>
         <w:t xml:space="preserve"> Revista de Economia e Sociologia Rural, Brasília, DF, v. 63, e296905, 2025.</w:t>
-      </w:r>
-    </w:p>
-    <w:p>
-      <w:pPr>
-        <w:spacing w:line="360" w:lineRule="auto"/>
-        <w:jc w:val="both"/>
-        <w:rPr>
-          <w:rFonts w:ascii="Times New Roman" w:hAnsi="Times New Roman" w:cs="Times New Roman"/>
-        </w:rPr>
-      </w:pPr>
-      <w:r>
-        <w:rPr>
-          <w:rFonts w:ascii="Times New Roman" w:hAnsi="Times New Roman" w:cs="Times New Roman"/>
-        </w:rPr>
-        <w:t xml:space="preserve">SPAROVEK, G.; BARRETTO, A.; KLUG, I.; PAPP, L.; LINO, J. A revisão do Código Florestal brasileiro. </w:t>
-      </w:r>
-      <w:r>
-        <w:rPr>
-          <w:rFonts w:ascii="Times New Roman" w:hAnsi="Times New Roman" w:cs="Times New Roman"/>
-          <w:b/>
-          <w:bCs/>
-        </w:rPr>
-        <w:t>Novos Estudos - CEBRAP</w:t>
-      </w:r>
-      <w:r>
-        <w:rPr>
-          <w:rFonts w:ascii="Times New Roman" w:hAnsi="Times New Roman" w:cs="Times New Roman"/>
-        </w:rPr>
-        <w:t>, São Paulo, n. 89, p. 111-135, mar. 2011.</w:t>
       </w:r>
     </w:p>
     <w:p>
@@ -15801,6 +15762,7 @@
   <w:style w:type="character" w:default="1" w:styleId="Fontepargpadro">
     <w:name w:val="Default Paragraph Font"/>
     <w:uiPriority w:val="1"/>
+    <w:semiHidden/>
     <w:unhideWhenUsed/>
   </w:style>
   <w:style w:type="table" w:default="1" w:styleId="Tabelanormal">

</xml_diff>